<commit_message>
[worker-rain] add api change session Id
</commit_message>
<xml_diff>
--- a/ai_tnhn/ai-api-tnhn/doc/Bao cao mua ngay {dd}-{mm}-{yyyy} thoi diem {hh}.docx
+++ b/ai_tnhn/ai-api-tnhn/doc/Bao cao mua ngay {dd}-{mm}-{yyyy} thoi diem {hh}.docx
@@ -2155,6 +2155,7 @@
               <w:spacing w:after="0" w:line="264" w:lineRule="auto"/>
               <w:rPr>
                 <w:rFonts w:ascii="Times New Roman" w:hAnsi="Times New Roman" w:cs="Times New Roman"/>
+                <w:lang w:val="vi-VN"/>
               </w:rPr>
             </w:pPr>
             <w:r>
@@ -2245,20 +2246,6 @@
                 <w:rFonts w:ascii="Times New Roman" w:hAnsi="Times New Roman" w:cs="Times New Roman"/>
               </w:rPr>
               <w:t>- VP Thành uỷ, UBND TP;</w:t>
-            </w:r>
-          </w:p>
-          <w:p>
-            <w:pPr>
-              <w:spacing w:after="0" w:line="264" w:lineRule="auto"/>
-              <w:rPr>
-                <w:rFonts w:ascii="Times New Roman" w:hAnsi="Times New Roman" w:cs="Times New Roman"/>
-              </w:rPr>
-            </w:pPr>
-            <w:r>
-              <w:rPr>
-                <w:rFonts w:ascii="Times New Roman" w:hAnsi="Times New Roman" w:cs="Times New Roman"/>
-              </w:rPr>
-              <w:t>- Đ/c Nguyễn Mạnh Quyền PCT UBND TP</w:t>
             </w:r>
           </w:p>
           <w:p>

</xml_diff>

<commit_message>
[AI] vẽ table dưới client
</commit_message>
<xml_diff>
--- a/ai_tnhn/ai-api-tnhn/doc/Bao cao mua ngay {dd}-{mm}-{yyyy} thoi diem {hh}.docx
+++ b/ai_tnhn/ai-api-tnhn/doc/Bao cao mua ngay {dd}-{mm}-{yyyy} thoi diem {hh}.docx
@@ -190,7 +190,32 @@
                 <w:b w:val="0"/>
                 <w:szCs w:val="26"/>
               </w:rPr>
-              <w:t>:               /TNHN-QLVH</w:t>
+              <w:t>:               /</w:t>
+            </w:r>
+            <w:r>
+              <w:rPr>
+                <w:rFonts w:ascii="Times New Roman" w:hAnsi="Times New Roman"/>
+                <w:b w:val="0"/>
+                <w:szCs w:val="26"/>
+              </w:rPr>
+              <w:t>BC</w:t>
+            </w:r>
+            <w:r>
+              <w:rPr>
+                <w:rFonts w:ascii="Times New Roman" w:hAnsi="Times New Roman"/>
+                <w:b w:val="0"/>
+                <w:szCs w:val="26"/>
+                <w:lang w:val="vi-VN"/>
+              </w:rPr>
+              <w:t>-</w:t>
+            </w:r>
+            <w:r>
+              <w:rPr>
+                <w:rFonts w:ascii="Times New Roman" w:hAnsi="Times New Roman"/>
+                <w:b w:val="0"/>
+                <w:szCs w:val="26"/>
+              </w:rPr>
+              <w:t>TNHN</w:t>
             </w:r>
           </w:p>
           <w:p>
@@ -1215,14 +1240,26 @@
           <w:sz w:val="26"/>
           <w:szCs w:val="26"/>
         </w:rPr>
-        <w:t xml:space="preserve"> PTDS</w:t>
-      </w:r>
-      <w:r>
-        <w:rPr>
-          <w:rFonts w:ascii="Times New Roman" w:hAnsi="Times New Roman" w:cs="Times New Roman"/>
+        <w:t xml:space="preserve"> </w:t>
+      </w:r>
+      <w:proofErr w:type="spellStart"/>
+      <w:r>
+        <w:rPr>
+          <w:rFonts w:ascii="Times New Roman" w:hAnsi="Times New Roman" w:cs="Times New Roman"/>
+          <w:sz w:val="26"/>
+          <w:szCs w:val="26"/>
+        </w:rPr>
+        <w:t>Phòng</w:t>
+      </w:r>
+      <w:proofErr w:type="spellEnd"/>
+      <w:r>
+        <w:rPr>
+          <w:rFonts w:ascii="Times New Roman" w:hAnsi="Times New Roman" w:cs="Times New Roman"/>
+          <w:sz w:val="26"/>
+          <w:szCs w:val="26"/>
           <w:lang w:val="vi-VN"/>
         </w:rPr>
-        <w:t xml:space="preserve"> </w:t>
+        <w:t xml:space="preserve"> Thủ Dân Sự </w:t>
       </w:r>
       <w:r>
         <w:rPr>
@@ -8588,35 +8625,7 @@
                                     <w:rPr>
                                       <w:rFonts w:ascii="Times New Roman" w:hAnsi="Times New Roman" w:cs="Times New Roman"/>
                                     </w:rPr>
-                                    <w:t>(</w:t>
-                                  </w:r>
-                                  <w:proofErr w:type="spellStart"/>
-                                  <w:r>
-                                    <w:rPr>
-                                      <w:rFonts w:ascii="Times New Roman" w:hAnsi="Times New Roman" w:cs="Times New Roman"/>
-                                    </w:rPr>
-                                    <w:t>Để</w:t>
-                                  </w:r>
-                                  <w:proofErr w:type="spellEnd"/>
-                                  <w:r>
-                                    <w:rPr>
-                                      <w:rFonts w:ascii="Times New Roman" w:hAnsi="Times New Roman" w:cs="Times New Roman"/>
-                                    </w:rPr>
-                                    <w:t xml:space="preserve"> b/</w:t>
-                                  </w:r>
-                                  <w:proofErr w:type="spellStart"/>
-                                  <w:r>
-                                    <w:rPr>
-                                      <w:rFonts w:ascii="Times New Roman" w:hAnsi="Times New Roman" w:cs="Times New Roman"/>
-                                    </w:rPr>
-                                    <w:t>cáo</w:t>
-                                  </w:r>
-                                  <w:proofErr w:type="spellEnd"/>
-                                  <w:r>
-                                    <w:rPr>
-                                      <w:rFonts w:ascii="Times New Roman" w:hAnsi="Times New Roman" w:cs="Times New Roman"/>
-                                    </w:rPr>
-                                    <w:t>)</w:t>
+                                    <w:t>(Để b/cáo)</w:t>
                                   </w:r>
                                 </w:p>
                               </w:txbxContent>
@@ -8680,13 +8689,7 @@
               <w:rPr>
                 <w:rFonts w:ascii="Times New Roman" w:hAnsi="Times New Roman" w:cs="Times New Roman"/>
               </w:rPr>
-              <w:t xml:space="preserve">- Đ/c </w:t>
-            </w:r>
-            <w:r>
-              <w:rPr>
-                <w:rFonts w:ascii="Times New Roman" w:hAnsi="Times New Roman" w:cs="Times New Roman"/>
-              </w:rPr>
-              <w:t>Trương</w:t>
+              <w:t>- Đ/c Trương</w:t>
             </w:r>
             <w:r>
               <w:rPr>

</xml_diff>

<commit_message>
[question] sua vi tri
</commit_message>
<xml_diff>
--- a/ai_tnhn/ai-api-tnhn/doc/Bao cao mua ngay {dd}-{mm}-{yyyy} thoi diem {hh}.docx
+++ b/ai_tnhn/ai-api-tnhn/doc/Bao cao mua ngay {dd}-{mm}-{yyyy} thoi diem {hh}.docx
@@ -658,7 +658,25 @@
           <w:szCs w:val="26"/>
           <w:lang w:val="vi-VN"/>
         </w:rPr>
-        <w:t xml:space="preserve"> Thủ Dân Sự </w:t>
+        <w:t xml:space="preserve"> </w:t>
+      </w:r>
+      <w:r>
+        <w:rPr>
+          <w:rFonts w:ascii="Times New Roman" w:hAnsi="Times New Roman" w:cs="Times New Roman"/>
+          <w:sz w:val="26"/>
+          <w:szCs w:val="26"/>
+          <w:lang w:val="vi-VN"/>
+        </w:rPr>
+        <w:t>thủ dân sự</w:t>
+      </w:r>
+      <w:r>
+        <w:rPr>
+          <w:rFonts w:ascii="Times New Roman" w:hAnsi="Times New Roman" w:cs="Times New Roman"/>
+          <w:sz w:val="26"/>
+          <w:szCs w:val="26"/>
+          <w:lang w:val="vi-VN"/>
+        </w:rPr>
+        <w:t xml:space="preserve"> </w:t>
       </w:r>
       <w:r>
         <w:rPr>

</xml_diff>

<commit_message>
[refactor_fix] fix nhap thang nhan grid
</commit_message>
<xml_diff>
--- a/ai_tnhn/ai-api-tnhn/doc/Bao cao mua ngay {dd}-{mm}-{yyyy} thoi diem {hh}.docx
+++ b/ai_tnhn/ai-api-tnhn/doc/Bao cao mua ngay {dd}-{mm}-{yyyy} thoi diem {hh}.docx
@@ -1,6 +1,6 @@
 
 <file path=word/document.xml><?xml version="1.0" encoding="utf-8"?>
-<w:document xmlns:wpc="http://schemas.microsoft.com/office/word/2010/wordprocessingCanvas" xmlns:cx="http://schemas.microsoft.com/office/drawing/2014/chartex" xmlns:cx1="http://schemas.microsoft.com/office/drawing/2015/9/8/chartex" xmlns:cx2="http://schemas.microsoft.com/office/drawing/2015/10/21/chartex" xmlns:cx3="http://schemas.microsoft.com/office/drawing/2016/5/9/chartex" xmlns:cx4="http://schemas.microsoft.com/office/drawing/2016/5/10/chartex" xmlns:cx5="http://schemas.microsoft.com/office/drawing/2016/5/11/chartex" xmlns:cx6="http://schemas.microsoft.com/office/drawing/2016/5/12/chartex" xmlns:cx7="http://schemas.microsoft.com/office/drawing/2016/5/13/chartex" xmlns:cx8="http://schemas.microsoft.com/office/drawing/2016/5/14/chartex" xmlns:mc="http://schemas.openxmlformats.org/markup-compatibility/2006" xmlns:aink="http://schemas.microsoft.com/office/drawing/2016/ink" xmlns:am3d="http://schemas.microsoft.com/office/drawing/2017/model3d" xmlns:o="urn:schemas-microsoft-com:office:office" xmlns:oel="http://schemas.microsoft.com/office/2019/extlst" xmlns:r="http://schemas.openxmlformats.org/officeDocument/2006/relationships" xmlns:m="http://schemas.openxmlformats.org/officeDocument/2006/math" xmlns:v="urn:schemas-microsoft-com:vml" xmlns:wp14="http://schemas.microsoft.com/office/word/2010/wordprocessingDrawing" xmlns:wp="http://schemas.openxmlformats.org/drawingml/2006/wordprocessingDrawing" xmlns:w10="urn:schemas-microsoft-com:office:word" xmlns:w="http://schemas.openxmlformats.org/wordprocessingml/2006/main" xmlns:w14="http://schemas.microsoft.com/office/word/2010/wordml" xmlns:w15="http://schemas.microsoft.com/office/word/2012/wordml" xmlns:w16cex="http://schemas.microsoft.com/office/word/2018/wordml/cex" xmlns:w16cid="http://schemas.microsoft.com/office/word/2016/wordml/cid" xmlns:w16="http://schemas.microsoft.com/office/word/2018/wordml" xmlns:w16du="http://schemas.microsoft.com/office/word/2023/wordml/word16du" xmlns:w16sdtdh="http://schemas.microsoft.com/office/word/2020/wordml/sdtdatahash" xmlns:w16sdtfl="http://schemas.microsoft.com/office/word/2024/wordml/sdtformatlock" xmlns:w16se="http://schemas.microsoft.com/office/word/2015/wordml/symex" xmlns:wpg="http://schemas.microsoft.com/office/word/2010/wordprocessingGroup" xmlns:wpi="http://schemas.microsoft.com/office/word/2010/wordprocessingInk" xmlns:wne="http://schemas.microsoft.com/office/word/2006/wordml" xmlns:wps="http://schemas.microsoft.com/office/word/2010/wordprocessingShape" mc:Ignorable="w14 w15 w16se w16cid w16 w16cex w16sdtdh w16sdtfl w16du wp14">
+<w:document xmlns:wpc="http://schemas.microsoft.com/office/word/2010/wordprocessingCanvas" xmlns:cx="http://schemas.microsoft.com/office/drawing/2014/chartex" xmlns:cx1="http://schemas.microsoft.com/office/drawing/2015/9/8/chartex" xmlns:cx2="http://schemas.microsoft.com/office/drawing/2015/10/21/chartex" xmlns:cx3="http://schemas.microsoft.com/office/drawing/2016/5/9/chartex" xmlns:cx4="http://schemas.microsoft.com/office/drawing/2016/5/10/chartex" xmlns:cx5="http://schemas.microsoft.com/office/drawing/2016/5/11/chartex" xmlns:cx6="http://schemas.microsoft.com/office/drawing/2016/5/12/chartex" xmlns:cx7="http://schemas.microsoft.com/office/drawing/2016/5/13/chartex" xmlns:cx8="http://schemas.microsoft.com/office/drawing/2016/5/14/chartex" xmlns:mc="http://schemas.openxmlformats.org/markup-compatibility/2006" xmlns:m="http://schemas.openxmlformats.org/officeDocument/2006/math" xmlns:aink="http://schemas.microsoft.com/office/drawing/2016/ink" xmlns:am3d="http://schemas.microsoft.com/office/drawing/2017/model3d" xmlns:oel="http://schemas.microsoft.com/office/2019/extlst" xmlns:r="http://schemas.openxmlformats.org/officeDocument/2006/relationships" xmlns:wp14="http://schemas.microsoft.com/office/word/2010/wordprocessingDrawing" xmlns:wp="http://schemas.openxmlformats.org/drawingml/2006/wordprocessingDrawing" xmlns:wpg="http://schemas.microsoft.com/office/word/2010/wordprocessingGroup" xmlns:wpi="http://schemas.microsoft.com/office/word/2010/wordprocessingInk" xmlns:wps="http://schemas.microsoft.com/office/word/2010/wordprocessingShape" xmlns:o="urn:schemas-microsoft-com:office:office" xmlns:v="urn:schemas-microsoft-com:vml" xmlns:w10="urn:schemas-microsoft-com:office:word" xmlns:w="http://schemas.openxmlformats.org/wordprocessingml/2006/main" xmlns:w14="http://schemas.microsoft.com/office/word/2010/wordml" xmlns:w15="http://schemas.microsoft.com/office/word/2012/wordml" xmlns:w16cex="http://schemas.microsoft.com/office/word/2018/wordml/cex" xmlns:w16cid="http://schemas.microsoft.com/office/word/2016/wordml/cid" xmlns:w16="http://schemas.microsoft.com/office/word/2018/wordml" xmlns:w16sdtdh="http://schemas.microsoft.com/office/word/2020/wordml/sdtdatahash" xmlns:w16sdtfl="http://schemas.microsoft.com/office/word/2024/wordml/sdtformatlock" xmlns:w16se="http://schemas.microsoft.com/office/word/2015/wordml/symex" xmlns:w16du="http://schemas.microsoft.com/office/word/2023/wordml/word16du" xmlns:wne="http://schemas.microsoft.com/office/word/2006/wordml" mc:Ignorable="w14 w15 w16se w16cid w16 w16cex w16sdtdh w16sdtfl w16du wp14">
   <w:body>
     <w:tbl>
       <w:tblPr>
@@ -263,12 +263,21 @@
                 <w:szCs w:val="24"/>
               </w:rPr>
             </w:pPr>
+            <w:proofErr w:type="spellStart"/>
             <w:r>
               <w:rPr>
                 <w:rFonts w:ascii="Times New Roman" w:hAnsi="Times New Roman"/>
                 <w:szCs w:val="24"/>
               </w:rPr>
-              <w:t xml:space="preserve">Độc </w:t>
+              <w:t>Độc</w:t>
+            </w:r>
+            <w:proofErr w:type="spellEnd"/>
+            <w:r>
+              <w:rPr>
+                <w:rFonts w:ascii="Times New Roman" w:hAnsi="Times New Roman"/>
+                <w:szCs w:val="24"/>
+              </w:rPr>
+              <w:t xml:space="preserve"> </w:t>
             </w:r>
             <w:proofErr w:type="spellStart"/>
             <w:r>
@@ -8948,7 +8957,907 @@
         </w:tc>
       </w:tr>
     </w:tbl>
-    <w:p/>
+    <w:p>
+      <w:pPr>
+        <w:rPr>
+          <w:lang w:val="vi-VN"/>
+        </w:rPr>
+      </w:pPr>
+    </w:p>
+    <w:p>
+      <w:pPr>
+        <w:rPr>
+          <w:lang w:val="vi-VN"/>
+        </w:rPr>
+      </w:pPr>
+    </w:p>
+    <w:p>
+      <w:pPr>
+        <w:pStyle w:val="ListParagraph"/>
+        <w:spacing w:before="60" w:after="60" w:line="320" w:lineRule="exact"/>
+        <w:ind w:left="360"/>
+        <w:jc w:val="both"/>
+        <w:rPr>
+          <w:rFonts w:ascii="Times New Roman" w:eastAsia="Times New Roman" w:hAnsi="Times New Roman" w:cs="Times New Roman"/>
+          <w:sz w:val="26"/>
+          <w:szCs w:val="26"/>
+          <w:lang w:val="vi-VN"/>
+        </w:rPr>
+      </w:pPr>
+      <w:r>
+        <w:rPr>
+          <w:rFonts w:ascii="Times New Roman" w:eastAsia="Times New Roman" w:hAnsi="Times New Roman" w:cs="Times New Roman"/>
+          <w:sz w:val="26"/>
+          <w:szCs w:val="26"/>
+          <w:lang w:val="vi-VN"/>
+        </w:rPr>
+        <w:t xml:space="preserve"> </w:t>
+      </w:r>
+      <w:proofErr w:type="spellStart"/>
+      <w:r>
+        <w:rPr>
+          <w:rFonts w:ascii="Times New Roman" w:eastAsia="Times New Roman" w:hAnsi="Times New Roman" w:cs="Times New Roman"/>
+          <w:sz w:val="26"/>
+          <w:szCs w:val="26"/>
+        </w:rPr>
+        <w:t>Số</w:t>
+      </w:r>
+      <w:proofErr w:type="spellEnd"/>
+      <w:r>
+        <w:rPr>
+          <w:rFonts w:ascii="Times New Roman" w:eastAsia="Times New Roman" w:hAnsi="Times New Roman" w:cs="Times New Roman"/>
+          <w:sz w:val="26"/>
+          <w:szCs w:val="26"/>
+        </w:rPr>
+        <w:t xml:space="preserve"> </w:t>
+      </w:r>
+      <w:proofErr w:type="spellStart"/>
+      <w:r>
+        <w:rPr>
+          <w:rFonts w:ascii="Times New Roman" w:eastAsia="Times New Roman" w:hAnsi="Times New Roman" w:cs="Times New Roman"/>
+          <w:sz w:val="26"/>
+          <w:szCs w:val="26"/>
+        </w:rPr>
+        <w:t>liệu</w:t>
+      </w:r>
+      <w:proofErr w:type="spellEnd"/>
+      <w:r>
+        <w:rPr>
+          <w:rFonts w:ascii="Times New Roman" w:eastAsia="Times New Roman" w:hAnsi="Times New Roman" w:cs="Times New Roman"/>
+          <w:sz w:val="26"/>
+          <w:szCs w:val="26"/>
+        </w:rPr>
+        <w:t xml:space="preserve"> </w:t>
+      </w:r>
+      <w:proofErr w:type="spellStart"/>
+      <w:r>
+        <w:rPr>
+          <w:rFonts w:ascii="Times New Roman" w:eastAsia="Times New Roman" w:hAnsi="Times New Roman" w:cs="Times New Roman"/>
+          <w:sz w:val="26"/>
+          <w:szCs w:val="26"/>
+        </w:rPr>
+        <w:t>mưa</w:t>
+      </w:r>
+      <w:proofErr w:type="spellEnd"/>
+      <w:r>
+        <w:rPr>
+          <w:rFonts w:ascii="Times New Roman" w:eastAsia="Times New Roman" w:hAnsi="Times New Roman" w:cs="Times New Roman"/>
+          <w:sz w:val="26"/>
+          <w:szCs w:val="26"/>
+        </w:rPr>
+        <w:t xml:space="preserve"> </w:t>
+      </w:r>
+      <w:proofErr w:type="spellStart"/>
+      <w:r>
+        <w:rPr>
+          <w:rFonts w:ascii="Times New Roman" w:eastAsia="Times New Roman" w:hAnsi="Times New Roman" w:cs="Times New Roman"/>
+          <w:sz w:val="26"/>
+          <w:szCs w:val="26"/>
+        </w:rPr>
+        <w:t>các</w:t>
+      </w:r>
+      <w:proofErr w:type="spellEnd"/>
+      <w:r>
+        <w:rPr>
+          <w:rFonts w:ascii="Times New Roman" w:eastAsia="Times New Roman" w:hAnsi="Times New Roman" w:cs="Times New Roman"/>
+          <w:sz w:val="26"/>
+          <w:szCs w:val="26"/>
+        </w:rPr>
+        <w:t xml:space="preserve"> </w:t>
+      </w:r>
+      <w:proofErr w:type="spellStart"/>
+      <w:r>
+        <w:rPr>
+          <w:rFonts w:ascii="Times New Roman" w:eastAsia="Times New Roman" w:hAnsi="Times New Roman" w:cs="Times New Roman"/>
+          <w:sz w:val="26"/>
+          <w:szCs w:val="26"/>
+        </w:rPr>
+        <w:t>phường</w:t>
+      </w:r>
+      <w:proofErr w:type="spellEnd"/>
+    </w:p>
+    <w:tbl>
+      <w:tblPr>
+        <w:tblStyle w:val="TableGrid"/>
+        <w:tblW w:w="0" w:type="auto"/>
+        <w:tblInd w:w="360" w:type="dxa"/>
+        <w:tblBorders>
+          <w:top w:val="none" w:sz="0" w:space="0" w:color="auto"/>
+          <w:left w:val="none" w:sz="0" w:space="0" w:color="auto"/>
+          <w:bottom w:val="none" w:sz="0" w:space="0" w:color="auto"/>
+          <w:right w:val="none" w:sz="0" w:space="0" w:color="auto"/>
+          <w:insideH w:val="none" w:sz="0" w:space="0" w:color="auto"/>
+          <w:insideV w:val="none" w:sz="0" w:space="0" w:color="auto"/>
+        </w:tblBorders>
+        <w:tblLook w:val="04A0" w:firstRow="1" w:lastRow="0" w:firstColumn="1" w:lastColumn="0" w:noHBand="0" w:noVBand="1"/>
+      </w:tblPr>
+      <w:tblGrid>
+        <w:gridCol w:w="4315"/>
+        <w:gridCol w:w="270"/>
+        <w:gridCol w:w="4259"/>
+      </w:tblGrid>
+      <w:tr>
+        <w:tc>
+          <w:tcPr>
+            <w:tcW w:w="4315" w:type="dxa"/>
+          </w:tcPr>
+          <w:p>
+            <w:pPr>
+              <w:pStyle w:val="ListParagraph"/>
+              <w:spacing w:before="60" w:after="60" w:line="320" w:lineRule="exact"/>
+              <w:ind w:left="0"/>
+              <w:jc w:val="both"/>
+              <w:rPr>
+                <w:rFonts w:ascii="Times New Roman" w:eastAsia="Times New Roman" w:hAnsi="Times New Roman" w:cs="Times New Roman"/>
+                <w:color w:val="000000" w:themeColor="text1"/>
+                <w:sz w:val="26"/>
+                <w:szCs w:val="26"/>
+                <w:lang w:val="vi-VN"/>
+              </w:rPr>
+            </w:pPr>
+            <w:r>
+              <w:rPr>
+                <w:rFonts w:ascii="Times New Roman" w:eastAsia="Times New Roman" w:hAnsi="Times New Roman" w:cs="Times New Roman"/>
+                <w:color w:val="000000" w:themeColor="text1"/>
+                <w:sz w:val="26"/>
+                <w:szCs w:val="26"/>
+                <w:lang w:val="vi-VN"/>
+              </w:rPr>
+              <w:t>{</w:t>
+            </w:r>
+            <w:r>
+              <w:rPr>
+                <w:rFonts w:ascii="Times New Roman" w:eastAsia="Times New Roman" w:hAnsi="Times New Roman" w:cs="Times New Roman"/>
+                <w:color w:val="000000" w:themeColor="text1"/>
+                <w:sz w:val="26"/>
+                <w:szCs w:val="26"/>
+                <w:lang w:val="vi-VN"/>
+              </w:rPr>
+              <w:t>phu_luc_table1_mua_phuong</w:t>
+            </w:r>
+            <w:r>
+              <w:rPr>
+                <w:rFonts w:ascii="Times New Roman" w:eastAsia="Times New Roman" w:hAnsi="Times New Roman" w:cs="Times New Roman"/>
+                <w:color w:val="000000" w:themeColor="text1"/>
+                <w:sz w:val="26"/>
+                <w:szCs w:val="26"/>
+                <w:lang w:val="vi-VN"/>
+              </w:rPr>
+              <w:t>}</w:t>
+            </w:r>
+          </w:p>
+        </w:tc>
+        <w:tc>
+          <w:tcPr>
+            <w:tcW w:w="270" w:type="dxa"/>
+          </w:tcPr>
+          <w:p>
+            <w:pPr>
+              <w:pStyle w:val="ListParagraph"/>
+              <w:spacing w:before="60" w:after="60" w:line="320" w:lineRule="exact"/>
+              <w:ind w:left="0"/>
+              <w:jc w:val="both"/>
+              <w:rPr>
+                <w:rFonts w:ascii="Times New Roman" w:eastAsia="Times New Roman" w:hAnsi="Times New Roman" w:cs="Times New Roman"/>
+                <w:color w:val="000000" w:themeColor="text1"/>
+                <w:sz w:val="26"/>
+                <w:szCs w:val="26"/>
+                <w:lang w:val="vi-VN"/>
+              </w:rPr>
+            </w:pPr>
+          </w:p>
+        </w:tc>
+        <w:tc>
+          <w:tcPr>
+            <w:tcW w:w="4259" w:type="dxa"/>
+          </w:tcPr>
+          <w:p>
+            <w:pPr>
+              <w:pStyle w:val="ListParagraph"/>
+              <w:spacing w:before="60" w:after="60" w:line="320" w:lineRule="exact"/>
+              <w:ind w:left="0"/>
+              <w:jc w:val="both"/>
+              <w:rPr>
+                <w:rFonts w:ascii="Times New Roman" w:eastAsia="Times New Roman" w:hAnsi="Times New Roman" w:cs="Times New Roman"/>
+                <w:color w:val="000000" w:themeColor="text1"/>
+                <w:sz w:val="26"/>
+                <w:szCs w:val="26"/>
+                <w:lang w:val="vi-VN"/>
+              </w:rPr>
+            </w:pPr>
+            <w:r>
+              <w:rPr>
+                <w:rFonts w:ascii="Times New Roman" w:eastAsia="Times New Roman" w:hAnsi="Times New Roman" w:cs="Times New Roman"/>
+                <w:color w:val="000000" w:themeColor="text1"/>
+                <w:sz w:val="26"/>
+                <w:szCs w:val="26"/>
+                <w:lang w:val="vi-VN"/>
+              </w:rPr>
+              <w:t>{</w:t>
+            </w:r>
+            <w:r>
+              <w:rPr>
+                <w:rFonts w:ascii="Times New Roman" w:eastAsia="Times New Roman" w:hAnsi="Times New Roman" w:cs="Times New Roman"/>
+                <w:color w:val="000000" w:themeColor="text1"/>
+                <w:sz w:val="26"/>
+                <w:szCs w:val="26"/>
+                <w:lang w:val="vi-VN"/>
+              </w:rPr>
+              <w:t>phu_luc_table</w:t>
+            </w:r>
+            <w:r>
+              <w:rPr>
+                <w:rFonts w:ascii="Times New Roman" w:eastAsia="Times New Roman" w:hAnsi="Times New Roman" w:cs="Times New Roman"/>
+                <w:color w:val="000000" w:themeColor="text1"/>
+                <w:sz w:val="26"/>
+                <w:szCs w:val="26"/>
+                <w:lang w:val="vi-VN"/>
+              </w:rPr>
+              <w:t>2</w:t>
+            </w:r>
+            <w:r>
+              <w:rPr>
+                <w:rFonts w:ascii="Times New Roman" w:eastAsia="Times New Roman" w:hAnsi="Times New Roman" w:cs="Times New Roman"/>
+                <w:color w:val="000000" w:themeColor="text1"/>
+                <w:sz w:val="26"/>
+                <w:szCs w:val="26"/>
+                <w:lang w:val="vi-VN"/>
+              </w:rPr>
+              <w:t>_mua_phuong</w:t>
+            </w:r>
+            <w:r>
+              <w:rPr>
+                <w:rFonts w:ascii="Times New Roman" w:eastAsia="Times New Roman" w:hAnsi="Times New Roman" w:cs="Times New Roman"/>
+                <w:color w:val="000000" w:themeColor="text1"/>
+                <w:sz w:val="26"/>
+                <w:szCs w:val="26"/>
+                <w:lang w:val="vi-VN"/>
+              </w:rPr>
+              <w:t>}</w:t>
+            </w:r>
+          </w:p>
+        </w:tc>
+      </w:tr>
+    </w:tbl>
+    <w:p>
+      <w:pPr>
+        <w:spacing w:before="60" w:after="60" w:line="320" w:lineRule="exact"/>
+        <w:jc w:val="both"/>
+        <w:rPr>
+          <w:rFonts w:ascii="Times New Roman" w:eastAsia="Times New Roman" w:hAnsi="Times New Roman" w:cs="Times New Roman"/>
+          <w:color w:val="000000" w:themeColor="text1"/>
+          <w:sz w:val="26"/>
+          <w:szCs w:val="26"/>
+          <w:lang w:val="vi-VN"/>
+        </w:rPr>
+      </w:pPr>
+      <w:r>
+        <w:rPr>
+          <w:rFonts w:ascii="Times New Roman" w:eastAsia="Times New Roman" w:hAnsi="Times New Roman" w:cs="Times New Roman"/>
+          <w:color w:val="000000" w:themeColor="text1"/>
+          <w:sz w:val="26"/>
+          <w:szCs w:val="26"/>
+          <w:lang w:val="vi-VN"/>
+        </w:rPr>
+        <w:t xml:space="preserve">     </w:t>
+      </w:r>
+      <w:r>
+        <w:rPr>
+          <w:rFonts w:ascii="Times New Roman" w:eastAsia="Times New Roman" w:hAnsi="Times New Roman" w:cs="Times New Roman"/>
+          <w:color w:val="000000" w:themeColor="text1"/>
+          <w:sz w:val="26"/>
+          <w:szCs w:val="26"/>
+          <w:lang w:val="vi-VN"/>
+        </w:rPr>
+        <w:t xml:space="preserve"> </w:t>
+      </w:r>
+      <w:proofErr w:type="spellStart"/>
+      <w:r>
+        <w:rPr>
+          <w:rFonts w:ascii="Times New Roman" w:eastAsia="Times New Roman" w:hAnsi="Times New Roman" w:cs="Times New Roman"/>
+          <w:color w:val="000000" w:themeColor="text1"/>
+          <w:sz w:val="26"/>
+          <w:szCs w:val="26"/>
+        </w:rPr>
+        <w:t>Số</w:t>
+      </w:r>
+      <w:proofErr w:type="spellEnd"/>
+      <w:r>
+        <w:rPr>
+          <w:rFonts w:ascii="Times New Roman" w:eastAsia="Times New Roman" w:hAnsi="Times New Roman" w:cs="Times New Roman"/>
+          <w:color w:val="000000" w:themeColor="text1"/>
+          <w:sz w:val="26"/>
+          <w:szCs w:val="26"/>
+        </w:rPr>
+        <w:t xml:space="preserve"> </w:t>
+      </w:r>
+      <w:proofErr w:type="spellStart"/>
+      <w:r>
+        <w:rPr>
+          <w:rFonts w:ascii="Times New Roman" w:eastAsia="Times New Roman" w:hAnsi="Times New Roman" w:cs="Times New Roman"/>
+          <w:color w:val="000000" w:themeColor="text1"/>
+          <w:sz w:val="26"/>
+          <w:szCs w:val="26"/>
+        </w:rPr>
+        <w:t>liệu</w:t>
+      </w:r>
+      <w:proofErr w:type="spellEnd"/>
+      <w:r>
+        <w:rPr>
+          <w:rFonts w:ascii="Times New Roman" w:eastAsia="Times New Roman" w:hAnsi="Times New Roman" w:cs="Times New Roman"/>
+          <w:color w:val="000000" w:themeColor="text1"/>
+          <w:sz w:val="26"/>
+          <w:szCs w:val="26"/>
+        </w:rPr>
+        <w:t xml:space="preserve"> </w:t>
+      </w:r>
+      <w:proofErr w:type="spellStart"/>
+      <w:r>
+        <w:rPr>
+          <w:rFonts w:ascii="Times New Roman" w:eastAsia="Times New Roman" w:hAnsi="Times New Roman" w:cs="Times New Roman"/>
+          <w:color w:val="000000" w:themeColor="text1"/>
+          <w:sz w:val="26"/>
+          <w:szCs w:val="26"/>
+        </w:rPr>
+        <w:t>mưa</w:t>
+      </w:r>
+      <w:proofErr w:type="spellEnd"/>
+      <w:r>
+        <w:rPr>
+          <w:rFonts w:ascii="Times New Roman" w:eastAsia="Times New Roman" w:hAnsi="Times New Roman" w:cs="Times New Roman"/>
+          <w:color w:val="000000" w:themeColor="text1"/>
+          <w:sz w:val="26"/>
+          <w:szCs w:val="26"/>
+        </w:rPr>
+        <w:t xml:space="preserve"> </w:t>
+      </w:r>
+      <w:proofErr w:type="spellStart"/>
+      <w:r>
+        <w:rPr>
+          <w:rFonts w:ascii="Times New Roman" w:eastAsia="Times New Roman" w:hAnsi="Times New Roman" w:cs="Times New Roman"/>
+          <w:color w:val="000000" w:themeColor="text1"/>
+          <w:sz w:val="26"/>
+          <w:szCs w:val="26"/>
+        </w:rPr>
+        <w:t>các</w:t>
+      </w:r>
+      <w:proofErr w:type="spellEnd"/>
+      <w:r>
+        <w:rPr>
+          <w:rFonts w:ascii="Times New Roman" w:eastAsia="Times New Roman" w:hAnsi="Times New Roman" w:cs="Times New Roman"/>
+          <w:color w:val="000000" w:themeColor="text1"/>
+          <w:sz w:val="26"/>
+          <w:szCs w:val="26"/>
+        </w:rPr>
+        <w:t xml:space="preserve"> </w:t>
+      </w:r>
+      <w:proofErr w:type="spellStart"/>
+      <w:r>
+        <w:rPr>
+          <w:rFonts w:ascii="Times New Roman" w:eastAsia="Times New Roman" w:hAnsi="Times New Roman" w:cs="Times New Roman"/>
+          <w:color w:val="000000" w:themeColor="text1"/>
+          <w:sz w:val="26"/>
+          <w:szCs w:val="26"/>
+        </w:rPr>
+        <w:t>xã</w:t>
+      </w:r>
+      <w:proofErr w:type="spellEnd"/>
+    </w:p>
+    <w:tbl>
+      <w:tblPr>
+        <w:tblStyle w:val="TableGrid"/>
+        <w:tblW w:w="0" w:type="auto"/>
+        <w:tblInd w:w="360" w:type="dxa"/>
+        <w:tblBorders>
+          <w:top w:val="none" w:sz="0" w:space="0" w:color="auto"/>
+          <w:left w:val="none" w:sz="0" w:space="0" w:color="auto"/>
+          <w:bottom w:val="none" w:sz="0" w:space="0" w:color="auto"/>
+          <w:right w:val="none" w:sz="0" w:space="0" w:color="auto"/>
+          <w:insideH w:val="none" w:sz="0" w:space="0" w:color="auto"/>
+          <w:insideV w:val="none" w:sz="0" w:space="0" w:color="auto"/>
+        </w:tblBorders>
+        <w:tblLook w:val="04A0" w:firstRow="1" w:lastRow="0" w:firstColumn="1" w:lastColumn="0" w:noHBand="0" w:noVBand="1"/>
+      </w:tblPr>
+      <w:tblGrid>
+        <w:gridCol w:w="4315"/>
+        <w:gridCol w:w="270"/>
+        <w:gridCol w:w="4259"/>
+      </w:tblGrid>
+      <w:tr>
+        <w:tc>
+          <w:tcPr>
+            <w:tcW w:w="4315" w:type="dxa"/>
+          </w:tcPr>
+          <w:p>
+            <w:pPr>
+              <w:pStyle w:val="ListParagraph"/>
+              <w:spacing w:before="60" w:after="60" w:line="320" w:lineRule="exact"/>
+              <w:ind w:left="0"/>
+              <w:jc w:val="both"/>
+              <w:rPr>
+                <w:rFonts w:ascii="Times New Roman" w:eastAsia="Times New Roman" w:hAnsi="Times New Roman" w:cs="Times New Roman"/>
+                <w:color w:val="000000" w:themeColor="text1"/>
+                <w:sz w:val="26"/>
+                <w:szCs w:val="26"/>
+                <w:lang w:val="vi-VN"/>
+              </w:rPr>
+            </w:pPr>
+            <w:r>
+              <w:rPr>
+                <w:rFonts w:ascii="Times New Roman" w:eastAsia="Times New Roman" w:hAnsi="Times New Roman" w:cs="Times New Roman"/>
+                <w:color w:val="000000" w:themeColor="text1"/>
+                <w:sz w:val="26"/>
+                <w:szCs w:val="26"/>
+                <w:lang w:val="vi-VN"/>
+              </w:rPr>
+              <w:t>{</w:t>
+            </w:r>
+            <w:r>
+              <w:rPr>
+                <w:rFonts w:ascii="Times New Roman" w:eastAsia="Times New Roman" w:hAnsi="Times New Roman" w:cs="Times New Roman"/>
+                <w:color w:val="000000" w:themeColor="text1"/>
+                <w:sz w:val="26"/>
+                <w:szCs w:val="26"/>
+                <w:lang w:val="vi-VN"/>
+              </w:rPr>
+              <w:t>phu_luc_table</w:t>
+            </w:r>
+            <w:r>
+              <w:rPr>
+                <w:rFonts w:ascii="Times New Roman" w:eastAsia="Times New Roman" w:hAnsi="Times New Roman" w:cs="Times New Roman"/>
+                <w:color w:val="000000" w:themeColor="text1"/>
+                <w:sz w:val="26"/>
+                <w:szCs w:val="26"/>
+                <w:lang w:val="vi-VN"/>
+              </w:rPr>
+              <w:t>1</w:t>
+            </w:r>
+            <w:r>
+              <w:rPr>
+                <w:rFonts w:ascii="Times New Roman" w:eastAsia="Times New Roman" w:hAnsi="Times New Roman" w:cs="Times New Roman"/>
+                <w:color w:val="000000" w:themeColor="text1"/>
+                <w:sz w:val="26"/>
+                <w:szCs w:val="26"/>
+                <w:lang w:val="vi-VN"/>
+              </w:rPr>
+              <w:t>_mua_</w:t>
+            </w:r>
+            <w:r>
+              <w:rPr>
+                <w:rFonts w:ascii="Times New Roman" w:eastAsia="Times New Roman" w:hAnsi="Times New Roman" w:cs="Times New Roman"/>
+                <w:color w:val="000000" w:themeColor="text1"/>
+                <w:sz w:val="26"/>
+                <w:szCs w:val="26"/>
+                <w:lang w:val="vi-VN"/>
+              </w:rPr>
+              <w:t>xa</w:t>
+            </w:r>
+            <w:r>
+              <w:rPr>
+                <w:rFonts w:ascii="Times New Roman" w:eastAsia="Times New Roman" w:hAnsi="Times New Roman" w:cs="Times New Roman"/>
+                <w:color w:val="000000" w:themeColor="text1"/>
+                <w:sz w:val="26"/>
+                <w:szCs w:val="26"/>
+                <w:lang w:val="vi-VN"/>
+              </w:rPr>
+              <w:t>}</w:t>
+            </w:r>
+          </w:p>
+        </w:tc>
+        <w:tc>
+          <w:tcPr>
+            <w:tcW w:w="270" w:type="dxa"/>
+          </w:tcPr>
+          <w:p>
+            <w:pPr>
+              <w:pStyle w:val="ListParagraph"/>
+              <w:spacing w:before="60" w:after="60" w:line="320" w:lineRule="exact"/>
+              <w:ind w:left="0"/>
+              <w:jc w:val="both"/>
+              <w:rPr>
+                <w:rFonts w:ascii="Times New Roman" w:eastAsia="Times New Roman" w:hAnsi="Times New Roman" w:cs="Times New Roman"/>
+                <w:color w:val="000000" w:themeColor="text1"/>
+                <w:sz w:val="26"/>
+                <w:szCs w:val="26"/>
+                <w:lang w:val="vi-VN"/>
+              </w:rPr>
+            </w:pPr>
+          </w:p>
+        </w:tc>
+        <w:tc>
+          <w:tcPr>
+            <w:tcW w:w="4259" w:type="dxa"/>
+          </w:tcPr>
+          <w:p>
+            <w:pPr>
+              <w:pStyle w:val="ListParagraph"/>
+              <w:spacing w:before="60" w:after="60" w:line="320" w:lineRule="exact"/>
+              <w:ind w:left="0"/>
+              <w:jc w:val="both"/>
+              <w:rPr>
+                <w:rFonts w:ascii="Times New Roman" w:eastAsia="Times New Roman" w:hAnsi="Times New Roman" w:cs="Times New Roman"/>
+                <w:color w:val="000000" w:themeColor="text1"/>
+                <w:sz w:val="26"/>
+                <w:szCs w:val="26"/>
+                <w:lang w:val="vi-VN"/>
+              </w:rPr>
+            </w:pPr>
+            <w:r>
+              <w:rPr>
+                <w:rFonts w:ascii="Times New Roman" w:eastAsia="Times New Roman" w:hAnsi="Times New Roman" w:cs="Times New Roman"/>
+                <w:color w:val="000000" w:themeColor="text1"/>
+                <w:sz w:val="26"/>
+                <w:szCs w:val="26"/>
+                <w:lang w:val="vi-VN"/>
+              </w:rPr>
+              <w:t>{</w:t>
+            </w:r>
+            <w:r>
+              <w:rPr>
+                <w:rFonts w:ascii="Times New Roman" w:eastAsia="Times New Roman" w:hAnsi="Times New Roman" w:cs="Times New Roman"/>
+                <w:color w:val="000000" w:themeColor="text1"/>
+                <w:sz w:val="26"/>
+                <w:szCs w:val="26"/>
+                <w:lang w:val="vi-VN"/>
+              </w:rPr>
+              <w:t>phu_luc_table</w:t>
+            </w:r>
+            <w:r>
+              <w:rPr>
+                <w:rFonts w:ascii="Times New Roman" w:eastAsia="Times New Roman" w:hAnsi="Times New Roman" w:cs="Times New Roman"/>
+                <w:color w:val="000000" w:themeColor="text1"/>
+                <w:sz w:val="26"/>
+                <w:szCs w:val="26"/>
+                <w:lang w:val="vi-VN"/>
+              </w:rPr>
+              <w:t>2</w:t>
+            </w:r>
+            <w:r>
+              <w:rPr>
+                <w:rFonts w:ascii="Times New Roman" w:eastAsia="Times New Roman" w:hAnsi="Times New Roman" w:cs="Times New Roman"/>
+                <w:color w:val="000000" w:themeColor="text1"/>
+                <w:sz w:val="26"/>
+                <w:szCs w:val="26"/>
+                <w:lang w:val="vi-VN"/>
+              </w:rPr>
+              <w:t>_mua_</w:t>
+            </w:r>
+            <w:r>
+              <w:rPr>
+                <w:rFonts w:ascii="Times New Roman" w:eastAsia="Times New Roman" w:hAnsi="Times New Roman" w:cs="Times New Roman"/>
+                <w:color w:val="000000" w:themeColor="text1"/>
+                <w:sz w:val="26"/>
+                <w:szCs w:val="26"/>
+                <w:lang w:val="vi-VN"/>
+              </w:rPr>
+              <w:t>xa</w:t>
+            </w:r>
+            <w:r>
+              <w:rPr>
+                <w:rFonts w:ascii="Times New Roman" w:eastAsia="Times New Roman" w:hAnsi="Times New Roman" w:cs="Times New Roman"/>
+                <w:color w:val="000000" w:themeColor="text1"/>
+                <w:sz w:val="26"/>
+                <w:szCs w:val="26"/>
+                <w:lang w:val="vi-VN"/>
+              </w:rPr>
+              <w:t>}</w:t>
+            </w:r>
+          </w:p>
+        </w:tc>
+      </w:tr>
+      <w:tr>
+        <w:tc>
+          <w:tcPr>
+            <w:tcW w:w="4315" w:type="dxa"/>
+          </w:tcPr>
+          <w:p>
+            <w:pPr>
+              <w:pStyle w:val="ListParagraph"/>
+              <w:spacing w:before="60" w:after="60" w:line="320" w:lineRule="exact"/>
+              <w:ind w:left="0"/>
+              <w:jc w:val="both"/>
+              <w:rPr>
+                <w:rFonts w:ascii="Times New Roman" w:eastAsia="Times New Roman" w:hAnsi="Times New Roman" w:cs="Times New Roman"/>
+                <w:color w:val="000000" w:themeColor="text1"/>
+                <w:sz w:val="26"/>
+                <w:szCs w:val="26"/>
+                <w:lang w:val="vi-VN"/>
+              </w:rPr>
+            </w:pPr>
+          </w:p>
+        </w:tc>
+        <w:tc>
+          <w:tcPr>
+            <w:tcW w:w="270" w:type="dxa"/>
+          </w:tcPr>
+          <w:p>
+            <w:pPr>
+              <w:pStyle w:val="ListParagraph"/>
+              <w:spacing w:before="60" w:after="60" w:line="320" w:lineRule="exact"/>
+              <w:ind w:left="0"/>
+              <w:jc w:val="both"/>
+              <w:rPr>
+                <w:rFonts w:ascii="Times New Roman" w:eastAsia="Times New Roman" w:hAnsi="Times New Roman" w:cs="Times New Roman"/>
+                <w:color w:val="000000" w:themeColor="text1"/>
+                <w:sz w:val="26"/>
+                <w:szCs w:val="26"/>
+                <w:lang w:val="vi-VN"/>
+              </w:rPr>
+            </w:pPr>
+          </w:p>
+        </w:tc>
+        <w:tc>
+          <w:tcPr>
+            <w:tcW w:w="4259" w:type="dxa"/>
+          </w:tcPr>
+          <w:p>
+            <w:pPr>
+              <w:pStyle w:val="ListParagraph"/>
+              <w:spacing w:before="60" w:after="60" w:line="320" w:lineRule="exact"/>
+              <w:ind w:left="0"/>
+              <w:jc w:val="both"/>
+              <w:rPr>
+                <w:rFonts w:ascii="Times New Roman" w:eastAsia="Times New Roman" w:hAnsi="Times New Roman" w:cs="Times New Roman"/>
+                <w:color w:val="000000" w:themeColor="text1"/>
+                <w:sz w:val="26"/>
+                <w:szCs w:val="26"/>
+                <w:lang w:val="vi-VN"/>
+              </w:rPr>
+            </w:pPr>
+          </w:p>
+        </w:tc>
+      </w:tr>
+    </w:tbl>
+    <w:p>
+      <w:pPr>
+        <w:spacing w:before="60" w:after="60" w:line="320" w:lineRule="exact"/>
+        <w:jc w:val="both"/>
+        <w:rPr>
+          <w:rFonts w:ascii="Times New Roman" w:eastAsia="Times New Roman" w:hAnsi="Times New Roman" w:cs="Times New Roman"/>
+          <w:color w:val="000000" w:themeColor="text1"/>
+          <w:sz w:val="26"/>
+          <w:szCs w:val="26"/>
+          <w:lang w:val="vi-VN"/>
+        </w:rPr>
+      </w:pPr>
+      <w:r>
+        <w:rPr>
+          <w:rFonts w:ascii="Times New Roman" w:eastAsia="Times New Roman" w:hAnsi="Times New Roman" w:cs="Times New Roman"/>
+          <w:color w:val="000000" w:themeColor="text1"/>
+          <w:sz w:val="26"/>
+          <w:szCs w:val="26"/>
+          <w:lang w:val="vi-VN"/>
+        </w:rPr>
+        <w:t xml:space="preserve">      </w:t>
+      </w:r>
+      <w:proofErr w:type="spellStart"/>
+      <w:r>
+        <w:rPr>
+          <w:rFonts w:ascii="Times New Roman" w:eastAsia="Times New Roman" w:hAnsi="Times New Roman" w:cs="Times New Roman"/>
+          <w:color w:val="000000" w:themeColor="text1"/>
+          <w:sz w:val="26"/>
+          <w:szCs w:val="26"/>
+        </w:rPr>
+        <w:t>Số</w:t>
+      </w:r>
+      <w:proofErr w:type="spellEnd"/>
+      <w:r>
+        <w:rPr>
+          <w:rFonts w:ascii="Times New Roman" w:eastAsia="Times New Roman" w:hAnsi="Times New Roman" w:cs="Times New Roman"/>
+          <w:color w:val="000000" w:themeColor="text1"/>
+          <w:sz w:val="26"/>
+          <w:szCs w:val="26"/>
+        </w:rPr>
+        <w:t xml:space="preserve"> liệu</w:t>
+      </w:r>
+      <w:r>
+        <w:rPr>
+          <w:rFonts w:ascii="Times New Roman" w:eastAsia="Times New Roman" w:hAnsi="Times New Roman" w:cs="Times New Roman"/>
+          <w:color w:val="000000" w:themeColor="text1"/>
+          <w:sz w:val="26"/>
+          <w:szCs w:val="26"/>
+          <w:lang w:val="vi-VN"/>
+        </w:rPr>
+        <w:t xml:space="preserve"> sông</w:t>
+      </w:r>
+    </w:p>
+    <w:p>
+      <w:pPr>
+        <w:spacing w:before="60" w:after="60" w:line="320" w:lineRule="exact"/>
+        <w:jc w:val="both"/>
+        <w:rPr>
+          <w:rFonts w:ascii="Times New Roman" w:eastAsia="Times New Roman" w:hAnsi="Times New Roman" w:cs="Times New Roman"/>
+          <w:color w:val="000000" w:themeColor="text1"/>
+          <w:sz w:val="26"/>
+          <w:szCs w:val="26"/>
+          <w:lang w:val="vi-VN"/>
+        </w:rPr>
+      </w:pPr>
+      <w:r>
+        <w:rPr>
+          <w:rFonts w:ascii="Times New Roman" w:eastAsia="Times New Roman" w:hAnsi="Times New Roman" w:cs="Times New Roman"/>
+          <w:color w:val="000000" w:themeColor="text1"/>
+          <w:sz w:val="26"/>
+          <w:szCs w:val="26"/>
+          <w:lang w:val="vi-VN"/>
+        </w:rPr>
+        <w:t xml:space="preserve">      {</w:t>
+      </w:r>
+      <w:r>
+        <w:rPr>
+          <w:rFonts w:ascii="Times New Roman" w:eastAsia="Times New Roman" w:hAnsi="Times New Roman" w:cs="Times New Roman"/>
+          <w:color w:val="000000" w:themeColor="text1"/>
+          <w:sz w:val="26"/>
+          <w:szCs w:val="26"/>
+          <w:lang w:val="vi-VN"/>
+        </w:rPr>
+        <w:t>phu_luc_table_song</w:t>
+      </w:r>
+      <w:r>
+        <w:rPr>
+          <w:rFonts w:ascii="Times New Roman" w:eastAsia="Times New Roman" w:hAnsi="Times New Roman" w:cs="Times New Roman"/>
+          <w:color w:val="000000" w:themeColor="text1"/>
+          <w:sz w:val="26"/>
+          <w:szCs w:val="26"/>
+          <w:lang w:val="vi-VN"/>
+        </w:rPr>
+        <w:t>}</w:t>
+      </w:r>
+    </w:p>
+    <w:p>
+      <w:pPr>
+        <w:spacing w:before="60" w:after="60" w:line="320" w:lineRule="exact"/>
+        <w:jc w:val="both"/>
+        <w:rPr>
+          <w:rFonts w:ascii="Times New Roman" w:eastAsia="Times New Roman" w:hAnsi="Times New Roman" w:cs="Times New Roman"/>
+          <w:color w:val="000000" w:themeColor="text1"/>
+          <w:sz w:val="26"/>
+          <w:szCs w:val="26"/>
+          <w:lang w:val="vi-VN"/>
+        </w:rPr>
+      </w:pPr>
+      <w:r>
+        <w:rPr>
+          <w:rFonts w:ascii="Times New Roman" w:eastAsia="Times New Roman" w:hAnsi="Times New Roman" w:cs="Times New Roman"/>
+          <w:color w:val="000000" w:themeColor="text1"/>
+          <w:sz w:val="26"/>
+          <w:szCs w:val="26"/>
+          <w:lang w:val="vi-VN"/>
+        </w:rPr>
+        <w:t xml:space="preserve">      </w:t>
+      </w:r>
+      <w:proofErr w:type="spellStart"/>
+      <w:r>
+        <w:rPr>
+          <w:rFonts w:ascii="Times New Roman" w:eastAsia="Times New Roman" w:hAnsi="Times New Roman" w:cs="Times New Roman"/>
+          <w:color w:val="000000" w:themeColor="text1"/>
+          <w:sz w:val="26"/>
+          <w:szCs w:val="26"/>
+        </w:rPr>
+        <w:t>Số</w:t>
+      </w:r>
+      <w:proofErr w:type="spellEnd"/>
+      <w:r>
+        <w:rPr>
+          <w:rFonts w:ascii="Times New Roman" w:eastAsia="Times New Roman" w:hAnsi="Times New Roman" w:cs="Times New Roman"/>
+          <w:color w:val="000000" w:themeColor="text1"/>
+          <w:sz w:val="26"/>
+          <w:szCs w:val="26"/>
+        </w:rPr>
+        <w:t xml:space="preserve"> </w:t>
+      </w:r>
+      <w:proofErr w:type="spellStart"/>
+      <w:r>
+        <w:rPr>
+          <w:rFonts w:ascii="Times New Roman" w:eastAsia="Times New Roman" w:hAnsi="Times New Roman" w:cs="Times New Roman"/>
+          <w:color w:val="000000" w:themeColor="text1"/>
+          <w:sz w:val="26"/>
+          <w:szCs w:val="26"/>
+        </w:rPr>
+        <w:t>liệu</w:t>
+      </w:r>
+      <w:proofErr w:type="spellEnd"/>
+      <w:r>
+        <w:rPr>
+          <w:rFonts w:ascii="Times New Roman" w:eastAsia="Times New Roman" w:hAnsi="Times New Roman" w:cs="Times New Roman"/>
+          <w:color w:val="000000" w:themeColor="text1"/>
+          <w:sz w:val="26"/>
+          <w:szCs w:val="26"/>
+          <w:lang w:val="vi-VN"/>
+        </w:rPr>
+        <w:t xml:space="preserve"> </w:t>
+      </w:r>
+      <w:r>
+        <w:rPr>
+          <w:rFonts w:ascii="Times New Roman" w:eastAsia="Times New Roman" w:hAnsi="Times New Roman" w:cs="Times New Roman"/>
+          <w:color w:val="000000" w:themeColor="text1"/>
+          <w:sz w:val="26"/>
+          <w:szCs w:val="26"/>
+          <w:lang w:val="vi-VN"/>
+        </w:rPr>
+        <w:t>hồ</w:t>
+      </w:r>
+    </w:p>
+    <w:p>
+      <w:pPr>
+        <w:spacing w:before="60" w:after="60" w:line="320" w:lineRule="exact"/>
+        <w:jc w:val="both"/>
+        <w:rPr>
+          <w:rFonts w:ascii="Times New Roman" w:eastAsia="Times New Roman" w:hAnsi="Times New Roman" w:cs="Times New Roman"/>
+          <w:color w:val="000000" w:themeColor="text1"/>
+          <w:sz w:val="26"/>
+          <w:szCs w:val="26"/>
+          <w:lang w:val="vi-VN"/>
+        </w:rPr>
+      </w:pPr>
+      <w:r>
+        <w:rPr>
+          <w:rFonts w:ascii="Times New Roman" w:eastAsia="Times New Roman" w:hAnsi="Times New Roman" w:cs="Times New Roman"/>
+          <w:color w:val="000000" w:themeColor="text1"/>
+          <w:sz w:val="26"/>
+          <w:szCs w:val="26"/>
+          <w:lang w:val="vi-VN"/>
+        </w:rPr>
+        <w:t xml:space="preserve">      {</w:t>
+      </w:r>
+      <w:r>
+        <w:rPr>
+          <w:rFonts w:ascii="Times New Roman" w:eastAsia="Times New Roman" w:hAnsi="Times New Roman" w:cs="Times New Roman"/>
+          <w:color w:val="000000" w:themeColor="text1"/>
+          <w:sz w:val="26"/>
+          <w:szCs w:val="26"/>
+          <w:lang w:val="vi-VN"/>
+        </w:rPr>
+        <w:t>phu_luc_table_</w:t>
+      </w:r>
+      <w:r>
+        <w:rPr>
+          <w:rFonts w:ascii="Times New Roman" w:eastAsia="Times New Roman" w:hAnsi="Times New Roman" w:cs="Times New Roman"/>
+          <w:color w:val="000000" w:themeColor="text1"/>
+          <w:sz w:val="26"/>
+          <w:szCs w:val="26"/>
+          <w:lang w:val="vi-VN"/>
+        </w:rPr>
+        <w:t>ho</w:t>
+      </w:r>
+      <w:r>
+        <w:rPr>
+          <w:rFonts w:ascii="Times New Roman" w:eastAsia="Times New Roman" w:hAnsi="Times New Roman" w:cs="Times New Roman"/>
+          <w:color w:val="000000" w:themeColor="text1"/>
+          <w:sz w:val="26"/>
+          <w:szCs w:val="26"/>
+          <w:lang w:val="vi-VN"/>
+        </w:rPr>
+        <w:t>}</w:t>
+      </w:r>
+    </w:p>
+    <w:p>
+      <w:pPr>
+        <w:rPr>
+          <w:lang w:val="vi-VN"/>
+        </w:rPr>
+      </w:pPr>
+    </w:p>
     <w:p/>
     <w:p/>
     <w:sectPr>
@@ -8961,7 +9870,7 @@
 </file>
 
 <file path=word/numbering.xml><?xml version="1.0" encoding="utf-8"?>
-<w:numbering xmlns:wpc="http://schemas.microsoft.com/office/word/2010/wordprocessingCanvas" xmlns:cx="http://schemas.microsoft.com/office/drawing/2014/chartex" xmlns:cx1="http://schemas.microsoft.com/office/drawing/2015/9/8/chartex" xmlns:cx2="http://schemas.microsoft.com/office/drawing/2015/10/21/chartex" xmlns:cx3="http://schemas.microsoft.com/office/drawing/2016/5/9/chartex" xmlns:cx4="http://schemas.microsoft.com/office/drawing/2016/5/10/chartex" xmlns:cx5="http://schemas.microsoft.com/office/drawing/2016/5/11/chartex" xmlns:cx6="http://schemas.microsoft.com/office/drawing/2016/5/12/chartex" xmlns:cx7="http://schemas.microsoft.com/office/drawing/2016/5/13/chartex" xmlns:cx8="http://schemas.microsoft.com/office/drawing/2016/5/14/chartex" xmlns:mc="http://schemas.openxmlformats.org/markup-compatibility/2006" xmlns:aink="http://schemas.microsoft.com/office/drawing/2016/ink" xmlns:am3d="http://schemas.microsoft.com/office/drawing/2017/model3d" xmlns:o="urn:schemas-microsoft-com:office:office" xmlns:oel="http://schemas.microsoft.com/office/2019/extlst" xmlns:r="http://schemas.openxmlformats.org/officeDocument/2006/relationships" xmlns:m="http://schemas.openxmlformats.org/officeDocument/2006/math" xmlns:v="urn:schemas-microsoft-com:vml" xmlns:wp14="http://schemas.microsoft.com/office/word/2010/wordprocessingDrawing" xmlns:wp="http://schemas.openxmlformats.org/drawingml/2006/wordprocessingDrawing" xmlns:w10="urn:schemas-microsoft-com:office:word" xmlns:w="http://schemas.openxmlformats.org/wordprocessingml/2006/main" xmlns:w14="http://schemas.microsoft.com/office/word/2010/wordml" xmlns:w15="http://schemas.microsoft.com/office/word/2012/wordml" xmlns:w16cex="http://schemas.microsoft.com/office/word/2018/wordml/cex" xmlns:w16cid="http://schemas.microsoft.com/office/word/2016/wordml/cid" xmlns:w16="http://schemas.microsoft.com/office/word/2018/wordml" xmlns:w16du="http://schemas.microsoft.com/office/word/2023/wordml/word16du" xmlns:w16sdtdh="http://schemas.microsoft.com/office/word/2020/wordml/sdtdatahash" xmlns:w16sdtfl="http://schemas.microsoft.com/office/word/2024/wordml/sdtformatlock" xmlns:w16se="http://schemas.microsoft.com/office/word/2015/wordml/symex" xmlns:wpg="http://schemas.microsoft.com/office/word/2010/wordprocessingGroup" xmlns:wpi="http://schemas.microsoft.com/office/word/2010/wordprocessingInk" xmlns:wne="http://schemas.microsoft.com/office/word/2006/wordml" xmlns:wps="http://schemas.microsoft.com/office/word/2010/wordprocessingShape" mc:Ignorable="w14 w15 w16se w16cid w16 w16cex w16sdtdh w16sdtfl w16du wp14">
+<w:numbering xmlns:wpc="http://schemas.microsoft.com/office/word/2010/wordprocessingCanvas" xmlns:cx="http://schemas.microsoft.com/office/drawing/2014/chartex" xmlns:cx1="http://schemas.microsoft.com/office/drawing/2015/9/8/chartex" xmlns:cx2="http://schemas.microsoft.com/office/drawing/2015/10/21/chartex" xmlns:cx3="http://schemas.microsoft.com/office/drawing/2016/5/9/chartex" xmlns:cx4="http://schemas.microsoft.com/office/drawing/2016/5/10/chartex" xmlns:cx5="http://schemas.microsoft.com/office/drawing/2016/5/11/chartex" xmlns:cx6="http://schemas.microsoft.com/office/drawing/2016/5/12/chartex" xmlns:cx7="http://schemas.microsoft.com/office/drawing/2016/5/13/chartex" xmlns:cx8="http://schemas.microsoft.com/office/drawing/2016/5/14/chartex" xmlns:mc="http://schemas.openxmlformats.org/markup-compatibility/2006" xmlns:m="http://schemas.openxmlformats.org/officeDocument/2006/math" xmlns:aink="http://schemas.microsoft.com/office/drawing/2016/ink" xmlns:am3d="http://schemas.microsoft.com/office/drawing/2017/model3d" xmlns:oel="http://schemas.microsoft.com/office/2019/extlst" xmlns:r="http://schemas.openxmlformats.org/officeDocument/2006/relationships" xmlns:wp14="http://schemas.microsoft.com/office/word/2010/wordprocessingDrawing" xmlns:wp="http://schemas.openxmlformats.org/drawingml/2006/wordprocessingDrawing" xmlns:wpg="http://schemas.microsoft.com/office/word/2010/wordprocessingGroup" xmlns:wpi="http://schemas.microsoft.com/office/word/2010/wordprocessingInk" xmlns:wps="http://schemas.microsoft.com/office/word/2010/wordprocessingShape" xmlns:o="urn:schemas-microsoft-com:office:office" xmlns:v="urn:schemas-microsoft-com:vml" xmlns:w10="urn:schemas-microsoft-com:office:word" xmlns:w="http://schemas.openxmlformats.org/wordprocessingml/2006/main" xmlns:w14="http://schemas.microsoft.com/office/word/2010/wordml" xmlns:w15="http://schemas.microsoft.com/office/word/2012/wordml" xmlns:w16cex="http://schemas.microsoft.com/office/word/2018/wordml/cex" xmlns:w16cid="http://schemas.microsoft.com/office/word/2016/wordml/cid" xmlns:w16="http://schemas.microsoft.com/office/word/2018/wordml" xmlns:w16sdtdh="http://schemas.microsoft.com/office/word/2020/wordml/sdtdatahash" xmlns:w16sdtfl="http://schemas.microsoft.com/office/word/2024/wordml/sdtformatlock" xmlns:w16se="http://schemas.microsoft.com/office/word/2015/wordml/symex" xmlns:w16du="http://schemas.microsoft.com/office/word/2023/wordml/word16du" xmlns:wne="http://schemas.microsoft.com/office/word/2006/wordml" mc:Ignorable="w14 w15 w16se w16cid w16 w16cex w16sdtdh w16sdtfl w16du wp14">
   <w:abstractNum w:abstractNumId="0" w15:restartNumberingAfterBreak="0">
     <w:nsid w:val="0EEF2183"/>
     <w:multiLevelType w:val="hybridMultilevel"/>
@@ -9290,7 +10199,7 @@
 </file>
 
 <file path=word/styles.xml><?xml version="1.0" encoding="utf-8"?>
-<w:styles xmlns:mc="http://schemas.openxmlformats.org/markup-compatibility/2006" xmlns:r="http://schemas.openxmlformats.org/officeDocument/2006/relationships" xmlns:w="http://schemas.openxmlformats.org/wordprocessingml/2006/main" xmlns:w14="http://schemas.microsoft.com/office/word/2010/wordml" xmlns:w15="http://schemas.microsoft.com/office/word/2012/wordml" xmlns:w16cex="http://schemas.microsoft.com/office/word/2018/wordml/cex" xmlns:w16cid="http://schemas.microsoft.com/office/word/2016/wordml/cid" xmlns:w16="http://schemas.microsoft.com/office/word/2018/wordml" xmlns:w16du="http://schemas.microsoft.com/office/word/2023/wordml/word16du" xmlns:w16sdtdh="http://schemas.microsoft.com/office/word/2020/wordml/sdtdatahash" xmlns:w16sdtfl="http://schemas.microsoft.com/office/word/2024/wordml/sdtformatlock" xmlns:w16se="http://schemas.microsoft.com/office/word/2015/wordml/symex" mc:Ignorable="w14 w15 w16se w16cid w16 w16cex w16sdtdh w16sdtfl w16du">
+<w:styles xmlns:mc="http://schemas.openxmlformats.org/markup-compatibility/2006" xmlns:r="http://schemas.openxmlformats.org/officeDocument/2006/relationships" xmlns:w="http://schemas.openxmlformats.org/wordprocessingml/2006/main" xmlns:w14="http://schemas.microsoft.com/office/word/2010/wordml" xmlns:w15="http://schemas.microsoft.com/office/word/2012/wordml" xmlns:w16cex="http://schemas.microsoft.com/office/word/2018/wordml/cex" xmlns:w16cid="http://schemas.microsoft.com/office/word/2016/wordml/cid" xmlns:w16="http://schemas.microsoft.com/office/word/2018/wordml" xmlns:w16sdtdh="http://schemas.microsoft.com/office/word/2020/wordml/sdtdatahash" xmlns:w16sdtfl="http://schemas.microsoft.com/office/word/2024/wordml/sdtformatlock" xmlns:w16se="http://schemas.microsoft.com/office/word/2015/wordml/symex" xmlns:w16du="http://schemas.microsoft.com/office/word/2023/wordml/word16du" mc:Ignorable="w14 w15 w16se w16cid w16 w16cex w16sdtdh w16sdtfl w16du">
   <w:docDefaults>
     <w:rPrDefault>
       <w:rPr>

</xml_diff>

<commit_message>
[water] sua bao cao
</commit_message>
<xml_diff>
--- a/ai_tnhn/ai-api-tnhn/doc/Bao cao mua ngay {dd}-{mm}-{yyyy} thoi diem {hh}.docx
+++ b/ai_tnhn/ai-api-tnhn/doc/Bao cao mua ngay {dd}-{mm}-{yyyy} thoi diem {hh}.docx
@@ -161,7 +161,7 @@
                     </wp:anchor>
                   </w:drawing>
                 </mc:Choice>
-                <mc:Fallback>
+                <mc:Fallback xmlns:w16cei="http://schemas.microsoft.com/office/word/2026/wordml/cei">
                   <w:pict>
                     <v:shapetype xmlns:o="urn:schemas-microsoft-com:office:office" id="_x0000_t32" coordsize="21600,21600" o:spt="32" path="m,l21600,21600e" filled="f">
                       <v:path fillok="f" o:connecttype="none"/>
@@ -425,7 +425,7 @@
                     </wp:anchor>
                   </w:drawing>
                 </mc:Choice>
-                <mc:Fallback>
+                <mc:Fallback xmlns:w16cei="http://schemas.microsoft.com/office/word/2026/wordml/cei">
                   <w:pict>
                     <v:shape xmlns:o="urn:schemas-microsoft-com:office:office" type="#_x0000_t32" id="Straight Arrow Connector 3" o:spid="_x0000_s1027" style="position:absolute;width:147.05pt;height:0pt;z-index:2;mso-wrap-distance-left:9pt;mso-wrap-distance-top:0pt;mso-wrap-distance-right:9pt;mso-wrap-distance-bottom:0pt;margin-left:58pt;margin-top:4.55pt;mso-position-horizontal:absolute;mso-position-horizontal-relative:text;mso-position-vertical:absolute;mso-position-vertical-relative:text" filled="f" strokecolor="#000000" strokeweight="1pt" stroked="t" o:allowincell="t">
                       <o:lock shapetype="t"/>
@@ -1408,6 +1408,7 @@
           <w:rFonts w:ascii="Times New Roman" w:hAnsi="Times New Roman" w:cs="Times New Roman"/>
           <w:color w:val="000000" w:themeColor="text1"/>
           <w:sz w:val="26"/>
+          <w:lang w:val="vi-VN"/>
         </w:rPr>
       </w:pPr>
       <w:r>
@@ -1783,15 +1784,14 @@
         <w:pStyle w:val="ListParagraph"/>
         <w:numPr>
           <w:ilvl w:val="0"/>
-          <w:numId w:val="3"/>
+          <w:numId w:val="4"/>
         </w:numPr>
-        <w:spacing w:before="60" w:after="60" w:line="320" w:lineRule="exact"/>
-        <w:ind w:left="0" w:firstLine="360"/>
+        <w:spacing w:before="60" w:after="60" w:line="240" w:lineRule="auto"/>
         <w:jc w:val="both"/>
         <w:rPr>
-          <w:rFonts w:ascii="Times New Roman" w:eastAsia="Times New Roman" w:hAnsi="Times New Roman" w:cs="Times New Roman"/>
-          <w:sz w:val="26"/>
-          <w:szCs w:val="26"/>
+          <w:rFonts w:ascii="Times New Roman" w:hAnsi="Times New Roman" w:cs="Times New Roman"/>
+          <w:color w:val="000000" w:themeColor="text1"/>
+          <w:sz w:val="26"/>
         </w:rPr>
       </w:pPr>
       <w:proofErr w:type="spellStart"/>
@@ -1854,6 +1854,18 @@
         </w:rPr>
         <w:t xml:space="preserve">: </w:t>
       </w:r>
+    </w:p>
+    <w:p>
+      <w:pPr>
+        <w:spacing w:before="60" w:after="60" w:line="240" w:lineRule="auto"/>
+        <w:ind w:firstLine="360"/>
+        <w:jc w:val="both"/>
+        <w:rPr>
+          <w:rFonts w:ascii="Times New Roman" w:hAnsi="Times New Roman" w:cs="Times New Roman"/>
+          <w:color w:val="000000" w:themeColor="text1"/>
+          <w:sz w:val="26"/>
+        </w:rPr>
+      </w:pPr>
       <w:r>
         <w:rPr>
           <w:rFonts w:ascii="Times New Roman" w:eastAsia="Times New Roman" w:hAnsi="Times New Roman" w:cs="Times New Roman"/>
@@ -1883,549 +1895,506 @@
         </w:rPr>
         <w:t>}</w:t>
       </w:r>
+      <w:r>
+        <w:rPr>
+          <w:rFonts w:ascii="Times New Roman" w:eastAsia="Times New Roman" w:hAnsi="Times New Roman" w:cs="Times New Roman"/>
+          <w:color w:val="000000" w:themeColor="text1"/>
+          <w:sz w:val="26"/>
+          <w:szCs w:val="26"/>
+          <w:lang w:val="vi-VN"/>
+        </w:rPr>
+        <w:t xml:space="preserve">. </w:t>
+      </w:r>
+      <w:proofErr w:type="spellStart"/>
+      <w:r>
+        <w:rPr>
+          <w:rFonts w:ascii="Times New Roman" w:eastAsia="Times New Roman" w:hAnsi="Times New Roman" w:cs="Times New Roman"/>
+          <w:color w:val="000000"/>
+          <w:sz w:val="26"/>
+          <w:szCs w:val="26"/>
+        </w:rPr>
+        <w:t>Mưa</w:t>
+      </w:r>
+      <w:proofErr w:type="spellEnd"/>
+      <w:r>
+        <w:rPr>
+          <w:rFonts w:ascii="Times New Roman" w:eastAsia="Times New Roman" w:hAnsi="Times New Roman" w:cs="Times New Roman"/>
+          <w:color w:val="000000"/>
+          <w:sz w:val="26"/>
+          <w:szCs w:val="26"/>
+        </w:rPr>
+        <w:t xml:space="preserve"> </w:t>
+      </w:r>
+      <w:proofErr w:type="spellStart"/>
+      <w:r>
+        <w:rPr>
+          <w:rFonts w:ascii="Times New Roman" w:eastAsia="Times New Roman" w:hAnsi="Times New Roman" w:cs="Times New Roman"/>
+          <w:color w:val="000000"/>
+          <w:sz w:val="26"/>
+          <w:szCs w:val="26"/>
+        </w:rPr>
+        <w:t>dông</w:t>
+      </w:r>
+      <w:proofErr w:type="spellEnd"/>
+      <w:r>
+        <w:rPr>
+          <w:rFonts w:ascii="Times New Roman" w:eastAsia="Times New Roman" w:hAnsi="Times New Roman" w:cs="Times New Roman"/>
+          <w:color w:val="000000"/>
+          <w:sz w:val="26"/>
+          <w:szCs w:val="26"/>
+        </w:rPr>
+        <w:t xml:space="preserve"> </w:t>
+      </w:r>
+      <w:proofErr w:type="spellStart"/>
+      <w:r>
+        <w:rPr>
+          <w:rFonts w:ascii="Times New Roman" w:eastAsia="Times New Roman" w:hAnsi="Times New Roman" w:cs="Times New Roman"/>
+          <w:color w:val="000000"/>
+          <w:sz w:val="26"/>
+          <w:szCs w:val="26"/>
+        </w:rPr>
+        <w:t>xảy</w:t>
+      </w:r>
+      <w:proofErr w:type="spellEnd"/>
+      <w:r>
+        <w:rPr>
+          <w:rFonts w:ascii="Times New Roman" w:eastAsia="Times New Roman" w:hAnsi="Times New Roman" w:cs="Times New Roman"/>
+          <w:color w:val="000000"/>
+          <w:sz w:val="26"/>
+          <w:szCs w:val="26"/>
+        </w:rPr>
+        <w:t xml:space="preserve"> </w:t>
+      </w:r>
+      <w:proofErr w:type="spellStart"/>
+      <w:r>
+        <w:rPr>
+          <w:rFonts w:ascii="Times New Roman" w:eastAsia="Times New Roman" w:hAnsi="Times New Roman" w:cs="Times New Roman"/>
+          <w:color w:val="000000"/>
+          <w:sz w:val="26"/>
+          <w:szCs w:val="26"/>
+        </w:rPr>
+        <w:t>ra</w:t>
+      </w:r>
+      <w:proofErr w:type="spellEnd"/>
+      <w:r>
+        <w:rPr>
+          <w:rFonts w:ascii="Times New Roman" w:eastAsia="Times New Roman" w:hAnsi="Times New Roman" w:cs="Times New Roman"/>
+          <w:color w:val="000000"/>
+          <w:sz w:val="26"/>
+          <w:szCs w:val="26"/>
+        </w:rPr>
+        <w:t xml:space="preserve"> </w:t>
+      </w:r>
+      <w:proofErr w:type="spellStart"/>
+      <w:r>
+        <w:rPr>
+          <w:rFonts w:ascii="Times New Roman" w:eastAsia="Times New Roman" w:hAnsi="Times New Roman" w:cs="Times New Roman"/>
+          <w:color w:val="000000"/>
+          <w:sz w:val="26"/>
+          <w:szCs w:val="26"/>
+        </w:rPr>
+        <w:t>với</w:t>
+      </w:r>
+      <w:proofErr w:type="spellEnd"/>
+      <w:r>
+        <w:rPr>
+          <w:rFonts w:ascii="Times New Roman" w:eastAsia="Times New Roman" w:hAnsi="Times New Roman" w:cs="Times New Roman"/>
+          <w:color w:val="000000"/>
+          <w:sz w:val="26"/>
+          <w:szCs w:val="26"/>
+        </w:rPr>
+        <w:t xml:space="preserve"> </w:t>
+      </w:r>
+      <w:proofErr w:type="spellStart"/>
+      <w:r>
+        <w:rPr>
+          <w:rFonts w:ascii="Times New Roman" w:eastAsia="Times New Roman" w:hAnsi="Times New Roman" w:cs="Times New Roman"/>
+          <w:color w:val="000000"/>
+          <w:sz w:val="26"/>
+          <w:szCs w:val="26"/>
+        </w:rPr>
+        <w:t>lượng</w:t>
+      </w:r>
+      <w:proofErr w:type="spellEnd"/>
+      <w:r>
+        <w:rPr>
+          <w:rFonts w:ascii="Times New Roman" w:eastAsia="Times New Roman" w:hAnsi="Times New Roman" w:cs="Times New Roman"/>
+          <w:color w:val="000000"/>
+          <w:sz w:val="26"/>
+          <w:szCs w:val="26"/>
+        </w:rPr>
+        <w:t xml:space="preserve"> </w:t>
+      </w:r>
+      <w:proofErr w:type="spellStart"/>
+      <w:r>
+        <w:rPr>
+          <w:rFonts w:ascii="Times New Roman" w:eastAsia="Times New Roman" w:hAnsi="Times New Roman" w:cs="Times New Roman"/>
+          <w:color w:val="000000"/>
+          <w:sz w:val="26"/>
+          <w:szCs w:val="26"/>
+        </w:rPr>
+        <w:t>mưa</w:t>
+      </w:r>
+      <w:proofErr w:type="spellEnd"/>
+      <w:r>
+        <w:rPr>
+          <w:rFonts w:ascii="Times New Roman" w:eastAsia="Times New Roman" w:hAnsi="Times New Roman" w:cs="Times New Roman"/>
+          <w:color w:val="000000"/>
+          <w:sz w:val="26"/>
+          <w:szCs w:val="26"/>
+        </w:rPr>
+        <w:t xml:space="preserve"> </w:t>
+      </w:r>
+      <w:proofErr w:type="spellStart"/>
+      <w:r>
+        <w:rPr>
+          <w:rFonts w:ascii="Times New Roman" w:eastAsia="Times New Roman" w:hAnsi="Times New Roman" w:cs="Times New Roman"/>
+          <w:color w:val="000000"/>
+          <w:sz w:val="26"/>
+          <w:szCs w:val="26"/>
+        </w:rPr>
+        <w:t>đo</w:t>
+      </w:r>
+      <w:proofErr w:type="spellEnd"/>
+      <w:r>
+        <w:rPr>
+          <w:rFonts w:ascii="Times New Roman" w:eastAsia="Times New Roman" w:hAnsi="Times New Roman" w:cs="Times New Roman"/>
+          <w:color w:val="000000"/>
+          <w:sz w:val="26"/>
+          <w:szCs w:val="26"/>
+        </w:rPr>
+        <w:t xml:space="preserve"> </w:t>
+      </w:r>
+      <w:proofErr w:type="spellStart"/>
+      <w:r>
+        <w:rPr>
+          <w:rFonts w:ascii="Times New Roman" w:eastAsia="Times New Roman" w:hAnsi="Times New Roman" w:cs="Times New Roman"/>
+          <w:color w:val="000000"/>
+          <w:sz w:val="26"/>
+          <w:szCs w:val="26"/>
+        </w:rPr>
+        <w:t>được</w:t>
+      </w:r>
+      <w:proofErr w:type="spellEnd"/>
+      <w:r>
+        <w:rPr>
+          <w:rFonts w:ascii="Times New Roman" w:eastAsia="Times New Roman" w:hAnsi="Times New Roman" w:cs="Times New Roman"/>
+          <w:color w:val="000000"/>
+          <w:sz w:val="26"/>
+          <w:szCs w:val="26"/>
+        </w:rPr>
+        <w:t xml:space="preserve"> </w:t>
+      </w:r>
+      <w:proofErr w:type="spellStart"/>
+      <w:r>
+        <w:rPr>
+          <w:rFonts w:ascii="Times New Roman" w:eastAsia="Times New Roman" w:hAnsi="Times New Roman" w:cs="Times New Roman"/>
+          <w:color w:val="000000"/>
+          <w:sz w:val="26"/>
+          <w:szCs w:val="26"/>
+        </w:rPr>
+        <w:t>đến</w:t>
+      </w:r>
+      <w:proofErr w:type="spellEnd"/>
+      <w:r>
+        <w:rPr>
+          <w:rFonts w:ascii="Times New Roman" w:eastAsia="Times New Roman" w:hAnsi="Times New Roman" w:cs="Times New Roman"/>
+          <w:color w:val="000000"/>
+          <w:sz w:val="26"/>
+          <w:szCs w:val="26"/>
+        </w:rPr>
+        <w:t xml:space="preserve"> </w:t>
+      </w:r>
+      <w:proofErr w:type="spellStart"/>
+      <w:r>
+        <w:rPr>
+          <w:rFonts w:ascii="Times New Roman" w:eastAsia="Times New Roman" w:hAnsi="Times New Roman" w:cs="Times New Roman"/>
+          <w:color w:val="000000"/>
+          <w:sz w:val="26"/>
+          <w:szCs w:val="26"/>
+        </w:rPr>
+        <w:t>thời</w:t>
+      </w:r>
+      <w:proofErr w:type="spellEnd"/>
+      <w:r>
+        <w:rPr>
+          <w:rFonts w:ascii="Times New Roman" w:eastAsia="Times New Roman" w:hAnsi="Times New Roman" w:cs="Times New Roman"/>
+          <w:color w:val="000000"/>
+          <w:sz w:val="26"/>
+          <w:szCs w:val="26"/>
+        </w:rPr>
+        <w:t xml:space="preserve"> </w:t>
+      </w:r>
+      <w:proofErr w:type="spellStart"/>
+      <w:r>
+        <w:rPr>
+          <w:rFonts w:ascii="Times New Roman" w:eastAsia="Times New Roman" w:hAnsi="Times New Roman" w:cs="Times New Roman"/>
+          <w:color w:val="000000"/>
+          <w:sz w:val="26"/>
+          <w:szCs w:val="26"/>
+        </w:rPr>
+        <w:t>điểm</w:t>
+      </w:r>
+      <w:proofErr w:type="spellEnd"/>
+      <w:r>
+        <w:rPr>
+          <w:rFonts w:ascii="Times New Roman" w:eastAsia="Times New Roman" w:hAnsi="Times New Roman" w:cs="Times New Roman"/>
+          <w:color w:val="000000"/>
+          <w:sz w:val="26"/>
+          <w:szCs w:val="26"/>
+        </w:rPr>
+        <w:t xml:space="preserve"> </w:t>
+      </w:r>
+      <w:r>
+        <w:rPr>
+          <w:rFonts w:ascii="Times New Roman" w:eastAsia="Times New Roman" w:hAnsi="Times New Roman" w:cs="Times New Roman"/>
+          <w:color w:val="000000"/>
+          <w:sz w:val="26"/>
+          <w:szCs w:val="26"/>
+        </w:rPr>
+        <w:t>{</w:t>
+      </w:r>
+      <w:proofErr w:type="spellStart"/>
+      <w:r>
+        <w:rPr>
+          <w:rFonts w:ascii="Times New Roman" w:eastAsia="Times New Roman" w:hAnsi="Times New Roman" w:cs="Times New Roman"/>
+          <w:color w:val="000000"/>
+          <w:sz w:val="26"/>
+          <w:szCs w:val="26"/>
+        </w:rPr>
+        <w:t>hh</w:t>
+      </w:r>
+      <w:proofErr w:type="spellEnd"/>
+      <w:r>
+        <w:rPr>
+          <w:rFonts w:ascii="Times New Roman" w:eastAsia="Times New Roman" w:hAnsi="Times New Roman" w:cs="Times New Roman"/>
+          <w:color w:val="000000"/>
+          <w:sz w:val="26"/>
+          <w:szCs w:val="26"/>
+        </w:rPr>
+        <w:t>}</w:t>
+      </w:r>
+      <w:r>
+        <w:rPr>
+          <w:rFonts w:ascii="Times New Roman" w:eastAsia="Times New Roman" w:hAnsi="Times New Roman" w:cs="Times New Roman"/>
+          <w:color w:val="000000"/>
+          <w:sz w:val="26"/>
+          <w:szCs w:val="26"/>
+        </w:rPr>
+        <w:t xml:space="preserve"> </w:t>
+      </w:r>
+      <w:proofErr w:type="spellStart"/>
+      <w:r>
+        <w:rPr>
+          <w:rFonts w:ascii="Times New Roman" w:eastAsia="Times New Roman" w:hAnsi="Times New Roman" w:cs="Times New Roman"/>
+          <w:color w:val="000000"/>
+          <w:sz w:val="26"/>
+          <w:szCs w:val="26"/>
+        </w:rPr>
+        <w:t>ngày</w:t>
+      </w:r>
+      <w:proofErr w:type="spellEnd"/>
+      <w:r>
+        <w:rPr>
+          <w:rFonts w:ascii="Times New Roman" w:eastAsia="Times New Roman" w:hAnsi="Times New Roman" w:cs="Times New Roman"/>
+          <w:color w:val="000000"/>
+          <w:sz w:val="26"/>
+          <w:szCs w:val="26"/>
+        </w:rPr>
+        <w:t xml:space="preserve"> </w:t>
+      </w:r>
+      <w:r>
+        <w:rPr>
+          <w:rFonts w:ascii="Times New Roman" w:hAnsi="Times New Roman" w:cs="Times New Roman"/>
+          <w:sz w:val="26"/>
+          <w:szCs w:val="26"/>
+        </w:rPr>
+        <w:t>{dd}/{mm}/{</w:t>
+      </w:r>
+      <w:proofErr w:type="spellStart"/>
+      <w:r>
+        <w:rPr>
+          <w:rFonts w:ascii="Times New Roman" w:hAnsi="Times New Roman" w:cs="Times New Roman"/>
+          <w:sz w:val="26"/>
+          <w:szCs w:val="26"/>
+        </w:rPr>
+        <w:t>yyyy</w:t>
+      </w:r>
+      <w:proofErr w:type="spellEnd"/>
+      <w:r>
+        <w:rPr>
+          <w:rFonts w:ascii="Times New Roman" w:hAnsi="Times New Roman" w:cs="Times New Roman"/>
+          <w:sz w:val="26"/>
+          <w:szCs w:val="26"/>
+        </w:rPr>
+        <w:t>}</w:t>
+      </w:r>
+      <w:r>
+        <w:rPr>
+          <w:rFonts w:ascii="Times New Roman" w:hAnsi="Times New Roman" w:cs="Times New Roman"/>
+          <w:sz w:val="26"/>
+          <w:szCs w:val="26"/>
+          <w:lang w:val="vi-VN"/>
+        </w:rPr>
+        <w:t xml:space="preserve"> </w:t>
+      </w:r>
+      <w:r>
+        <w:rPr>
+          <w:rFonts w:ascii="Times New Roman" w:eastAsia="Times New Roman" w:hAnsi="Times New Roman" w:cs="Times New Roman"/>
+          <w:color w:val="000000"/>
+          <w:sz w:val="26"/>
+          <w:szCs w:val="26"/>
+        </w:rPr>
+        <w:t xml:space="preserve">chi </w:t>
+      </w:r>
+      <w:proofErr w:type="spellStart"/>
+      <w:r>
+        <w:rPr>
+          <w:rFonts w:ascii="Times New Roman" w:eastAsia="Times New Roman" w:hAnsi="Times New Roman" w:cs="Times New Roman"/>
+          <w:color w:val="000000"/>
+          <w:sz w:val="26"/>
+          <w:szCs w:val="26"/>
+        </w:rPr>
+        <w:t>tiết</w:t>
+      </w:r>
+      <w:proofErr w:type="spellEnd"/>
+      <w:r>
+        <w:rPr>
+          <w:rFonts w:ascii="Times New Roman" w:eastAsia="Times New Roman" w:hAnsi="Times New Roman" w:cs="Times New Roman"/>
+          <w:color w:val="000000"/>
+          <w:sz w:val="26"/>
+          <w:szCs w:val="26"/>
+        </w:rPr>
+        <w:t xml:space="preserve"> </w:t>
+      </w:r>
+      <w:proofErr w:type="spellStart"/>
+      <w:r>
+        <w:rPr>
+          <w:rFonts w:ascii="Times New Roman" w:eastAsia="Times New Roman" w:hAnsi="Times New Roman" w:cs="Times New Roman"/>
+          <w:color w:val="000000"/>
+          <w:sz w:val="26"/>
+          <w:szCs w:val="26"/>
+        </w:rPr>
+        <w:t>tại</w:t>
+      </w:r>
+      <w:proofErr w:type="spellEnd"/>
+      <w:r>
+        <w:rPr>
+          <w:rFonts w:ascii="Times New Roman" w:eastAsia="Times New Roman" w:hAnsi="Times New Roman" w:cs="Times New Roman"/>
+          <w:color w:val="000000"/>
+          <w:sz w:val="26"/>
+          <w:szCs w:val="26"/>
+        </w:rPr>
+        <w:t xml:space="preserve"> </w:t>
+      </w:r>
+      <w:proofErr w:type="spellStart"/>
+      <w:r>
+        <w:rPr>
+          <w:rFonts w:ascii="Times New Roman" w:eastAsia="Times New Roman" w:hAnsi="Times New Roman" w:cs="Times New Roman"/>
+          <w:color w:val="000000"/>
+          <w:sz w:val="26"/>
+          <w:szCs w:val="26"/>
+        </w:rPr>
+        <w:t>phụ</w:t>
+      </w:r>
+      <w:proofErr w:type="spellEnd"/>
+      <w:r>
+        <w:rPr>
+          <w:rFonts w:ascii="Times New Roman" w:eastAsia="Times New Roman" w:hAnsi="Times New Roman" w:cs="Times New Roman"/>
+          <w:color w:val="000000"/>
+          <w:sz w:val="26"/>
+          <w:szCs w:val="26"/>
+        </w:rPr>
+        <w:t xml:space="preserve"> </w:t>
+      </w:r>
+      <w:proofErr w:type="spellStart"/>
+      <w:r>
+        <w:rPr>
+          <w:rFonts w:ascii="Times New Roman" w:eastAsia="Times New Roman" w:hAnsi="Times New Roman" w:cs="Times New Roman"/>
+          <w:color w:val="000000"/>
+          <w:sz w:val="26"/>
+          <w:szCs w:val="26"/>
+        </w:rPr>
+        <w:t>lục</w:t>
+      </w:r>
+      <w:proofErr w:type="spellEnd"/>
+      <w:r>
+        <w:rPr>
+          <w:rFonts w:ascii="Times New Roman" w:eastAsia="Times New Roman" w:hAnsi="Times New Roman" w:cs="Times New Roman"/>
+          <w:color w:val="000000"/>
+          <w:sz w:val="26"/>
+          <w:szCs w:val="26"/>
+        </w:rPr>
+        <w:t xml:space="preserve"> 01</w:t>
+      </w:r>
+      <w:r>
+        <w:rPr>
+          <w:rFonts w:ascii="Times New Roman" w:eastAsia="Times New Roman" w:hAnsi="Times New Roman" w:cs="Times New Roman"/>
+          <w:color w:val="000000"/>
+          <w:sz w:val="26"/>
+          <w:szCs w:val="26"/>
+        </w:rPr>
+        <w:t>, 02</w:t>
+      </w:r>
+      <w:r>
+        <w:rPr>
+          <w:rFonts w:ascii="Times New Roman" w:eastAsia="Times New Roman" w:hAnsi="Times New Roman" w:cs="Times New Roman"/>
+          <w:color w:val="000000"/>
+          <w:sz w:val="26"/>
+          <w:szCs w:val="26"/>
+        </w:rPr>
+        <w:t xml:space="preserve"> </w:t>
+      </w:r>
+      <w:proofErr w:type="spellStart"/>
+      <w:r>
+        <w:rPr>
+          <w:rFonts w:ascii="Times New Roman" w:eastAsia="Times New Roman" w:hAnsi="Times New Roman" w:cs="Times New Roman"/>
+          <w:color w:val="000000"/>
+          <w:sz w:val="26"/>
+          <w:szCs w:val="26"/>
+        </w:rPr>
+        <w:t>kèm</w:t>
+      </w:r>
+      <w:proofErr w:type="spellEnd"/>
+      <w:r>
+        <w:rPr>
+          <w:rFonts w:ascii="Times New Roman" w:eastAsia="Times New Roman" w:hAnsi="Times New Roman" w:cs="Times New Roman"/>
+          <w:color w:val="000000"/>
+          <w:sz w:val="26"/>
+          <w:szCs w:val="26"/>
+        </w:rPr>
+        <w:t xml:space="preserve"> </w:t>
+      </w:r>
+      <w:proofErr w:type="spellStart"/>
+      <w:r>
+        <w:rPr>
+          <w:rFonts w:ascii="Times New Roman" w:eastAsia="Times New Roman" w:hAnsi="Times New Roman" w:cs="Times New Roman"/>
+          <w:color w:val="000000"/>
+          <w:sz w:val="26"/>
+          <w:szCs w:val="26"/>
+        </w:rPr>
+        <w:t>theo.</w:t>
+      </w:r>
+      <w:proofErr w:type="spellEnd"/>
     </w:p>
     <w:p>
       <w:pPr>
         <w:pStyle w:val="ListParagraph"/>
-        <w:spacing w:before="60" w:after="60" w:line="320" w:lineRule="exact"/>
-        <w:ind w:left="360"/>
+        <w:spacing w:before="60" w:after="60" w:line="240" w:lineRule="auto"/>
         <w:jc w:val="both"/>
         <w:rPr>
-          <w:rFonts w:ascii="Times New Roman" w:eastAsia="Times New Roman" w:hAnsi="Times New Roman" w:cs="Times New Roman"/>
-          <w:sz w:val="26"/>
-          <w:szCs w:val="26"/>
-          <w:lang w:val="vi-VN"/>
+          <w:rFonts w:ascii="Times New Roman" w:hAnsi="Times New Roman" w:cs="Times New Roman"/>
+          <w:color w:val="000000" w:themeColor="text1"/>
+          <w:sz w:val="26"/>
         </w:rPr>
       </w:pPr>
-      <w:proofErr w:type="spellStart"/>
-      <w:r>
-        <w:rPr>
-          <w:rFonts w:ascii="Times New Roman" w:eastAsia="Times New Roman" w:hAnsi="Times New Roman" w:cs="Times New Roman"/>
-          <w:sz w:val="26"/>
-          <w:szCs w:val="26"/>
-        </w:rPr>
-        <w:t>Số</w:t>
-      </w:r>
-      <w:proofErr w:type="spellEnd"/>
-      <w:r>
-        <w:rPr>
-          <w:rFonts w:ascii="Times New Roman" w:eastAsia="Times New Roman" w:hAnsi="Times New Roman" w:cs="Times New Roman"/>
-          <w:sz w:val="26"/>
-          <w:szCs w:val="26"/>
-        </w:rPr>
-        <w:t xml:space="preserve"> </w:t>
-      </w:r>
-      <w:proofErr w:type="spellStart"/>
-      <w:r>
-        <w:rPr>
-          <w:rFonts w:ascii="Times New Roman" w:eastAsia="Times New Roman" w:hAnsi="Times New Roman" w:cs="Times New Roman"/>
-          <w:sz w:val="26"/>
-          <w:szCs w:val="26"/>
-        </w:rPr>
-        <w:t>liệu</w:t>
-      </w:r>
-      <w:proofErr w:type="spellEnd"/>
-      <w:r>
-        <w:rPr>
-          <w:rFonts w:ascii="Times New Roman" w:eastAsia="Times New Roman" w:hAnsi="Times New Roman" w:cs="Times New Roman"/>
-          <w:sz w:val="26"/>
-          <w:szCs w:val="26"/>
-        </w:rPr>
-        <w:t xml:space="preserve"> </w:t>
-      </w:r>
-      <w:proofErr w:type="spellStart"/>
-      <w:r>
-        <w:rPr>
-          <w:rFonts w:ascii="Times New Roman" w:eastAsia="Times New Roman" w:hAnsi="Times New Roman" w:cs="Times New Roman"/>
-          <w:sz w:val="26"/>
-          <w:szCs w:val="26"/>
-        </w:rPr>
-        <w:t>mưa</w:t>
-      </w:r>
-      <w:proofErr w:type="spellEnd"/>
-      <w:r>
-        <w:rPr>
-          <w:rFonts w:ascii="Times New Roman" w:eastAsia="Times New Roman" w:hAnsi="Times New Roman" w:cs="Times New Roman"/>
-          <w:sz w:val="26"/>
-          <w:szCs w:val="26"/>
-        </w:rPr>
-        <w:t xml:space="preserve"> </w:t>
-      </w:r>
-      <w:proofErr w:type="spellStart"/>
-      <w:r>
-        <w:rPr>
-          <w:rFonts w:ascii="Times New Roman" w:eastAsia="Times New Roman" w:hAnsi="Times New Roman" w:cs="Times New Roman"/>
-          <w:sz w:val="26"/>
-          <w:szCs w:val="26"/>
-        </w:rPr>
-        <w:t>các</w:t>
-      </w:r>
-      <w:proofErr w:type="spellEnd"/>
-      <w:r>
-        <w:rPr>
-          <w:rFonts w:ascii="Times New Roman" w:eastAsia="Times New Roman" w:hAnsi="Times New Roman" w:cs="Times New Roman"/>
-          <w:sz w:val="26"/>
-          <w:szCs w:val="26"/>
-        </w:rPr>
-        <w:t xml:space="preserve"> </w:t>
-      </w:r>
-      <w:proofErr w:type="spellStart"/>
-      <w:r>
-        <w:rPr>
-          <w:rFonts w:ascii="Times New Roman" w:eastAsia="Times New Roman" w:hAnsi="Times New Roman" w:cs="Times New Roman"/>
-          <w:sz w:val="26"/>
-          <w:szCs w:val="26"/>
-        </w:rPr>
-        <w:t>phường</w:t>
-      </w:r>
-      <w:proofErr w:type="spellEnd"/>
     </w:p>
-    <w:tbl>
-      <w:tblPr>
-        <w:tblStyle w:val="TableGrid"/>
-        <w:tblW w:w="0" w:type="auto"/>
-        <w:tblInd w:w="360" w:type="dxa"/>
-        <w:tblBorders>
-          <w:top w:val="none" w:sz="0" w:space="0" w:color="auto"/>
-          <w:left w:val="none" w:sz="0" w:space="0" w:color="auto"/>
-          <w:bottom w:val="none" w:sz="0" w:space="0" w:color="auto"/>
-          <w:right w:val="none" w:sz="0" w:space="0" w:color="auto"/>
-          <w:insideH w:val="none" w:sz="0" w:space="0" w:color="auto"/>
-          <w:insideV w:val="none" w:sz="0" w:space="0" w:color="auto"/>
-        </w:tblBorders>
-        <w:tblLook w:val="04A0" w:firstRow="1" w:lastRow="0" w:firstColumn="1" w:lastColumn="0" w:noHBand="0" w:noVBand="1"/>
-      </w:tblPr>
-      <w:tblGrid>
-        <w:gridCol w:w="4315"/>
-        <w:gridCol w:w="270"/>
-        <w:gridCol w:w="4259"/>
-      </w:tblGrid>
-      <w:tr>
-        <w:tc>
-          <w:tcPr>
-            <w:tcW w:w="4315" w:type="dxa"/>
-          </w:tcPr>
-          <w:p>
-            <w:pPr>
-              <w:pStyle w:val="ListParagraph"/>
-              <w:spacing w:before="60" w:after="60" w:line="320" w:lineRule="exact"/>
-              <w:ind w:left="0"/>
-              <w:jc w:val="both"/>
-              <w:rPr>
-                <w:rFonts w:ascii="Times New Roman" w:eastAsia="Times New Roman" w:hAnsi="Times New Roman" w:cs="Times New Roman"/>
-                <w:color w:val="000000" w:themeColor="text1"/>
-                <w:sz w:val="26"/>
-                <w:szCs w:val="26"/>
-                <w:lang w:val="vi-VN"/>
-              </w:rPr>
-            </w:pPr>
-            <w:r>
-              <w:rPr>
-                <w:rFonts w:ascii="Times New Roman" w:eastAsia="Times New Roman" w:hAnsi="Times New Roman" w:cs="Times New Roman"/>
-                <w:color w:val="000000" w:themeColor="text1"/>
-                <w:sz w:val="26"/>
-                <w:szCs w:val="26"/>
-                <w:lang w:val="vi-VN"/>
-              </w:rPr>
-              <w:t>{table</w:t>
-            </w:r>
-            <w:r>
-              <w:rPr>
-                <w:rFonts w:ascii="Times New Roman" w:eastAsia="Times New Roman" w:hAnsi="Times New Roman" w:cs="Times New Roman"/>
-                <w:color w:val="000000" w:themeColor="text1"/>
-                <w:sz w:val="26"/>
-                <w:szCs w:val="26"/>
-                <w:lang w:val="vi-VN"/>
-              </w:rPr>
-              <w:t>1</w:t>
-            </w:r>
-            <w:r>
-              <w:rPr>
-                <w:rFonts w:ascii="Times New Roman" w:eastAsia="Times New Roman" w:hAnsi="Times New Roman" w:cs="Times New Roman"/>
-                <w:color w:val="000000" w:themeColor="text1"/>
-                <w:sz w:val="26"/>
-                <w:szCs w:val="26"/>
-                <w:lang w:val="vi-VN"/>
-              </w:rPr>
-              <w:t>_mua_phuong}</w:t>
-            </w:r>
-          </w:p>
-        </w:tc>
-        <w:tc>
-          <w:tcPr>
-            <w:tcW w:w="270" w:type="dxa"/>
-          </w:tcPr>
-          <w:p>
-            <w:pPr>
-              <w:pStyle w:val="ListParagraph"/>
-              <w:spacing w:before="60" w:after="60" w:line="320" w:lineRule="exact"/>
-              <w:ind w:left="0"/>
-              <w:jc w:val="both"/>
-              <w:rPr>
-                <w:rFonts w:ascii="Times New Roman" w:eastAsia="Times New Roman" w:hAnsi="Times New Roman" w:cs="Times New Roman"/>
-                <w:color w:val="000000" w:themeColor="text1"/>
-                <w:sz w:val="26"/>
-                <w:szCs w:val="26"/>
-                <w:lang w:val="vi-VN"/>
-              </w:rPr>
-            </w:pPr>
-          </w:p>
-        </w:tc>
-        <w:tc>
-          <w:tcPr>
-            <w:tcW w:w="4259" w:type="dxa"/>
-          </w:tcPr>
-          <w:p>
-            <w:pPr>
-              <w:pStyle w:val="ListParagraph"/>
-              <w:spacing w:before="60" w:after="60" w:line="320" w:lineRule="exact"/>
-              <w:ind w:left="0"/>
-              <w:jc w:val="both"/>
-              <w:rPr>
-                <w:rFonts w:ascii="Times New Roman" w:eastAsia="Times New Roman" w:hAnsi="Times New Roman" w:cs="Times New Roman"/>
-                <w:color w:val="000000" w:themeColor="text1"/>
-                <w:sz w:val="26"/>
-                <w:szCs w:val="26"/>
-                <w:lang w:val="vi-VN"/>
-              </w:rPr>
-            </w:pPr>
-            <w:r>
-              <w:rPr>
-                <w:rFonts w:ascii="Times New Roman" w:eastAsia="Times New Roman" w:hAnsi="Times New Roman" w:cs="Times New Roman"/>
-                <w:color w:val="000000" w:themeColor="text1"/>
-                <w:sz w:val="26"/>
-                <w:szCs w:val="26"/>
-                <w:lang w:val="vi-VN"/>
-              </w:rPr>
-              <w:t>{table</w:t>
-            </w:r>
-            <w:r>
-              <w:rPr>
-                <w:rFonts w:ascii="Times New Roman" w:eastAsia="Times New Roman" w:hAnsi="Times New Roman" w:cs="Times New Roman"/>
-                <w:color w:val="000000" w:themeColor="text1"/>
-                <w:sz w:val="26"/>
-                <w:szCs w:val="26"/>
-                <w:lang w:val="vi-VN"/>
-              </w:rPr>
-              <w:t>2</w:t>
-            </w:r>
-            <w:r>
-              <w:rPr>
-                <w:rFonts w:ascii="Times New Roman" w:eastAsia="Times New Roman" w:hAnsi="Times New Roman" w:cs="Times New Roman"/>
-                <w:color w:val="000000" w:themeColor="text1"/>
-                <w:sz w:val="26"/>
-                <w:szCs w:val="26"/>
-                <w:lang w:val="vi-VN"/>
-              </w:rPr>
-              <w:t>_mua_phuong}</w:t>
-            </w:r>
-          </w:p>
-        </w:tc>
-      </w:tr>
-    </w:tbl>
-    <w:p>
-      <w:pPr>
-        <w:spacing w:before="60" w:after="60" w:line="320" w:lineRule="exact"/>
-        <w:jc w:val="both"/>
-        <w:rPr>
-          <w:rFonts w:ascii="Times New Roman" w:eastAsia="Times New Roman" w:hAnsi="Times New Roman" w:cs="Times New Roman"/>
-          <w:color w:val="000000" w:themeColor="text1"/>
-          <w:sz w:val="26"/>
-          <w:szCs w:val="26"/>
-          <w:lang w:val="vi-VN"/>
-        </w:rPr>
-      </w:pPr>
-      <w:r>
-        <w:rPr>
-          <w:rFonts w:ascii="Times New Roman" w:eastAsia="Times New Roman" w:hAnsi="Times New Roman" w:cs="Times New Roman"/>
-          <w:color w:val="000000" w:themeColor="text1"/>
-          <w:sz w:val="26"/>
-          <w:szCs w:val="26"/>
-          <w:lang w:val="vi-VN"/>
-        </w:rPr>
-        <w:t xml:space="preserve">     </w:t>
-      </w:r>
-      <w:proofErr w:type="spellStart"/>
-      <w:r>
-        <w:rPr>
-          <w:rFonts w:ascii="Times New Roman" w:eastAsia="Times New Roman" w:hAnsi="Times New Roman" w:cs="Times New Roman"/>
-          <w:color w:val="000000" w:themeColor="text1"/>
-          <w:sz w:val="26"/>
-          <w:szCs w:val="26"/>
-        </w:rPr>
-        <w:t>Số</w:t>
-      </w:r>
-      <w:proofErr w:type="spellEnd"/>
-      <w:r>
-        <w:rPr>
-          <w:rFonts w:ascii="Times New Roman" w:eastAsia="Times New Roman" w:hAnsi="Times New Roman" w:cs="Times New Roman"/>
-          <w:color w:val="000000" w:themeColor="text1"/>
-          <w:sz w:val="26"/>
-          <w:szCs w:val="26"/>
-        </w:rPr>
-        <w:t xml:space="preserve"> </w:t>
-      </w:r>
-      <w:proofErr w:type="spellStart"/>
-      <w:r>
-        <w:rPr>
-          <w:rFonts w:ascii="Times New Roman" w:eastAsia="Times New Roman" w:hAnsi="Times New Roman" w:cs="Times New Roman"/>
-          <w:color w:val="000000" w:themeColor="text1"/>
-          <w:sz w:val="26"/>
-          <w:szCs w:val="26"/>
-        </w:rPr>
-        <w:t>liệu</w:t>
-      </w:r>
-      <w:proofErr w:type="spellEnd"/>
-      <w:r>
-        <w:rPr>
-          <w:rFonts w:ascii="Times New Roman" w:eastAsia="Times New Roman" w:hAnsi="Times New Roman" w:cs="Times New Roman"/>
-          <w:color w:val="000000" w:themeColor="text1"/>
-          <w:sz w:val="26"/>
-          <w:szCs w:val="26"/>
-        </w:rPr>
-        <w:t xml:space="preserve"> </w:t>
-      </w:r>
-      <w:proofErr w:type="spellStart"/>
-      <w:r>
-        <w:rPr>
-          <w:rFonts w:ascii="Times New Roman" w:eastAsia="Times New Roman" w:hAnsi="Times New Roman" w:cs="Times New Roman"/>
-          <w:color w:val="000000" w:themeColor="text1"/>
-          <w:sz w:val="26"/>
-          <w:szCs w:val="26"/>
-        </w:rPr>
-        <w:t>mưa</w:t>
-      </w:r>
-      <w:proofErr w:type="spellEnd"/>
-      <w:r>
-        <w:rPr>
-          <w:rFonts w:ascii="Times New Roman" w:eastAsia="Times New Roman" w:hAnsi="Times New Roman" w:cs="Times New Roman"/>
-          <w:color w:val="000000" w:themeColor="text1"/>
-          <w:sz w:val="26"/>
-          <w:szCs w:val="26"/>
-        </w:rPr>
-        <w:t xml:space="preserve"> </w:t>
-      </w:r>
-      <w:proofErr w:type="spellStart"/>
-      <w:r>
-        <w:rPr>
-          <w:rFonts w:ascii="Times New Roman" w:eastAsia="Times New Roman" w:hAnsi="Times New Roman" w:cs="Times New Roman"/>
-          <w:color w:val="000000" w:themeColor="text1"/>
-          <w:sz w:val="26"/>
-          <w:szCs w:val="26"/>
-        </w:rPr>
-        <w:t>các</w:t>
-      </w:r>
-      <w:proofErr w:type="spellEnd"/>
-      <w:r>
-        <w:rPr>
-          <w:rFonts w:ascii="Times New Roman" w:eastAsia="Times New Roman" w:hAnsi="Times New Roman" w:cs="Times New Roman"/>
-          <w:color w:val="000000" w:themeColor="text1"/>
-          <w:sz w:val="26"/>
-          <w:szCs w:val="26"/>
-        </w:rPr>
-        <w:t xml:space="preserve"> </w:t>
-      </w:r>
-      <w:proofErr w:type="spellStart"/>
-      <w:r>
-        <w:rPr>
-          <w:rFonts w:ascii="Times New Roman" w:eastAsia="Times New Roman" w:hAnsi="Times New Roman" w:cs="Times New Roman"/>
-          <w:color w:val="000000" w:themeColor="text1"/>
-          <w:sz w:val="26"/>
-          <w:szCs w:val="26"/>
-        </w:rPr>
-        <w:t>xã</w:t>
-      </w:r>
-      <w:proofErr w:type="spellEnd"/>
-    </w:p>
-    <w:tbl>
-      <w:tblPr>
-        <w:tblStyle w:val="TableGrid"/>
-        <w:tblW w:w="0" w:type="auto"/>
-        <w:tblInd w:w="360" w:type="dxa"/>
-        <w:tblBorders>
-          <w:top w:val="none" w:sz="0" w:space="0" w:color="auto"/>
-          <w:left w:val="none" w:sz="0" w:space="0" w:color="auto"/>
-          <w:bottom w:val="none" w:sz="0" w:space="0" w:color="auto"/>
-          <w:right w:val="none" w:sz="0" w:space="0" w:color="auto"/>
-          <w:insideH w:val="none" w:sz="0" w:space="0" w:color="auto"/>
-          <w:insideV w:val="none" w:sz="0" w:space="0" w:color="auto"/>
-        </w:tblBorders>
-        <w:tblLook w:val="04A0" w:firstRow="1" w:lastRow="0" w:firstColumn="1" w:lastColumn="0" w:noHBand="0" w:noVBand="1"/>
-      </w:tblPr>
-      <w:tblGrid>
-        <w:gridCol w:w="4315"/>
-        <w:gridCol w:w="270"/>
-        <w:gridCol w:w="4259"/>
-      </w:tblGrid>
-      <w:tr>
-        <w:tc>
-          <w:tcPr>
-            <w:tcW w:w="4315" w:type="dxa"/>
-          </w:tcPr>
-          <w:p>
-            <w:pPr>
-              <w:pStyle w:val="ListParagraph"/>
-              <w:spacing w:before="60" w:after="60" w:line="320" w:lineRule="exact"/>
-              <w:ind w:left="0"/>
-              <w:jc w:val="both"/>
-              <w:rPr>
-                <w:rFonts w:ascii="Times New Roman" w:eastAsia="Times New Roman" w:hAnsi="Times New Roman" w:cs="Times New Roman"/>
-                <w:color w:val="000000" w:themeColor="text1"/>
-                <w:sz w:val="26"/>
-                <w:szCs w:val="26"/>
-                <w:lang w:val="vi-VN"/>
-              </w:rPr>
-            </w:pPr>
-            <w:r>
-              <w:rPr>
-                <w:rFonts w:ascii="Times New Roman" w:eastAsia="Times New Roman" w:hAnsi="Times New Roman" w:cs="Times New Roman"/>
-                <w:color w:val="000000" w:themeColor="text1"/>
-                <w:sz w:val="26"/>
-                <w:szCs w:val="26"/>
-                <w:lang w:val="vi-VN"/>
-              </w:rPr>
-              <w:t>{table</w:t>
-            </w:r>
-            <w:r>
-              <w:rPr>
-                <w:rFonts w:ascii="Times New Roman" w:eastAsia="Times New Roman" w:hAnsi="Times New Roman" w:cs="Times New Roman"/>
-                <w:color w:val="000000" w:themeColor="text1"/>
-                <w:sz w:val="26"/>
-                <w:szCs w:val="26"/>
-                <w:lang w:val="vi-VN"/>
-              </w:rPr>
-              <w:t>1</w:t>
-            </w:r>
-            <w:r>
-              <w:rPr>
-                <w:rFonts w:ascii="Times New Roman" w:eastAsia="Times New Roman" w:hAnsi="Times New Roman" w:cs="Times New Roman"/>
-                <w:color w:val="000000" w:themeColor="text1"/>
-                <w:sz w:val="26"/>
-                <w:szCs w:val="26"/>
-                <w:lang w:val="vi-VN"/>
-              </w:rPr>
-              <w:t>_mua_</w:t>
-            </w:r>
-            <w:r>
-              <w:rPr>
-                <w:rFonts w:ascii="Times New Roman" w:eastAsia="Times New Roman" w:hAnsi="Times New Roman" w:cs="Times New Roman"/>
-                <w:color w:val="000000" w:themeColor="text1"/>
-                <w:sz w:val="26"/>
-                <w:szCs w:val="26"/>
-                <w:lang w:val="vi-VN"/>
-              </w:rPr>
-              <w:t>xa</w:t>
-            </w:r>
-            <w:r>
-              <w:rPr>
-                <w:rFonts w:ascii="Times New Roman" w:eastAsia="Times New Roman" w:hAnsi="Times New Roman" w:cs="Times New Roman"/>
-                <w:color w:val="000000" w:themeColor="text1"/>
-                <w:sz w:val="26"/>
-                <w:szCs w:val="26"/>
-                <w:lang w:val="vi-VN"/>
-              </w:rPr>
-              <w:t>}</w:t>
-            </w:r>
-          </w:p>
-        </w:tc>
-        <w:tc>
-          <w:tcPr>
-            <w:tcW w:w="270" w:type="dxa"/>
-          </w:tcPr>
-          <w:p>
-            <w:pPr>
-              <w:pStyle w:val="ListParagraph"/>
-              <w:spacing w:before="60" w:after="60" w:line="320" w:lineRule="exact"/>
-              <w:ind w:left="0"/>
-              <w:jc w:val="both"/>
-              <w:rPr>
-                <w:rFonts w:ascii="Times New Roman" w:eastAsia="Times New Roman" w:hAnsi="Times New Roman" w:cs="Times New Roman"/>
-                <w:color w:val="000000" w:themeColor="text1"/>
-                <w:sz w:val="26"/>
-                <w:szCs w:val="26"/>
-                <w:lang w:val="vi-VN"/>
-              </w:rPr>
-            </w:pPr>
-          </w:p>
-        </w:tc>
-        <w:tc>
-          <w:tcPr>
-            <w:tcW w:w="4259" w:type="dxa"/>
-          </w:tcPr>
-          <w:p>
-            <w:pPr>
-              <w:pStyle w:val="ListParagraph"/>
-              <w:spacing w:before="60" w:after="60" w:line="320" w:lineRule="exact"/>
-              <w:ind w:left="0"/>
-              <w:jc w:val="both"/>
-              <w:rPr>
-                <w:rFonts w:ascii="Times New Roman" w:eastAsia="Times New Roman" w:hAnsi="Times New Roman" w:cs="Times New Roman"/>
-                <w:color w:val="000000" w:themeColor="text1"/>
-                <w:sz w:val="26"/>
-                <w:szCs w:val="26"/>
-                <w:lang w:val="vi-VN"/>
-              </w:rPr>
-            </w:pPr>
-            <w:r>
-              <w:rPr>
-                <w:rFonts w:ascii="Times New Roman" w:eastAsia="Times New Roman" w:hAnsi="Times New Roman" w:cs="Times New Roman"/>
-                <w:color w:val="000000" w:themeColor="text1"/>
-                <w:sz w:val="26"/>
-                <w:szCs w:val="26"/>
-                <w:lang w:val="vi-VN"/>
-              </w:rPr>
-              <w:t>{table</w:t>
-            </w:r>
-            <w:r>
-              <w:rPr>
-                <w:rFonts w:ascii="Times New Roman" w:eastAsia="Times New Roman" w:hAnsi="Times New Roman" w:cs="Times New Roman"/>
-                <w:color w:val="000000" w:themeColor="text1"/>
-                <w:sz w:val="26"/>
-                <w:szCs w:val="26"/>
-                <w:lang w:val="vi-VN"/>
-              </w:rPr>
-              <w:t>2</w:t>
-            </w:r>
-            <w:r>
-              <w:rPr>
-                <w:rFonts w:ascii="Times New Roman" w:eastAsia="Times New Roman" w:hAnsi="Times New Roman" w:cs="Times New Roman"/>
-                <w:color w:val="000000" w:themeColor="text1"/>
-                <w:sz w:val="26"/>
-                <w:szCs w:val="26"/>
-                <w:lang w:val="vi-VN"/>
-              </w:rPr>
-              <w:t>_mua_</w:t>
-            </w:r>
-            <w:r>
-              <w:rPr>
-                <w:rFonts w:ascii="Times New Roman" w:eastAsia="Times New Roman" w:hAnsi="Times New Roman" w:cs="Times New Roman"/>
-                <w:color w:val="000000" w:themeColor="text1"/>
-                <w:sz w:val="26"/>
-                <w:szCs w:val="26"/>
-                <w:lang w:val="vi-VN"/>
-              </w:rPr>
-              <w:t>xa</w:t>
-            </w:r>
-            <w:r>
-              <w:rPr>
-                <w:rFonts w:ascii="Times New Roman" w:eastAsia="Times New Roman" w:hAnsi="Times New Roman" w:cs="Times New Roman"/>
-                <w:color w:val="000000" w:themeColor="text1"/>
-                <w:sz w:val="26"/>
-                <w:szCs w:val="26"/>
-                <w:lang w:val="vi-VN"/>
-              </w:rPr>
-              <w:t>}</w:t>
-            </w:r>
-          </w:p>
-        </w:tc>
-      </w:tr>
-    </w:tbl>
     <w:p>
       <w:pPr>
         <w:pStyle w:val="ListParagraph"/>
         <w:numPr>
           <w:ilvl w:val="0"/>
-          <w:numId w:val="3"/>
+          <w:numId w:val="4"/>
         </w:numPr>
         <w:spacing w:before="60" w:after="60" w:line="320" w:lineRule="exact"/>
         <w:jc w:val="both"/>
@@ -2643,680 +2612,425 @@
         <w:ind w:firstLine="284"/>
         <w:jc w:val="both"/>
         <w:rPr>
+          <w:rFonts w:ascii="Times New Roman" w:eastAsia="Times New Roman" w:hAnsi="Times New Roman" w:cs="Times New Roman"/>
+          <w:sz w:val="26"/>
+          <w:szCs w:val="26"/>
+          <w:lang w:val="vi-VN"/>
+        </w:rPr>
+      </w:pPr>
+      <w:proofErr w:type="spellStart"/>
+      <w:r>
+        <w:rPr>
           <w:rFonts w:ascii="Times New Roman" w:hAnsi="Times New Roman"/>
           <w:sz w:val="26"/>
           <w:szCs w:val="26"/>
         </w:rPr>
+        <w:t>Mực</w:t>
+      </w:r>
+      <w:proofErr w:type="spellEnd"/>
+      <w:r>
+        <w:rPr>
+          <w:rFonts w:ascii="Times New Roman" w:hAnsi="Times New Roman"/>
+          <w:sz w:val="26"/>
+          <w:szCs w:val="26"/>
+        </w:rPr>
+        <w:t xml:space="preserve"> </w:t>
+      </w:r>
+      <w:proofErr w:type="spellStart"/>
+      <w:r>
+        <w:rPr>
+          <w:rFonts w:ascii="Times New Roman" w:hAnsi="Times New Roman"/>
+          <w:sz w:val="26"/>
+          <w:szCs w:val="26"/>
+        </w:rPr>
+        <w:t>nước</w:t>
+      </w:r>
+      <w:proofErr w:type="spellEnd"/>
+      <w:r>
+        <w:rPr>
+          <w:rFonts w:ascii="Times New Roman" w:hAnsi="Times New Roman"/>
+          <w:sz w:val="26"/>
+          <w:szCs w:val="26"/>
+        </w:rPr>
+        <w:t xml:space="preserve"> </w:t>
+      </w:r>
+      <w:proofErr w:type="spellStart"/>
+      <w:r>
+        <w:rPr>
+          <w:rFonts w:ascii="Times New Roman" w:hAnsi="Times New Roman"/>
+          <w:sz w:val="26"/>
+          <w:szCs w:val="26"/>
+        </w:rPr>
+        <w:t>trên</w:t>
+      </w:r>
+      <w:proofErr w:type="spellEnd"/>
+      <w:r>
+        <w:rPr>
+          <w:rFonts w:ascii="Times New Roman" w:hAnsi="Times New Roman"/>
+          <w:sz w:val="26"/>
+          <w:szCs w:val="26"/>
+        </w:rPr>
+        <w:t xml:space="preserve"> </w:t>
+      </w:r>
+      <w:proofErr w:type="spellStart"/>
+      <w:r>
+        <w:rPr>
+          <w:rFonts w:ascii="Times New Roman" w:hAnsi="Times New Roman"/>
+          <w:sz w:val="26"/>
+          <w:szCs w:val="26"/>
+        </w:rPr>
+        <w:t>các</w:t>
+      </w:r>
+      <w:proofErr w:type="spellEnd"/>
+      <w:r>
+        <w:rPr>
+          <w:rFonts w:ascii="Times New Roman" w:hAnsi="Times New Roman"/>
+          <w:sz w:val="26"/>
+          <w:szCs w:val="26"/>
+        </w:rPr>
+        <w:t xml:space="preserve"> </w:t>
+      </w:r>
+      <w:proofErr w:type="spellStart"/>
+      <w:r>
+        <w:rPr>
+          <w:rFonts w:ascii="Times New Roman" w:hAnsi="Times New Roman"/>
+          <w:sz w:val="26"/>
+          <w:szCs w:val="26"/>
+        </w:rPr>
+        <w:t>sông</w:t>
+      </w:r>
+      <w:proofErr w:type="spellEnd"/>
+      <w:r>
+        <w:rPr>
+          <w:rFonts w:ascii="Times New Roman" w:hAnsi="Times New Roman"/>
+          <w:sz w:val="26"/>
+          <w:szCs w:val="26"/>
+        </w:rPr>
+        <w:t xml:space="preserve">, </w:t>
+      </w:r>
+      <w:proofErr w:type="spellStart"/>
+      <w:r>
+        <w:rPr>
+          <w:rFonts w:ascii="Times New Roman" w:hAnsi="Times New Roman"/>
+          <w:sz w:val="26"/>
+          <w:szCs w:val="26"/>
+        </w:rPr>
+        <w:t>hồ</w:t>
+      </w:r>
+      <w:proofErr w:type="spellEnd"/>
+      <w:r>
+        <w:rPr>
+          <w:rFonts w:ascii="Times New Roman" w:hAnsi="Times New Roman"/>
+          <w:sz w:val="26"/>
+          <w:szCs w:val="26"/>
+        </w:rPr>
+        <w:t xml:space="preserve"> </w:t>
+      </w:r>
+      <w:proofErr w:type="spellStart"/>
+      <w:r>
+        <w:rPr>
+          <w:rFonts w:ascii="Times New Roman" w:hAnsi="Times New Roman"/>
+          <w:sz w:val="26"/>
+          <w:szCs w:val="26"/>
+        </w:rPr>
+        <w:t>điều</w:t>
+      </w:r>
+      <w:proofErr w:type="spellEnd"/>
+      <w:r>
+        <w:rPr>
+          <w:rFonts w:ascii="Times New Roman" w:hAnsi="Times New Roman"/>
+          <w:sz w:val="26"/>
+          <w:szCs w:val="26"/>
+        </w:rPr>
+        <w:t xml:space="preserve"> </w:t>
+      </w:r>
+      <w:proofErr w:type="spellStart"/>
+      <w:r>
+        <w:rPr>
+          <w:rFonts w:ascii="Times New Roman" w:hAnsi="Times New Roman"/>
+          <w:sz w:val="26"/>
+          <w:szCs w:val="26"/>
+        </w:rPr>
+        <w:t>hòa</w:t>
+      </w:r>
+      <w:proofErr w:type="spellEnd"/>
+      <w:r>
+        <w:rPr>
+          <w:rFonts w:ascii="Times New Roman" w:hAnsi="Times New Roman"/>
+          <w:sz w:val="26"/>
+          <w:szCs w:val="26"/>
+        </w:rPr>
+        <w:t xml:space="preserve"> </w:t>
+      </w:r>
+      <w:proofErr w:type="spellStart"/>
+      <w:r>
+        <w:rPr>
+          <w:rFonts w:ascii="Times New Roman" w:hAnsi="Times New Roman"/>
+          <w:sz w:val="26"/>
+          <w:szCs w:val="26"/>
+        </w:rPr>
+        <w:t>tại</w:t>
+      </w:r>
+      <w:proofErr w:type="spellEnd"/>
+      <w:r>
+        <w:rPr>
+          <w:rFonts w:ascii="Times New Roman" w:hAnsi="Times New Roman"/>
+          <w:sz w:val="26"/>
+          <w:szCs w:val="26"/>
+        </w:rPr>
+        <w:t xml:space="preserve"> </w:t>
+      </w:r>
+      <w:proofErr w:type="spellStart"/>
+      <w:r>
+        <w:rPr>
+          <w:rFonts w:ascii="Times New Roman" w:hAnsi="Times New Roman"/>
+          <w:sz w:val="26"/>
+          <w:szCs w:val="26"/>
+        </w:rPr>
+        <w:t>thời</w:t>
+      </w:r>
+      <w:proofErr w:type="spellEnd"/>
+      <w:r>
+        <w:rPr>
+          <w:rFonts w:ascii="Times New Roman" w:hAnsi="Times New Roman"/>
+          <w:sz w:val="26"/>
+          <w:szCs w:val="26"/>
+        </w:rPr>
+        <w:t xml:space="preserve"> </w:t>
+      </w:r>
+      <w:proofErr w:type="spellStart"/>
+      <w:r>
+        <w:rPr>
+          <w:rFonts w:ascii="Times New Roman" w:hAnsi="Times New Roman" w:cs="Times New Roman"/>
+          <w:sz w:val="26"/>
+          <w:szCs w:val="26"/>
+        </w:rPr>
+        <w:t>điểm</w:t>
+      </w:r>
+      <w:proofErr w:type="spellEnd"/>
+      <w:r>
+        <w:rPr>
+          <w:rFonts w:ascii="Times New Roman" w:hAnsi="Times New Roman" w:cs="Times New Roman"/>
+          <w:sz w:val="26"/>
+          <w:szCs w:val="26"/>
+        </w:rPr>
+        <w:t xml:space="preserve"> </w:t>
+      </w:r>
+      <w:r>
+        <w:rPr>
+          <w:rFonts w:ascii="Times New Roman" w:hAnsi="Times New Roman" w:cs="Times New Roman"/>
+          <w:sz w:val="26"/>
+          <w:szCs w:val="26"/>
+        </w:rPr>
+        <w:t>{</w:t>
+      </w:r>
+      <w:proofErr w:type="spellStart"/>
+      <w:r>
+        <w:rPr>
+          <w:rFonts w:ascii="Times New Roman" w:hAnsi="Times New Roman" w:cs="Times New Roman"/>
+          <w:sz w:val="26"/>
+          <w:szCs w:val="26"/>
+        </w:rPr>
+        <w:t>hh</w:t>
+      </w:r>
+      <w:proofErr w:type="spellEnd"/>
+      <w:r>
+        <w:rPr>
+          <w:rFonts w:ascii="Times New Roman" w:hAnsi="Times New Roman" w:cs="Times New Roman"/>
+          <w:sz w:val="26"/>
+          <w:szCs w:val="26"/>
+        </w:rPr>
+        <w:t>}</w:t>
+      </w:r>
+      <w:r>
+        <w:rPr>
+          <w:rFonts w:ascii="Times New Roman" w:hAnsi="Times New Roman" w:cs="Times New Roman"/>
+          <w:sz w:val="26"/>
+          <w:szCs w:val="26"/>
+        </w:rPr>
+        <w:t xml:space="preserve"> </w:t>
+      </w:r>
+      <w:proofErr w:type="spellStart"/>
+      <w:r>
+        <w:rPr>
+          <w:rFonts w:ascii="Times New Roman" w:hAnsi="Times New Roman" w:cs="Times New Roman"/>
+          <w:sz w:val="26"/>
+          <w:szCs w:val="26"/>
+        </w:rPr>
+        <w:t>ngày</w:t>
+      </w:r>
+      <w:proofErr w:type="spellEnd"/>
+      <w:r>
+        <w:rPr>
+          <w:rFonts w:ascii="Times New Roman" w:hAnsi="Times New Roman"/>
+          <w:sz w:val="26"/>
+          <w:szCs w:val="26"/>
+        </w:rPr>
+        <w:t xml:space="preserve"> </w:t>
+      </w:r>
+      <w:r>
+        <w:rPr>
+          <w:rFonts w:ascii="Times New Roman" w:hAnsi="Times New Roman" w:cs="Times New Roman"/>
+          <w:sz w:val="26"/>
+          <w:szCs w:val="26"/>
+        </w:rPr>
+        <w:t>{dd}/{mm}/{</w:t>
+      </w:r>
+      <w:proofErr w:type="spellStart"/>
+      <w:r>
+        <w:rPr>
+          <w:rFonts w:ascii="Times New Roman" w:hAnsi="Times New Roman" w:cs="Times New Roman"/>
+          <w:sz w:val="26"/>
+          <w:szCs w:val="26"/>
+        </w:rPr>
+        <w:t>yyyy</w:t>
+      </w:r>
+      <w:proofErr w:type="spellEnd"/>
+      <w:r>
+        <w:rPr>
+          <w:rFonts w:ascii="Times New Roman" w:hAnsi="Times New Roman" w:cs="Times New Roman"/>
+          <w:sz w:val="26"/>
+          <w:szCs w:val="26"/>
+        </w:rPr>
+        <w:t>}</w:t>
+      </w:r>
+      <w:r>
+        <w:rPr>
+          <w:rFonts w:ascii="Times New Roman" w:hAnsi="Times New Roman" w:cs="Times New Roman"/>
+          <w:sz w:val="26"/>
+          <w:szCs w:val="26"/>
+          <w:lang w:val="vi-VN"/>
+        </w:rPr>
+        <w:t xml:space="preserve"> </w:t>
+      </w:r>
+      <w:r>
+        <w:rPr>
+          <w:rFonts w:ascii="Times New Roman" w:eastAsia="Times New Roman" w:hAnsi="Times New Roman" w:cs="Times New Roman"/>
+          <w:sz w:val="26"/>
+          <w:szCs w:val="26"/>
+        </w:rPr>
+        <w:t xml:space="preserve">chi </w:t>
+      </w:r>
+      <w:proofErr w:type="spellStart"/>
+      <w:r>
+        <w:rPr>
+          <w:rFonts w:ascii="Times New Roman" w:eastAsia="Times New Roman" w:hAnsi="Times New Roman" w:cs="Times New Roman"/>
+          <w:sz w:val="26"/>
+          <w:szCs w:val="26"/>
+        </w:rPr>
+        <w:t>tiết</w:t>
+      </w:r>
+      <w:proofErr w:type="spellEnd"/>
+      <w:r>
+        <w:rPr>
+          <w:rFonts w:ascii="Times New Roman" w:eastAsia="Times New Roman" w:hAnsi="Times New Roman" w:cs="Times New Roman"/>
+          <w:sz w:val="26"/>
+          <w:szCs w:val="26"/>
+        </w:rPr>
+        <w:t xml:space="preserve"> </w:t>
+      </w:r>
+      <w:proofErr w:type="spellStart"/>
+      <w:r>
+        <w:rPr>
+          <w:rFonts w:ascii="Times New Roman" w:eastAsia="Times New Roman" w:hAnsi="Times New Roman" w:cs="Times New Roman"/>
+          <w:sz w:val="26"/>
+          <w:szCs w:val="26"/>
+        </w:rPr>
+        <w:t>tại</w:t>
+      </w:r>
+      <w:proofErr w:type="spellEnd"/>
+      <w:r>
+        <w:rPr>
+          <w:rFonts w:ascii="Times New Roman" w:eastAsia="Times New Roman" w:hAnsi="Times New Roman" w:cs="Times New Roman"/>
+          <w:sz w:val="26"/>
+          <w:szCs w:val="26"/>
+        </w:rPr>
+        <w:t xml:space="preserve"> </w:t>
+      </w:r>
+      <w:proofErr w:type="spellStart"/>
+      <w:r>
+        <w:rPr>
+          <w:rFonts w:ascii="Times New Roman" w:eastAsia="Times New Roman" w:hAnsi="Times New Roman" w:cs="Times New Roman"/>
+          <w:sz w:val="26"/>
+          <w:szCs w:val="26"/>
+        </w:rPr>
+        <w:t>phụ</w:t>
+      </w:r>
+      <w:proofErr w:type="spellEnd"/>
+      <w:r>
+        <w:rPr>
+          <w:rFonts w:ascii="Times New Roman" w:eastAsia="Times New Roman" w:hAnsi="Times New Roman" w:cs="Times New Roman"/>
+          <w:sz w:val="26"/>
+          <w:szCs w:val="26"/>
+        </w:rPr>
+        <w:t xml:space="preserve"> </w:t>
+      </w:r>
+      <w:proofErr w:type="spellStart"/>
+      <w:r>
+        <w:rPr>
+          <w:rFonts w:ascii="Times New Roman" w:eastAsia="Times New Roman" w:hAnsi="Times New Roman" w:cs="Times New Roman"/>
+          <w:sz w:val="26"/>
+          <w:szCs w:val="26"/>
+        </w:rPr>
+        <w:t>lục</w:t>
+      </w:r>
+      <w:proofErr w:type="spellEnd"/>
+      <w:r>
+        <w:rPr>
+          <w:rFonts w:ascii="Times New Roman" w:eastAsia="Times New Roman" w:hAnsi="Times New Roman" w:cs="Times New Roman"/>
+          <w:sz w:val="26"/>
+          <w:szCs w:val="26"/>
+        </w:rPr>
+        <w:t xml:space="preserve"> 02 </w:t>
+      </w:r>
+      <w:proofErr w:type="spellStart"/>
+      <w:r>
+        <w:rPr>
+          <w:rFonts w:ascii="Times New Roman" w:eastAsia="Times New Roman" w:hAnsi="Times New Roman" w:cs="Times New Roman"/>
+          <w:sz w:val="26"/>
+          <w:szCs w:val="26"/>
+        </w:rPr>
+        <w:t>kèm</w:t>
+      </w:r>
+      <w:proofErr w:type="spellEnd"/>
+      <w:r>
+        <w:rPr>
+          <w:rFonts w:ascii="Times New Roman" w:eastAsia="Times New Roman" w:hAnsi="Times New Roman" w:cs="Times New Roman"/>
+          <w:sz w:val="26"/>
+          <w:szCs w:val="26"/>
+        </w:rPr>
+        <w:t xml:space="preserve"> </w:t>
+      </w:r>
+      <w:proofErr w:type="spellStart"/>
+      <w:r>
+        <w:rPr>
+          <w:rFonts w:ascii="Times New Roman" w:eastAsia="Times New Roman" w:hAnsi="Times New Roman" w:cs="Times New Roman"/>
+          <w:sz w:val="26"/>
+          <w:szCs w:val="26"/>
+        </w:rPr>
+        <w:t>theo.</w:t>
+      </w:r>
+      <w:proofErr w:type="spellEnd"/>
+    </w:p>
+    <w:p>
+      <w:pPr>
+        <w:spacing w:before="20" w:after="20" w:line="320" w:lineRule="exact"/>
+        <w:ind w:firstLine="284"/>
+        <w:jc w:val="both"/>
+        <w:rPr>
+          <w:rFonts w:ascii="Times New Roman" w:hAnsi="Times New Roman"/>
+          <w:sz w:val="26"/>
+          <w:szCs w:val="26"/>
+          <w:lang w:val="vi-VN"/>
+        </w:rPr>
       </w:pPr>
-      <w:proofErr w:type="spellStart"/>
-      <w:r>
-        <w:rPr>
-          <w:rFonts w:ascii="Times New Roman" w:hAnsi="Times New Roman"/>
-          <w:sz w:val="26"/>
-          <w:szCs w:val="26"/>
-        </w:rPr>
-        <w:t>Mực</w:t>
-      </w:r>
-      <w:proofErr w:type="spellEnd"/>
-      <w:r>
-        <w:rPr>
-          <w:rFonts w:ascii="Times New Roman" w:hAnsi="Times New Roman"/>
-          <w:sz w:val="26"/>
-          <w:szCs w:val="26"/>
-        </w:rPr>
-        <w:t xml:space="preserve"> </w:t>
-      </w:r>
-      <w:proofErr w:type="spellStart"/>
-      <w:r>
-        <w:rPr>
-          <w:rFonts w:ascii="Times New Roman" w:hAnsi="Times New Roman"/>
-          <w:sz w:val="26"/>
-          <w:szCs w:val="26"/>
-        </w:rPr>
-        <w:t>nước</w:t>
-      </w:r>
-      <w:proofErr w:type="spellEnd"/>
-      <w:r>
-        <w:rPr>
-          <w:rFonts w:ascii="Times New Roman" w:hAnsi="Times New Roman"/>
-          <w:sz w:val="26"/>
-          <w:szCs w:val="26"/>
-        </w:rPr>
-        <w:t xml:space="preserve"> </w:t>
-      </w:r>
-      <w:proofErr w:type="spellStart"/>
-      <w:r>
-        <w:rPr>
-          <w:rFonts w:ascii="Times New Roman" w:hAnsi="Times New Roman"/>
-          <w:sz w:val="26"/>
-          <w:szCs w:val="26"/>
-        </w:rPr>
-        <w:t>trên</w:t>
-      </w:r>
-      <w:proofErr w:type="spellEnd"/>
-      <w:r>
-        <w:rPr>
-          <w:rFonts w:ascii="Times New Roman" w:hAnsi="Times New Roman"/>
-          <w:sz w:val="26"/>
-          <w:szCs w:val="26"/>
-        </w:rPr>
-        <w:t xml:space="preserve"> </w:t>
-      </w:r>
-      <w:proofErr w:type="spellStart"/>
-      <w:r>
-        <w:rPr>
-          <w:rFonts w:ascii="Times New Roman" w:hAnsi="Times New Roman"/>
-          <w:sz w:val="26"/>
-          <w:szCs w:val="26"/>
-        </w:rPr>
-        <w:t>các</w:t>
-      </w:r>
-      <w:proofErr w:type="spellEnd"/>
-      <w:r>
-        <w:rPr>
-          <w:rFonts w:ascii="Times New Roman" w:hAnsi="Times New Roman"/>
-          <w:sz w:val="26"/>
-          <w:szCs w:val="26"/>
-        </w:rPr>
-        <w:t xml:space="preserve"> </w:t>
-      </w:r>
-      <w:proofErr w:type="spellStart"/>
-      <w:r>
-        <w:rPr>
-          <w:rFonts w:ascii="Times New Roman" w:hAnsi="Times New Roman"/>
-          <w:sz w:val="26"/>
-          <w:szCs w:val="26"/>
-        </w:rPr>
-        <w:t>sông</w:t>
-      </w:r>
-      <w:proofErr w:type="spellEnd"/>
-      <w:r>
-        <w:rPr>
-          <w:rFonts w:ascii="Times New Roman" w:hAnsi="Times New Roman"/>
-          <w:sz w:val="26"/>
-          <w:szCs w:val="26"/>
-        </w:rPr>
-        <w:t xml:space="preserve">, </w:t>
-      </w:r>
-      <w:proofErr w:type="spellStart"/>
-      <w:r>
-        <w:rPr>
-          <w:rFonts w:ascii="Times New Roman" w:hAnsi="Times New Roman"/>
-          <w:sz w:val="26"/>
-          <w:szCs w:val="26"/>
-        </w:rPr>
-        <w:t>hồ</w:t>
-      </w:r>
-      <w:proofErr w:type="spellEnd"/>
-      <w:r>
-        <w:rPr>
-          <w:rFonts w:ascii="Times New Roman" w:hAnsi="Times New Roman"/>
-          <w:sz w:val="26"/>
-          <w:szCs w:val="26"/>
-        </w:rPr>
-        <w:t xml:space="preserve"> </w:t>
-      </w:r>
-      <w:proofErr w:type="spellStart"/>
-      <w:r>
-        <w:rPr>
-          <w:rFonts w:ascii="Times New Roman" w:hAnsi="Times New Roman"/>
-          <w:sz w:val="26"/>
-          <w:szCs w:val="26"/>
-        </w:rPr>
-        <w:t>điều</w:t>
-      </w:r>
-      <w:proofErr w:type="spellEnd"/>
-      <w:r>
-        <w:rPr>
-          <w:rFonts w:ascii="Times New Roman" w:hAnsi="Times New Roman"/>
-          <w:sz w:val="26"/>
-          <w:szCs w:val="26"/>
-        </w:rPr>
-        <w:t xml:space="preserve"> </w:t>
-      </w:r>
-      <w:proofErr w:type="spellStart"/>
-      <w:r>
-        <w:rPr>
-          <w:rFonts w:ascii="Times New Roman" w:hAnsi="Times New Roman"/>
-          <w:sz w:val="26"/>
-          <w:szCs w:val="26"/>
-        </w:rPr>
-        <w:t>hòa</w:t>
-      </w:r>
-      <w:proofErr w:type="spellEnd"/>
-      <w:r>
-        <w:rPr>
-          <w:rFonts w:ascii="Times New Roman" w:hAnsi="Times New Roman"/>
-          <w:sz w:val="26"/>
-          <w:szCs w:val="26"/>
-        </w:rPr>
-        <w:t xml:space="preserve"> </w:t>
-      </w:r>
-      <w:proofErr w:type="spellStart"/>
-      <w:r>
-        <w:rPr>
-          <w:rFonts w:ascii="Times New Roman" w:hAnsi="Times New Roman"/>
-          <w:sz w:val="26"/>
-          <w:szCs w:val="26"/>
-        </w:rPr>
-        <w:t>tại</w:t>
-      </w:r>
-      <w:proofErr w:type="spellEnd"/>
-      <w:r>
-        <w:rPr>
-          <w:rFonts w:ascii="Times New Roman" w:hAnsi="Times New Roman"/>
-          <w:sz w:val="26"/>
-          <w:szCs w:val="26"/>
-        </w:rPr>
-        <w:t xml:space="preserve"> </w:t>
-      </w:r>
-      <w:proofErr w:type="spellStart"/>
-      <w:r>
-        <w:rPr>
-          <w:rFonts w:ascii="Times New Roman" w:hAnsi="Times New Roman"/>
-          <w:sz w:val="26"/>
-          <w:szCs w:val="26"/>
-        </w:rPr>
-        <w:t>thời</w:t>
-      </w:r>
-      <w:proofErr w:type="spellEnd"/>
-      <w:r>
-        <w:rPr>
-          <w:rFonts w:ascii="Times New Roman" w:hAnsi="Times New Roman"/>
-          <w:sz w:val="26"/>
-          <w:szCs w:val="26"/>
-        </w:rPr>
-        <w:t xml:space="preserve"> </w:t>
-      </w:r>
-      <w:proofErr w:type="spellStart"/>
-      <w:r>
-        <w:rPr>
-          <w:rFonts w:ascii="Times New Roman" w:hAnsi="Times New Roman" w:cs="Times New Roman"/>
-          <w:sz w:val="26"/>
-          <w:szCs w:val="26"/>
-        </w:rPr>
-        <w:t>điểm</w:t>
-      </w:r>
-      <w:proofErr w:type="spellEnd"/>
-      <w:r>
-        <w:rPr>
-          <w:rFonts w:ascii="Times New Roman" w:hAnsi="Times New Roman" w:cs="Times New Roman"/>
-          <w:sz w:val="26"/>
-          <w:szCs w:val="26"/>
-        </w:rPr>
-        <w:t xml:space="preserve"> </w:t>
-      </w:r>
-      <w:r>
-        <w:rPr>
-          <w:rFonts w:ascii="Times New Roman" w:hAnsi="Times New Roman" w:cs="Times New Roman"/>
-          <w:sz w:val="26"/>
-          <w:szCs w:val="26"/>
-        </w:rPr>
-        <w:t>{</w:t>
-      </w:r>
-      <w:proofErr w:type="spellStart"/>
-      <w:r>
-        <w:rPr>
-          <w:rFonts w:ascii="Times New Roman" w:hAnsi="Times New Roman" w:cs="Times New Roman"/>
-          <w:sz w:val="26"/>
-          <w:szCs w:val="26"/>
-        </w:rPr>
-        <w:t>hh</w:t>
-      </w:r>
-      <w:proofErr w:type="spellEnd"/>
-      <w:r>
-        <w:rPr>
-          <w:rFonts w:ascii="Times New Roman" w:hAnsi="Times New Roman" w:cs="Times New Roman"/>
-          <w:sz w:val="26"/>
-          <w:szCs w:val="26"/>
-        </w:rPr>
-        <w:t>}</w:t>
-      </w:r>
-      <w:r>
-        <w:rPr>
-          <w:rFonts w:ascii="Times New Roman" w:hAnsi="Times New Roman" w:cs="Times New Roman"/>
-          <w:sz w:val="26"/>
-          <w:szCs w:val="26"/>
-        </w:rPr>
-        <w:t xml:space="preserve"> </w:t>
-      </w:r>
-      <w:proofErr w:type="spellStart"/>
-      <w:r>
-        <w:rPr>
-          <w:rFonts w:ascii="Times New Roman" w:hAnsi="Times New Roman" w:cs="Times New Roman"/>
-          <w:sz w:val="26"/>
-          <w:szCs w:val="26"/>
-        </w:rPr>
-        <w:t>ngày</w:t>
-      </w:r>
-      <w:proofErr w:type="spellEnd"/>
-      <w:r>
-        <w:rPr>
-          <w:rFonts w:ascii="Times New Roman" w:hAnsi="Times New Roman"/>
-          <w:sz w:val="26"/>
-          <w:szCs w:val="26"/>
-        </w:rPr>
-        <w:t xml:space="preserve"> </w:t>
-      </w:r>
-      <w:r>
-        <w:rPr>
-          <w:rFonts w:ascii="Times New Roman" w:hAnsi="Times New Roman" w:cs="Times New Roman"/>
-          <w:sz w:val="26"/>
-          <w:szCs w:val="26"/>
-        </w:rPr>
-        <w:t>{dd}/{mm}/{</w:t>
-      </w:r>
-      <w:proofErr w:type="spellStart"/>
-      <w:r>
-        <w:rPr>
-          <w:rFonts w:ascii="Times New Roman" w:hAnsi="Times New Roman" w:cs="Times New Roman"/>
-          <w:sz w:val="26"/>
-          <w:szCs w:val="26"/>
-        </w:rPr>
-        <w:t>yyyy</w:t>
-      </w:r>
-      <w:proofErr w:type="spellEnd"/>
-      <w:r>
-        <w:rPr>
-          <w:rFonts w:ascii="Times New Roman" w:hAnsi="Times New Roman" w:cs="Times New Roman"/>
-          <w:sz w:val="26"/>
-          <w:szCs w:val="26"/>
-        </w:rPr>
-        <w:t>}</w:t>
-      </w:r>
-      <w:r>
-        <w:rPr>
-          <w:rFonts w:ascii="Times New Roman" w:hAnsi="Times New Roman" w:cs="Times New Roman"/>
-          <w:sz w:val="26"/>
-          <w:szCs w:val="26"/>
-          <w:lang w:val="vi-VN"/>
-        </w:rPr>
-        <w:t xml:space="preserve"> </w:t>
-      </w:r>
-      <w:proofErr w:type="spellStart"/>
-      <w:r>
-        <w:rPr>
-          <w:rFonts w:ascii="Times New Roman" w:hAnsi="Times New Roman"/>
-          <w:sz w:val="26"/>
-          <w:szCs w:val="26"/>
-        </w:rPr>
-        <w:t>như</w:t>
-      </w:r>
-      <w:proofErr w:type="spellEnd"/>
-      <w:r>
-        <w:rPr>
-          <w:rFonts w:ascii="Times New Roman" w:hAnsi="Times New Roman"/>
-          <w:sz w:val="26"/>
-          <w:szCs w:val="26"/>
-        </w:rPr>
-        <w:t xml:space="preserve"> </w:t>
-      </w:r>
-      <w:proofErr w:type="spellStart"/>
-      <w:r>
-        <w:rPr>
-          <w:rFonts w:ascii="Times New Roman" w:hAnsi="Times New Roman"/>
-          <w:sz w:val="26"/>
-          <w:szCs w:val="26"/>
-        </w:rPr>
-        <w:t>sau</w:t>
-      </w:r>
-      <w:proofErr w:type="spellEnd"/>
-      <w:r>
-        <w:rPr>
-          <w:rFonts w:ascii="Times New Roman" w:hAnsi="Times New Roman"/>
-          <w:sz w:val="26"/>
-          <w:szCs w:val="26"/>
-        </w:rPr>
-        <w:t xml:space="preserve">: </w:t>
-      </w:r>
-      <w:r>
-        <w:rPr>
-          <w:rFonts w:ascii="Times New Roman" w:hAnsi="Times New Roman"/>
-          <w:sz w:val="26"/>
-          <w:szCs w:val="26"/>
-        </w:rPr>
-        <w:t xml:space="preserve"> </w:t>
-      </w:r>
     </w:p>
-    <w:tbl>
-      <w:tblPr>
-        <w:tblStyle w:val="TableSimple1"/>
-        <w:tblW w:w="8910" w:type="dxa"/>
-        <w:tblInd w:w="360" w:type="dxa"/>
-        <w:tblBorders>
-          <w:top w:val="none" w:sz="0" w:space="0" w:color="auto"/>
-          <w:left w:val="none" w:sz="0" w:space="0" w:color="auto"/>
-          <w:bottom w:val="none" w:sz="0" w:space="0" w:color="auto"/>
-          <w:right w:val="none" w:sz="0" w:space="0" w:color="auto"/>
-          <w:insideH w:val="none" w:sz="0" w:space="0" w:color="auto"/>
-          <w:insideV w:val="none" w:sz="0" w:space="0" w:color="auto"/>
-        </w:tblBorders>
-        <w:tblLook w:val="04A0" w:firstRow="1" w:lastRow="0" w:firstColumn="1" w:lastColumn="0" w:noHBand="0" w:noVBand="1"/>
-      </w:tblPr>
-      <w:tblGrid>
-        <w:gridCol w:w="2970"/>
-        <w:gridCol w:w="1440"/>
-        <w:gridCol w:w="270"/>
-        <w:gridCol w:w="2880"/>
-        <w:gridCol w:w="1350"/>
-      </w:tblGrid>
-      <w:tr>
-        <w:tc>
-          <w:tcPr>
-            <w:tcW w:w="2970" w:type="dxa"/>
-            <w:vAlign w:val="center"/>
-          </w:tcPr>
-          <w:p>
-            <w:pPr>
-              <w:pStyle w:val="ListParagraph"/>
-              <w:spacing w:before="60" w:after="60" w:line="320" w:lineRule="exact"/>
-              <w:ind w:left="0"/>
-              <w:jc w:val="both"/>
-              <w:rPr>
-                <w:rFonts w:ascii="Times New Roman" w:hAnsi="Times New Roman"/>
-                <w:sz w:val="26"/>
-                <w:szCs w:val="26"/>
-              </w:rPr>
-            </w:pPr>
-            <w:proofErr w:type="spellStart"/>
-            <w:r>
-              <w:rPr>
-                <w:rFonts w:ascii="Times New Roman" w:hAnsi="Times New Roman"/>
-                <w:sz w:val="26"/>
-                <w:szCs w:val="26"/>
-              </w:rPr>
-              <w:t>Mực</w:t>
-            </w:r>
-            <w:proofErr w:type="spellEnd"/>
-            <w:r>
-              <w:rPr>
-                <w:rFonts w:ascii="Times New Roman" w:hAnsi="Times New Roman"/>
-                <w:sz w:val="26"/>
-                <w:szCs w:val="26"/>
-              </w:rPr>
-              <w:t xml:space="preserve"> </w:t>
-            </w:r>
-            <w:proofErr w:type="spellStart"/>
-            <w:r>
-              <w:rPr>
-                <w:rFonts w:ascii="Times New Roman" w:hAnsi="Times New Roman"/>
-                <w:sz w:val="26"/>
-                <w:szCs w:val="26"/>
-              </w:rPr>
-              <w:t>nước</w:t>
-            </w:r>
-            <w:proofErr w:type="spellEnd"/>
-            <w:r>
-              <w:rPr>
-                <w:rFonts w:ascii="Times New Roman" w:hAnsi="Times New Roman"/>
-                <w:sz w:val="26"/>
-                <w:szCs w:val="26"/>
-              </w:rPr>
-              <w:t xml:space="preserve"> </w:t>
-            </w:r>
-            <w:proofErr w:type="spellStart"/>
-            <w:r>
-              <w:rPr>
-                <w:rFonts w:ascii="Times New Roman" w:hAnsi="Times New Roman"/>
-                <w:sz w:val="26"/>
-                <w:szCs w:val="26"/>
-              </w:rPr>
-              <w:t>Sông</w:t>
-            </w:r>
-            <w:proofErr w:type="spellEnd"/>
-          </w:p>
-        </w:tc>
-        <w:tc>
-          <w:tcPr>
-            <w:tcW w:w="1440" w:type="dxa"/>
-            <w:vAlign w:val="center"/>
-          </w:tcPr>
-          <w:p>
-            <w:pPr>
-              <w:pStyle w:val="ListParagraph"/>
-              <w:spacing w:before="60" w:after="60" w:line="320" w:lineRule="exact"/>
-              <w:ind w:left="0"/>
-              <w:jc w:val="both"/>
-              <w:rPr>
-                <w:rFonts w:ascii="Times New Roman" w:hAnsi="Times New Roman"/>
-                <w:sz w:val="26"/>
-                <w:szCs w:val="26"/>
-              </w:rPr>
-            </w:pPr>
-          </w:p>
-        </w:tc>
-        <w:tc>
-          <w:tcPr>
-            <w:tcW w:w="270" w:type="dxa"/>
-            <w:vAlign w:val="center"/>
-          </w:tcPr>
-          <w:p>
-            <w:pPr>
-              <w:pStyle w:val="ListParagraph"/>
-              <w:spacing w:before="60" w:after="60" w:line="320" w:lineRule="exact"/>
-              <w:ind w:left="0"/>
-              <w:jc w:val="both"/>
-              <w:rPr>
-                <w:rFonts w:ascii="Times New Roman" w:hAnsi="Times New Roman"/>
-                <w:sz w:val="26"/>
-                <w:szCs w:val="26"/>
-              </w:rPr>
-            </w:pPr>
-          </w:p>
-        </w:tc>
-        <w:tc>
-          <w:tcPr>
-            <w:tcW w:w="2880" w:type="dxa"/>
-            <w:vAlign w:val="center"/>
-          </w:tcPr>
-          <w:p>
-            <w:pPr>
-              <w:pStyle w:val="ListParagraph"/>
-              <w:spacing w:before="60" w:after="60" w:line="320" w:lineRule="exact"/>
-              <w:ind w:left="0"/>
-              <w:jc w:val="both"/>
-              <w:rPr>
-                <w:rFonts w:ascii="Times New Roman" w:hAnsi="Times New Roman"/>
-                <w:sz w:val="26"/>
-                <w:szCs w:val="26"/>
-              </w:rPr>
-            </w:pPr>
-            <w:proofErr w:type="spellStart"/>
-            <w:r>
-              <w:rPr>
-                <w:rFonts w:ascii="Times New Roman" w:hAnsi="Times New Roman"/>
-                <w:sz w:val="26"/>
-                <w:szCs w:val="26"/>
-              </w:rPr>
-              <w:t>Mực</w:t>
-            </w:r>
-            <w:proofErr w:type="spellEnd"/>
-            <w:r>
-              <w:rPr>
-                <w:rFonts w:ascii="Times New Roman" w:hAnsi="Times New Roman"/>
-                <w:sz w:val="26"/>
-                <w:szCs w:val="26"/>
-              </w:rPr>
-              <w:t xml:space="preserve"> </w:t>
-            </w:r>
-            <w:proofErr w:type="spellStart"/>
-            <w:r>
-              <w:rPr>
-                <w:rFonts w:ascii="Times New Roman" w:hAnsi="Times New Roman"/>
-                <w:sz w:val="26"/>
-                <w:szCs w:val="26"/>
-              </w:rPr>
-              <w:t>nước</w:t>
-            </w:r>
-            <w:proofErr w:type="spellEnd"/>
-            <w:r>
-              <w:rPr>
-                <w:rFonts w:ascii="Times New Roman" w:hAnsi="Times New Roman"/>
-                <w:sz w:val="26"/>
-                <w:szCs w:val="26"/>
-              </w:rPr>
-              <w:t xml:space="preserve"> </w:t>
-            </w:r>
-            <w:proofErr w:type="spellStart"/>
-            <w:r>
-              <w:rPr>
-                <w:rFonts w:ascii="Times New Roman" w:hAnsi="Times New Roman"/>
-                <w:sz w:val="26"/>
-                <w:szCs w:val="26"/>
-              </w:rPr>
-              <w:t>Hồ</w:t>
-            </w:r>
-            <w:proofErr w:type="spellEnd"/>
-          </w:p>
-        </w:tc>
-        <w:tc>
-          <w:tcPr>
-            <w:tcW w:w="1350" w:type="dxa"/>
-            <w:vAlign w:val="center"/>
-          </w:tcPr>
-          <w:p>
-            <w:pPr>
-              <w:pStyle w:val="ListParagraph"/>
-              <w:spacing w:before="60" w:after="60" w:line="320" w:lineRule="exact"/>
-              <w:ind w:left="0"/>
-              <w:jc w:val="both"/>
-              <w:rPr>
-                <w:rFonts w:ascii="Times New Roman" w:hAnsi="Times New Roman"/>
-                <w:sz w:val="26"/>
-                <w:szCs w:val="26"/>
-              </w:rPr>
-            </w:pPr>
-          </w:p>
-        </w:tc>
-      </w:tr>
-      <w:tr>
-        <w:tc>
-          <w:tcPr>
-            <w:tcW w:w="4410" w:type="dxa"/>
-            <w:gridSpan w:val="2"/>
-            <w:vAlign w:val="center"/>
-          </w:tcPr>
-          <w:p>
-            <w:pPr>
-              <w:pStyle w:val="ListParagraph"/>
-              <w:spacing w:before="60" w:after="60" w:line="320" w:lineRule="exact"/>
-              <w:ind w:left="0"/>
-              <w:jc w:val="both"/>
-              <w:rPr>
-                <w:rFonts w:ascii="Times New Roman" w:hAnsi="Times New Roman"/>
-                <w:sz w:val="26"/>
-                <w:szCs w:val="26"/>
-              </w:rPr>
-            </w:pPr>
-            <w:r>
-              <w:rPr>
-                <w:rFonts w:ascii="Times New Roman" w:eastAsia="Times New Roman" w:hAnsi="Times New Roman" w:cs="Times New Roman"/>
-                <w:color w:val="000000" w:themeColor="text1"/>
-                <w:sz w:val="26"/>
-                <w:szCs w:val="26"/>
-                <w:lang w:val="vi-VN"/>
-              </w:rPr>
-              <w:t>{table_</w:t>
-            </w:r>
-            <w:r>
-              <w:rPr>
-                <w:rFonts w:ascii="Times New Roman" w:eastAsia="Times New Roman" w:hAnsi="Times New Roman" w:cs="Times New Roman"/>
-                <w:color w:val="000000" w:themeColor="text1"/>
-                <w:sz w:val="26"/>
-                <w:szCs w:val="26"/>
-                <w:lang w:val="vi-VN"/>
-              </w:rPr>
-              <w:t>song</w:t>
-            </w:r>
-            <w:r>
-              <w:rPr>
-                <w:rFonts w:ascii="Times New Roman" w:eastAsia="Times New Roman" w:hAnsi="Times New Roman" w:cs="Times New Roman"/>
-                <w:color w:val="000000" w:themeColor="text1"/>
-                <w:sz w:val="26"/>
-                <w:szCs w:val="26"/>
-                <w:lang w:val="vi-VN"/>
-              </w:rPr>
-              <w:t>}</w:t>
-            </w:r>
-          </w:p>
-        </w:tc>
-        <w:tc>
-          <w:tcPr>
-            <w:tcW w:w="270" w:type="dxa"/>
-            <w:vAlign w:val="center"/>
-          </w:tcPr>
-          <w:p>
-            <w:pPr>
-              <w:pStyle w:val="ListParagraph"/>
-              <w:spacing w:before="60" w:after="60" w:line="320" w:lineRule="exact"/>
-              <w:ind w:left="0"/>
-              <w:jc w:val="both"/>
-              <w:rPr>
-                <w:rFonts w:ascii="Times New Roman" w:hAnsi="Times New Roman"/>
-                <w:sz w:val="26"/>
-                <w:szCs w:val="26"/>
-              </w:rPr>
-            </w:pPr>
-          </w:p>
-        </w:tc>
-        <w:tc>
-          <w:tcPr>
-            <w:tcW w:w="4230" w:type="dxa"/>
-            <w:gridSpan w:val="2"/>
-            <w:vAlign w:val="center"/>
-          </w:tcPr>
-          <w:p>
-            <w:pPr>
-              <w:pStyle w:val="ListParagraph"/>
-              <w:spacing w:before="60" w:after="60" w:line="320" w:lineRule="exact"/>
-              <w:ind w:left="0"/>
-              <w:jc w:val="both"/>
-              <w:rPr>
-                <w:rFonts w:ascii="Times New Roman" w:hAnsi="Times New Roman"/>
-                <w:sz w:val="26"/>
-                <w:szCs w:val="26"/>
-              </w:rPr>
-            </w:pPr>
-            <w:r>
-              <w:rPr>
-                <w:rFonts w:ascii="Times New Roman" w:eastAsia="Times New Roman" w:hAnsi="Times New Roman" w:cs="Times New Roman"/>
-                <w:color w:val="000000" w:themeColor="text1"/>
-                <w:sz w:val="26"/>
-                <w:szCs w:val="26"/>
-                <w:lang w:val="vi-VN"/>
-              </w:rPr>
-              <w:t>{table_</w:t>
-            </w:r>
-            <w:r>
-              <w:rPr>
-                <w:rFonts w:ascii="Times New Roman" w:eastAsia="Times New Roman" w:hAnsi="Times New Roman" w:cs="Times New Roman"/>
-                <w:color w:val="000000" w:themeColor="text1"/>
-                <w:sz w:val="26"/>
-                <w:szCs w:val="26"/>
-                <w:lang w:val="vi-VN"/>
-              </w:rPr>
-              <w:t>ho</w:t>
-            </w:r>
-            <w:r>
-              <w:rPr>
-                <w:rFonts w:ascii="Times New Roman" w:eastAsia="Times New Roman" w:hAnsi="Times New Roman" w:cs="Times New Roman"/>
-                <w:color w:val="000000" w:themeColor="text1"/>
-                <w:sz w:val="26"/>
-                <w:szCs w:val="26"/>
-                <w:lang w:val="vi-VN"/>
-              </w:rPr>
-              <w:t>}</w:t>
-            </w:r>
-          </w:p>
-        </w:tc>
-      </w:tr>
-    </w:tbl>
     <w:p>
       <w:pPr>
         <w:pStyle w:val="ListParagraph"/>
         <w:numPr>
           <w:ilvl w:val="0"/>
-          <w:numId w:val="3"/>
+          <w:numId w:val="4"/>
         </w:numPr>
         <w:spacing w:before="60" w:after="60" w:line="320" w:lineRule="exact"/>
         <w:jc w:val="both"/>
@@ -4379,7 +4093,6 @@
           <w:sz w:val="26"/>
           <w:szCs w:val="26"/>
           <w:shd w:val="clear" w:color="auto" w:fill="FFFFFF"/>
-          <w:lang w:val="vi-VN"/>
         </w:rPr>
       </w:pPr>
       <w:r>
@@ -4390,20 +4103,56 @@
           <w:sz w:val="26"/>
           <w:szCs w:val="26"/>
           <w:shd w:val="clear" w:color="auto" w:fill="FFFFFF"/>
-          <w:lang w:val="vi-VN"/>
-        </w:rPr>
-        <w:t xml:space="preserve">+ </w:t>
-      </w:r>
-      <w:r>
-        <w:rPr>
-          <w:rFonts w:ascii="Times New Roman" w:hAnsi="Times New Roman" w:cs="Times New Roman"/>
-          <w:color w:val="000000" w:themeColor="text1"/>
-          <w:spacing w:val="3"/>
-          <w:sz w:val="26"/>
-          <w:szCs w:val="26"/>
-          <w:shd w:val="clear" w:color="auto" w:fill="FFFFFF"/>
-        </w:rPr>
-        <w:t xml:space="preserve">Các </w:t>
+        </w:rPr>
+        <w:t xml:space="preserve">+ Các </w:t>
+      </w:r>
+      <w:proofErr w:type="spellStart"/>
+      <w:r>
+        <w:rPr>
+          <w:rFonts w:ascii="Times New Roman" w:hAnsi="Times New Roman" w:cs="Times New Roman"/>
+          <w:color w:val="000000" w:themeColor="text1"/>
+          <w:spacing w:val="3"/>
+          <w:sz w:val="26"/>
+          <w:szCs w:val="26"/>
+          <w:shd w:val="clear" w:color="auto" w:fill="FFFFFF"/>
+        </w:rPr>
+        <w:t>cửa</w:t>
+      </w:r>
+      <w:proofErr w:type="spellEnd"/>
+      <w:r>
+        <w:rPr>
+          <w:rFonts w:ascii="Times New Roman" w:hAnsi="Times New Roman" w:cs="Times New Roman"/>
+          <w:color w:val="000000" w:themeColor="text1"/>
+          <w:spacing w:val="3"/>
+          <w:sz w:val="26"/>
+          <w:szCs w:val="26"/>
+          <w:shd w:val="clear" w:color="auto" w:fill="FFFFFF"/>
+        </w:rPr>
+        <w:t xml:space="preserve"> </w:t>
+      </w:r>
+      <w:proofErr w:type="spellStart"/>
+      <w:r>
+        <w:rPr>
+          <w:rFonts w:ascii="Times New Roman" w:hAnsi="Times New Roman" w:cs="Times New Roman"/>
+          <w:color w:val="000000" w:themeColor="text1"/>
+          <w:spacing w:val="3"/>
+          <w:sz w:val="26"/>
+          <w:szCs w:val="26"/>
+          <w:shd w:val="clear" w:color="auto" w:fill="FFFFFF"/>
+        </w:rPr>
+        <w:t>phai</w:t>
+      </w:r>
+      <w:proofErr w:type="spellEnd"/>
+      <w:r>
+        <w:rPr>
+          <w:rFonts w:ascii="Times New Roman" w:hAnsi="Times New Roman" w:cs="Times New Roman"/>
+          <w:color w:val="000000" w:themeColor="text1"/>
+          <w:spacing w:val="3"/>
+          <w:sz w:val="26"/>
+          <w:szCs w:val="26"/>
+          <w:shd w:val="clear" w:color="auto" w:fill="FFFFFF"/>
+        </w:rPr>
+        <w:t xml:space="preserve">, </w:t>
       </w:r>
       <w:proofErr w:type="spellStart"/>
       <w:r>
@@ -4451,32 +4200,189 @@
           <w:szCs w:val="26"/>
           <w:shd w:val="clear" w:color="auto" w:fill="FFFFFF"/>
         </w:rPr>
-        <w:t>:</w:t>
-      </w:r>
-      <w:r>
-        <w:rPr>
-          <w:rFonts w:ascii="Times New Roman" w:hAnsi="Times New Roman" w:cs="Times New Roman"/>
-          <w:color w:val="000000" w:themeColor="text1"/>
-          <w:spacing w:val="3"/>
-          <w:sz w:val="26"/>
-          <w:szCs w:val="26"/>
-          <w:shd w:val="clear" w:color="auto" w:fill="FFFFFF"/>
-          <w:lang w:val="vi-VN"/>
-        </w:rPr>
-        <w:t xml:space="preserve"> {noi_dung_tram_bom</w:t>
-      </w:r>
-      <w:r>
-        <w:rPr>
-          <w:rFonts w:ascii="Times New Roman" w:hAnsi="Times New Roman" w:cs="Times New Roman"/>
-          <w:color w:val="000000" w:themeColor="text1"/>
-          <w:spacing w:val="3"/>
-          <w:sz w:val="26"/>
-          <w:szCs w:val="26"/>
-          <w:shd w:val="clear" w:color="auto" w:fill="FFFFFF"/>
-          <w:lang w:val="vi-VN"/>
-        </w:rPr>
-        <w:t>}</w:t>
-      </w:r>
+        <w:t xml:space="preserve"> </w:t>
+      </w:r>
+      <w:proofErr w:type="spellStart"/>
+      <w:r>
+        <w:rPr>
+          <w:rFonts w:ascii="Times New Roman" w:hAnsi="Times New Roman" w:cs="Times New Roman"/>
+          <w:color w:val="000000" w:themeColor="text1"/>
+          <w:spacing w:val="3"/>
+          <w:sz w:val="26"/>
+          <w:szCs w:val="26"/>
+          <w:shd w:val="clear" w:color="auto" w:fill="FFFFFF"/>
+        </w:rPr>
+        <w:t>được</w:t>
+      </w:r>
+      <w:proofErr w:type="spellEnd"/>
+      <w:r>
+        <w:rPr>
+          <w:rFonts w:ascii="Times New Roman" w:hAnsi="Times New Roman" w:cs="Times New Roman"/>
+          <w:color w:val="000000" w:themeColor="text1"/>
+          <w:spacing w:val="3"/>
+          <w:sz w:val="26"/>
+          <w:szCs w:val="26"/>
+          <w:shd w:val="clear" w:color="auto" w:fill="FFFFFF"/>
+        </w:rPr>
+        <w:t xml:space="preserve"> </w:t>
+      </w:r>
+      <w:proofErr w:type="spellStart"/>
+      <w:r>
+        <w:rPr>
+          <w:rFonts w:ascii="Times New Roman" w:hAnsi="Times New Roman" w:cs="Times New Roman"/>
+          <w:color w:val="000000" w:themeColor="text1"/>
+          <w:spacing w:val="3"/>
+          <w:sz w:val="26"/>
+          <w:szCs w:val="26"/>
+          <w:shd w:val="clear" w:color="auto" w:fill="FFFFFF"/>
+        </w:rPr>
+        <w:t>kịp</w:t>
+      </w:r>
+      <w:proofErr w:type="spellEnd"/>
+      <w:r>
+        <w:rPr>
+          <w:rFonts w:ascii="Times New Roman" w:hAnsi="Times New Roman" w:cs="Times New Roman"/>
+          <w:color w:val="000000" w:themeColor="text1"/>
+          <w:spacing w:val="3"/>
+          <w:sz w:val="26"/>
+          <w:szCs w:val="26"/>
+          <w:shd w:val="clear" w:color="auto" w:fill="FFFFFF"/>
+        </w:rPr>
+        <w:t xml:space="preserve"> </w:t>
+      </w:r>
+      <w:proofErr w:type="spellStart"/>
+      <w:r>
+        <w:rPr>
+          <w:rFonts w:ascii="Times New Roman" w:hAnsi="Times New Roman" w:cs="Times New Roman"/>
+          <w:color w:val="000000" w:themeColor="text1"/>
+          <w:spacing w:val="3"/>
+          <w:sz w:val="26"/>
+          <w:szCs w:val="26"/>
+          <w:shd w:val="clear" w:color="auto" w:fill="FFFFFF"/>
+        </w:rPr>
+        <w:t>thời</w:t>
+      </w:r>
+      <w:proofErr w:type="spellEnd"/>
+      <w:r>
+        <w:rPr>
+          <w:rFonts w:ascii="Times New Roman" w:hAnsi="Times New Roman" w:cs="Times New Roman"/>
+          <w:color w:val="000000" w:themeColor="text1"/>
+          <w:spacing w:val="3"/>
+          <w:sz w:val="26"/>
+          <w:szCs w:val="26"/>
+          <w:shd w:val="clear" w:color="auto" w:fill="FFFFFF"/>
+        </w:rPr>
+        <w:t xml:space="preserve"> </w:t>
+      </w:r>
+      <w:proofErr w:type="spellStart"/>
+      <w:r>
+        <w:rPr>
+          <w:rFonts w:ascii="Times New Roman" w:hAnsi="Times New Roman" w:cs="Times New Roman"/>
+          <w:color w:val="000000" w:themeColor="text1"/>
+          <w:spacing w:val="3"/>
+          <w:sz w:val="26"/>
+          <w:szCs w:val="26"/>
+          <w:shd w:val="clear" w:color="auto" w:fill="FFFFFF"/>
+        </w:rPr>
+        <w:t>vận</w:t>
+      </w:r>
+      <w:proofErr w:type="spellEnd"/>
+      <w:r>
+        <w:rPr>
+          <w:rFonts w:ascii="Times New Roman" w:hAnsi="Times New Roman" w:cs="Times New Roman"/>
+          <w:color w:val="000000" w:themeColor="text1"/>
+          <w:spacing w:val="3"/>
+          <w:sz w:val="26"/>
+          <w:szCs w:val="26"/>
+          <w:shd w:val="clear" w:color="auto" w:fill="FFFFFF"/>
+        </w:rPr>
+        <w:t xml:space="preserve"> </w:t>
+      </w:r>
+      <w:proofErr w:type="spellStart"/>
+      <w:r>
+        <w:rPr>
+          <w:rFonts w:ascii="Times New Roman" w:hAnsi="Times New Roman" w:cs="Times New Roman"/>
+          <w:color w:val="000000" w:themeColor="text1"/>
+          <w:spacing w:val="3"/>
+          <w:sz w:val="26"/>
+          <w:szCs w:val="26"/>
+          <w:shd w:val="clear" w:color="auto" w:fill="FFFFFF"/>
+        </w:rPr>
+        <w:t>hành</w:t>
+      </w:r>
+      <w:proofErr w:type="spellEnd"/>
+      <w:r>
+        <w:rPr>
+          <w:rFonts w:ascii="Times New Roman" w:hAnsi="Times New Roman" w:cs="Times New Roman"/>
+          <w:color w:val="000000" w:themeColor="text1"/>
+          <w:spacing w:val="3"/>
+          <w:sz w:val="26"/>
+          <w:szCs w:val="26"/>
+          <w:shd w:val="clear" w:color="auto" w:fill="FFFFFF"/>
+        </w:rPr>
+        <w:t xml:space="preserve"> </w:t>
+      </w:r>
+      <w:proofErr w:type="spellStart"/>
+      <w:r>
+        <w:rPr>
+          <w:rFonts w:ascii="Times New Roman" w:hAnsi="Times New Roman" w:cs="Times New Roman"/>
+          <w:color w:val="000000" w:themeColor="text1"/>
+          <w:spacing w:val="3"/>
+          <w:sz w:val="26"/>
+          <w:szCs w:val="26"/>
+          <w:shd w:val="clear" w:color="auto" w:fill="FFFFFF"/>
+        </w:rPr>
+        <w:t>đúng</w:t>
+      </w:r>
+      <w:proofErr w:type="spellEnd"/>
+      <w:r>
+        <w:rPr>
+          <w:rFonts w:ascii="Times New Roman" w:hAnsi="Times New Roman" w:cs="Times New Roman"/>
+          <w:color w:val="000000" w:themeColor="text1"/>
+          <w:spacing w:val="3"/>
+          <w:sz w:val="26"/>
+          <w:szCs w:val="26"/>
+          <w:shd w:val="clear" w:color="auto" w:fill="FFFFFF"/>
+        </w:rPr>
+        <w:t xml:space="preserve"> </w:t>
+      </w:r>
+      <w:proofErr w:type="spellStart"/>
+      <w:r>
+        <w:rPr>
+          <w:rFonts w:ascii="Times New Roman" w:hAnsi="Times New Roman" w:cs="Times New Roman"/>
+          <w:color w:val="000000" w:themeColor="text1"/>
+          <w:spacing w:val="3"/>
+          <w:sz w:val="26"/>
+          <w:szCs w:val="26"/>
+          <w:shd w:val="clear" w:color="auto" w:fill="FFFFFF"/>
+        </w:rPr>
+        <w:t>quy</w:t>
+      </w:r>
+      <w:proofErr w:type="spellEnd"/>
+      <w:r>
+        <w:rPr>
+          <w:rFonts w:ascii="Times New Roman" w:hAnsi="Times New Roman" w:cs="Times New Roman"/>
+          <w:color w:val="000000" w:themeColor="text1"/>
+          <w:spacing w:val="3"/>
+          <w:sz w:val="26"/>
+          <w:szCs w:val="26"/>
+          <w:shd w:val="clear" w:color="auto" w:fill="FFFFFF"/>
+        </w:rPr>
+        <w:t xml:space="preserve"> </w:t>
+      </w:r>
+      <w:proofErr w:type="spellStart"/>
+      <w:r>
+        <w:rPr>
+          <w:rFonts w:ascii="Times New Roman" w:hAnsi="Times New Roman" w:cs="Times New Roman"/>
+          <w:color w:val="000000" w:themeColor="text1"/>
+          <w:spacing w:val="3"/>
+          <w:sz w:val="26"/>
+          <w:szCs w:val="26"/>
+          <w:shd w:val="clear" w:color="auto" w:fill="FFFFFF"/>
+        </w:rPr>
+        <w:t>trình</w:t>
+      </w:r>
+      <w:proofErr w:type="spellEnd"/>
     </w:p>
     <w:p>
       <w:pPr>
@@ -4490,6 +4396,7 @@
           <w:sz w:val="26"/>
           <w:szCs w:val="26"/>
           <w:shd w:val="clear" w:color="auto" w:fill="FFFFFF"/>
+          <w:lang w:val="vi-VN"/>
         </w:rPr>
       </w:pPr>
       <w:r>
@@ -4501,199 +4408,7 @@
           <w:szCs w:val="26"/>
           <w:shd w:val="clear" w:color="auto" w:fill="FFFFFF"/>
         </w:rPr>
-        <w:t xml:space="preserve">+ Các </w:t>
-      </w:r>
-      <w:proofErr w:type="spellStart"/>
-      <w:r>
-        <w:rPr>
-          <w:rFonts w:ascii="Times New Roman" w:hAnsi="Times New Roman" w:cs="Times New Roman"/>
-          <w:color w:val="000000" w:themeColor="text1"/>
-          <w:spacing w:val="3"/>
-          <w:sz w:val="26"/>
-          <w:szCs w:val="26"/>
-          <w:shd w:val="clear" w:color="auto" w:fill="FFFFFF"/>
-        </w:rPr>
-        <w:t>cửa</w:t>
-      </w:r>
-      <w:proofErr w:type="spellEnd"/>
-      <w:r>
-        <w:rPr>
-          <w:rFonts w:ascii="Times New Roman" w:hAnsi="Times New Roman" w:cs="Times New Roman"/>
-          <w:color w:val="000000" w:themeColor="text1"/>
-          <w:spacing w:val="3"/>
-          <w:sz w:val="26"/>
-          <w:szCs w:val="26"/>
-          <w:shd w:val="clear" w:color="auto" w:fill="FFFFFF"/>
-        </w:rPr>
-        <w:t xml:space="preserve"> </w:t>
-      </w:r>
-      <w:proofErr w:type="spellStart"/>
-      <w:r>
-        <w:rPr>
-          <w:rFonts w:ascii="Times New Roman" w:hAnsi="Times New Roman" w:cs="Times New Roman"/>
-          <w:color w:val="000000" w:themeColor="text1"/>
-          <w:spacing w:val="3"/>
-          <w:sz w:val="26"/>
-          <w:szCs w:val="26"/>
-          <w:shd w:val="clear" w:color="auto" w:fill="FFFFFF"/>
-        </w:rPr>
-        <w:t>phai</w:t>
-      </w:r>
-      <w:proofErr w:type="spellEnd"/>
-      <w:r>
-        <w:rPr>
-          <w:rFonts w:ascii="Times New Roman" w:hAnsi="Times New Roman" w:cs="Times New Roman"/>
-          <w:color w:val="000000" w:themeColor="text1"/>
-          <w:spacing w:val="3"/>
-          <w:sz w:val="26"/>
-          <w:szCs w:val="26"/>
-          <w:shd w:val="clear" w:color="auto" w:fill="FFFFFF"/>
-        </w:rPr>
-        <w:t xml:space="preserve"> </w:t>
-      </w:r>
-      <w:proofErr w:type="spellStart"/>
-      <w:r>
-        <w:rPr>
-          <w:rFonts w:ascii="Times New Roman" w:hAnsi="Times New Roman" w:cs="Times New Roman"/>
-          <w:color w:val="000000" w:themeColor="text1"/>
-          <w:spacing w:val="3"/>
-          <w:sz w:val="26"/>
-          <w:szCs w:val="26"/>
-          <w:shd w:val="clear" w:color="auto" w:fill="FFFFFF"/>
-        </w:rPr>
-        <w:t>vận</w:t>
-      </w:r>
-      <w:proofErr w:type="spellEnd"/>
-      <w:r>
-        <w:rPr>
-          <w:rFonts w:ascii="Times New Roman" w:hAnsi="Times New Roman" w:cs="Times New Roman"/>
-          <w:color w:val="000000" w:themeColor="text1"/>
-          <w:spacing w:val="3"/>
-          <w:sz w:val="26"/>
-          <w:szCs w:val="26"/>
-          <w:shd w:val="clear" w:color="auto" w:fill="FFFFFF"/>
-        </w:rPr>
-        <w:t xml:space="preserve"> </w:t>
-      </w:r>
-      <w:proofErr w:type="spellStart"/>
-      <w:r>
-        <w:rPr>
-          <w:rFonts w:ascii="Times New Roman" w:hAnsi="Times New Roman" w:cs="Times New Roman"/>
-          <w:color w:val="000000" w:themeColor="text1"/>
-          <w:spacing w:val="3"/>
-          <w:sz w:val="26"/>
-          <w:szCs w:val="26"/>
-          <w:shd w:val="clear" w:color="auto" w:fill="FFFFFF"/>
-        </w:rPr>
-        <w:t>hành</w:t>
-      </w:r>
-      <w:proofErr w:type="spellEnd"/>
-      <w:r>
-        <w:rPr>
-          <w:rFonts w:ascii="Times New Roman" w:hAnsi="Times New Roman" w:cs="Times New Roman"/>
-          <w:color w:val="000000" w:themeColor="text1"/>
-          <w:spacing w:val="3"/>
-          <w:sz w:val="26"/>
-          <w:szCs w:val="26"/>
-          <w:shd w:val="clear" w:color="auto" w:fill="FFFFFF"/>
-        </w:rPr>
-        <w:t xml:space="preserve"> </w:t>
-      </w:r>
-      <w:proofErr w:type="spellStart"/>
-      <w:r>
-        <w:rPr>
-          <w:rFonts w:ascii="Times New Roman" w:hAnsi="Times New Roman" w:cs="Times New Roman"/>
-          <w:color w:val="000000" w:themeColor="text1"/>
-          <w:spacing w:val="3"/>
-          <w:sz w:val="26"/>
-          <w:szCs w:val="26"/>
-          <w:shd w:val="clear" w:color="auto" w:fill="FFFFFF"/>
-        </w:rPr>
-        <w:t>đúng</w:t>
-      </w:r>
-      <w:proofErr w:type="spellEnd"/>
-      <w:r>
-        <w:rPr>
-          <w:rFonts w:ascii="Times New Roman" w:hAnsi="Times New Roman" w:cs="Times New Roman"/>
-          <w:color w:val="000000" w:themeColor="text1"/>
-          <w:spacing w:val="3"/>
-          <w:sz w:val="26"/>
-          <w:szCs w:val="26"/>
-          <w:shd w:val="clear" w:color="auto" w:fill="FFFFFF"/>
-        </w:rPr>
-        <w:t xml:space="preserve"> </w:t>
-      </w:r>
-      <w:proofErr w:type="spellStart"/>
-      <w:r>
-        <w:rPr>
-          <w:rFonts w:ascii="Times New Roman" w:hAnsi="Times New Roman" w:cs="Times New Roman"/>
-          <w:color w:val="000000" w:themeColor="text1"/>
-          <w:spacing w:val="3"/>
-          <w:sz w:val="26"/>
-          <w:szCs w:val="26"/>
-          <w:shd w:val="clear" w:color="auto" w:fill="FFFFFF"/>
-        </w:rPr>
-        <w:t>quy</w:t>
-      </w:r>
-      <w:proofErr w:type="spellEnd"/>
-      <w:r>
-        <w:rPr>
-          <w:rFonts w:ascii="Times New Roman" w:hAnsi="Times New Roman" w:cs="Times New Roman"/>
-          <w:color w:val="000000" w:themeColor="text1"/>
-          <w:spacing w:val="3"/>
-          <w:sz w:val="26"/>
-          <w:szCs w:val="26"/>
-          <w:shd w:val="clear" w:color="auto" w:fill="FFFFFF"/>
-        </w:rPr>
-        <w:t xml:space="preserve"> </w:t>
-      </w:r>
-      <w:proofErr w:type="spellStart"/>
-      <w:r>
-        <w:rPr>
-          <w:rFonts w:ascii="Times New Roman" w:hAnsi="Times New Roman" w:cs="Times New Roman"/>
-          <w:color w:val="000000" w:themeColor="text1"/>
-          <w:spacing w:val="3"/>
-          <w:sz w:val="26"/>
-          <w:szCs w:val="26"/>
-          <w:shd w:val="clear" w:color="auto" w:fill="FFFFFF"/>
-        </w:rPr>
-        <w:t>trình</w:t>
-      </w:r>
-      <w:proofErr w:type="spellEnd"/>
-      <w:r>
-        <w:rPr>
-          <w:rFonts w:ascii="Times New Roman" w:hAnsi="Times New Roman" w:cs="Times New Roman"/>
-          <w:color w:val="000000" w:themeColor="text1"/>
-          <w:spacing w:val="3"/>
-          <w:sz w:val="26"/>
-          <w:szCs w:val="26"/>
-          <w:shd w:val="clear" w:color="auto" w:fill="FFFFFF"/>
-        </w:rPr>
-        <w:t xml:space="preserve">, </w:t>
-      </w:r>
-      <w:proofErr w:type="spellStart"/>
-      <w:r>
-        <w:rPr>
-          <w:rFonts w:ascii="Times New Roman" w:hAnsi="Times New Roman" w:cs="Times New Roman"/>
-          <w:color w:val="000000" w:themeColor="text1"/>
-          <w:spacing w:val="3"/>
-          <w:sz w:val="26"/>
-          <w:szCs w:val="26"/>
-          <w:shd w:val="clear" w:color="auto" w:fill="FFFFFF"/>
-        </w:rPr>
-        <w:t>bảo</w:t>
-      </w:r>
-      <w:proofErr w:type="spellEnd"/>
-      <w:r>
-        <w:rPr>
-          <w:rFonts w:ascii="Times New Roman" w:hAnsi="Times New Roman" w:cs="Times New Roman"/>
-          <w:color w:val="000000" w:themeColor="text1"/>
-          <w:spacing w:val="3"/>
-          <w:sz w:val="26"/>
-          <w:szCs w:val="26"/>
-          <w:shd w:val="clear" w:color="auto" w:fill="FFFFFF"/>
-        </w:rPr>
-        <w:t xml:space="preserve"> </w:t>
+        <w:t xml:space="preserve">+ Bảo </w:t>
       </w:r>
       <w:proofErr w:type="spellStart"/>
       <w:r>
@@ -4935,13 +4650,29 @@
         </w:rPr>
         <w:t xml:space="preserve">. </w:t>
       </w:r>
+    </w:p>
+    <w:p>
+      <w:pPr>
+        <w:spacing w:before="60" w:after="60" w:line="240" w:lineRule="auto"/>
+        <w:ind w:firstLine="284"/>
+        <w:jc w:val="both"/>
+        <w:rPr>
+          <w:rFonts w:ascii="Times New Roman" w:hAnsi="Times New Roman" w:cs="Times New Roman"/>
+          <w:color w:val="EE0000"/>
+          <w:spacing w:val="3"/>
+          <w:sz w:val="26"/>
+          <w:szCs w:val="26"/>
+          <w:shd w:val="clear" w:color="auto" w:fill="FFFFFF"/>
+          <w:lang w:val="vi-VN"/>
+        </w:rPr>
+      </w:pPr>
     </w:p>
     <w:p>
       <w:pPr>
         <w:pStyle w:val="ListParagraph"/>
         <w:numPr>
           <w:ilvl w:val="0"/>
-          <w:numId w:val="3"/>
+          <w:numId w:val="4"/>
         </w:numPr>
         <w:spacing w:before="60" w:after="60" w:line="320" w:lineRule="exact"/>
         <w:ind w:left="0" w:firstLine="360"/>
@@ -7339,6 +7070,54 @@
         <w:jc w:val="both"/>
         <w:rPr>
           <w:rFonts w:ascii="Times New Roman" w:hAnsi="Times New Roman" w:cs="Times New Roman"/>
+          <w:color w:val="000000" w:themeColor="text1"/>
+          <w:spacing w:val="3"/>
+          <w:sz w:val="26"/>
+          <w:szCs w:val="26"/>
+          <w:shd w:val="clear" w:color="auto" w:fill="FFFFFF"/>
+          <w:lang w:val="vi-VN"/>
+        </w:rPr>
+      </w:pPr>
+    </w:p>
+    <w:p>
+      <w:pPr>
+        <w:spacing w:before="144" w:after="144" w:line="240" w:lineRule="auto"/>
+        <w:ind w:firstLine="426"/>
+        <w:jc w:val="both"/>
+        <w:rPr>
+          <w:rFonts w:ascii="Times New Roman" w:hAnsi="Times New Roman" w:cs="Times New Roman"/>
+          <w:color w:val="000000" w:themeColor="text1"/>
+          <w:spacing w:val="3"/>
+          <w:sz w:val="26"/>
+          <w:szCs w:val="26"/>
+          <w:shd w:val="clear" w:color="auto" w:fill="FFFFFF"/>
+          <w:lang w:val="vi-VN"/>
+        </w:rPr>
+      </w:pPr>
+    </w:p>
+    <w:p>
+      <w:pPr>
+        <w:spacing w:before="144" w:after="144" w:line="240" w:lineRule="auto"/>
+        <w:ind w:firstLine="426"/>
+        <w:jc w:val="both"/>
+        <w:rPr>
+          <w:rFonts w:ascii="Times New Roman" w:hAnsi="Times New Roman" w:cs="Times New Roman"/>
+          <w:color w:val="000000" w:themeColor="text1"/>
+          <w:spacing w:val="3"/>
+          <w:sz w:val="26"/>
+          <w:szCs w:val="26"/>
+          <w:shd w:val="clear" w:color="auto" w:fill="FFFFFF"/>
+          <w:lang w:val="vi-VN"/>
+        </w:rPr>
+      </w:pPr>
+    </w:p>
+    <w:p>
+      <w:pPr>
+        <w:spacing w:before="144" w:after="144" w:line="240" w:lineRule="auto"/>
+        <w:ind w:firstLine="426"/>
+        <w:jc w:val="both"/>
+        <w:rPr>
+          <w:rFonts w:ascii="Times New Roman" w:hAnsi="Times New Roman" w:cs="Times New Roman"/>
           <w:i/>
           <w:color w:val="000000" w:themeColor="text1"/>
           <w:sz w:val="26"/>
@@ -7969,6 +7748,7 @@
           <w:color w:val="000000" w:themeColor="text1"/>
           <w:sz w:val="26"/>
           <w:szCs w:val="26"/>
+          <w:lang w:val="vi-VN"/>
         </w:rPr>
       </w:pPr>
       <w:r>
@@ -8134,6 +7914,21 @@
         </w:rPr>
         <w:t>./.</w:t>
       </w:r>
+    </w:p>
+    <w:p>
+      <w:pPr>
+        <w:spacing w:before="40" w:after="40" w:line="320" w:lineRule="exact"/>
+        <w:ind w:firstLine="426"/>
+        <w:jc w:val="both"/>
+        <w:rPr>
+          <w:rFonts w:ascii="Times New Roman" w:hAnsi="Times New Roman" w:cs="Times New Roman"/>
+          <w:i/>
+          <w:color w:val="000000" w:themeColor="text1"/>
+          <w:sz w:val="26"/>
+          <w:szCs w:val="26"/>
+          <w:lang w:val="vi-VN"/>
+        </w:rPr>
+      </w:pPr>
     </w:p>
     <w:tbl>
       <w:tblPr>
@@ -8293,7 +8088,7 @@
                     </wp:anchor>
                   </w:drawing>
                 </mc:Choice>
-                <mc:Fallback>
+                <mc:Fallback xmlns:w16cei="http://schemas.microsoft.com/office/word/2026/wordml/cei">
                   <w:pict>
                     <v:line xmlns:o="urn:schemas-microsoft-com:office:office" id="Straight Connector 2" o:spid="_x0000_s1028" style="position:absolute;z-index:3;mso-wrap-distance-left:9pt;mso-wrap-distance-top:0pt;mso-wrap-distance-right:9pt;mso-wrap-distance-bottom:0pt;mso-position-horizontal:absolute;mso-position-horizontal-relative:text;mso-position-vertical:absolute;mso-position-vertical-relative:text" filled="f" strokecolor="#000000" strokeweight="0.75pt" stroked="t" o:allowincell="t" from="0,0" to="0,800100">
                       <o:lock shapetype="t"/>
@@ -8472,7 +8267,35 @@
                               <w:rPr>
                                 <w:rFonts w:ascii="Times New Roman" w:hAnsi="Times New Roman" w:cs="Times New Roman"/>
                               </w:rPr>
-                              <w:t>(Để b/cáo)</w:t>
+                              <w:t>(</w:t>
+                            </w:r>
+                            <w:proofErr w:type="spellStart"/>
+                            <w:r>
+                              <w:rPr>
+                                <w:rFonts w:ascii="Times New Roman" w:hAnsi="Times New Roman" w:cs="Times New Roman"/>
+                              </w:rPr>
+                              <w:t>Để</w:t>
+                            </w:r>
+                            <w:proofErr w:type="spellEnd"/>
+                            <w:r>
+                              <w:rPr>
+                                <w:rFonts w:ascii="Times New Roman" w:hAnsi="Times New Roman" w:cs="Times New Roman"/>
+                              </w:rPr>
+                              <w:t xml:space="preserve"> b/</w:t>
+                            </w:r>
+                            <w:proofErr w:type="spellStart"/>
+                            <w:r>
+                              <w:rPr>
+                                <w:rFonts w:ascii="Times New Roman" w:hAnsi="Times New Roman" w:cs="Times New Roman"/>
+                              </w:rPr>
+                              <w:t>cáo</w:t>
+                            </w:r>
+                            <w:proofErr w:type="spellEnd"/>
+                            <w:r>
+                              <w:rPr>
+                                <w:rFonts w:ascii="Times New Roman" w:hAnsi="Times New Roman" w:cs="Times New Roman"/>
+                              </w:rPr>
+                              <w:t>)</w:t>
                             </w:r>
                           </w:p>
                         </w:txbxContent>
@@ -8964,9 +8787,252 @@
         </w:rPr>
       </w:pPr>
     </w:p>
+    <w:p/>
+    <w:p/>
+    <w:p/>
+    <w:p/>
+    <w:p/>
+    <w:p/>
+    <w:p/>
+    <w:p/>
+    <w:p/>
+    <w:p/>
+    <w:p/>
+    <w:p/>
+    <w:p/>
+    <w:p/>
+    <w:p/>
+    <w:p/>
+    <w:p/>
+    <w:p/>
+    <w:p/>
+    <w:p/>
+    <w:p/>
+    <w:p/>
     <w:p>
       <w:pPr>
         <w:rPr>
+          <w:rFonts w:ascii="Times New Roman" w:hAnsi="Times New Roman" w:cs="Times New Roman"/>
+          <w:b/>
+          <w:bCs/>
+          <w:lang w:val="vi-VN"/>
+        </w:rPr>
+      </w:pPr>
+    </w:p>
+    <w:p>
+      <w:pPr>
+        <w:jc w:val="center"/>
+        <w:rPr>
+          <w:rFonts w:ascii="Times New Roman" w:hAnsi="Times New Roman" w:cs="Times New Roman"/>
+          <w:b/>
+          <w:bCs/>
+        </w:rPr>
+      </w:pPr>
+      <w:r>
+        <w:rPr>
+          <w:rFonts w:ascii="Times New Roman" w:hAnsi="Times New Roman" w:cs="Times New Roman"/>
+          <w:b/>
+          <w:bCs/>
+        </w:rPr>
+        <w:lastRenderedPageBreak/>
+        <w:t>PHỤ LỤC 01: TỔNG HỢP LƯỢNG MƯA KHU VỰC CÁC PHƯỜNG</w:t>
+      </w:r>
+      <w:r>
+        <w:rPr>
+          <w:rFonts w:ascii="Times New Roman" w:hAnsi="Times New Roman" w:cs="Times New Roman"/>
+          <w:b/>
+          <w:bCs/>
+        </w:rPr>
+        <w:t>, XÃ</w:t>
+      </w:r>
+    </w:p>
+    <w:p>
+      <w:pPr>
+        <w:spacing w:after="120" w:line="240" w:lineRule="auto"/>
+        <w:contextualSpacing/>
+        <w:jc w:val="center"/>
+        <w:rPr>
+          <w:rFonts w:ascii="Times New Roman" w:hAnsi="Times New Roman" w:cs="Times New Roman"/>
+          <w:color w:val="000000" w:themeColor="text1"/>
+          <w:sz w:val="26"/>
+          <w:szCs w:val="26"/>
+          <w:lang w:val="vi-VN"/>
+        </w:rPr>
+      </w:pPr>
+      <w:proofErr w:type="spellStart"/>
+      <w:r>
+        <w:rPr>
+          <w:rFonts w:ascii="Times New Roman" w:eastAsia="Times New Roman" w:hAnsi="Times New Roman" w:cs="Times New Roman"/>
+          <w:color w:val="000000"/>
+          <w:sz w:val="26"/>
+          <w:szCs w:val="26"/>
+        </w:rPr>
+        <w:t>Thời</w:t>
+      </w:r>
+      <w:proofErr w:type="spellEnd"/>
+      <w:r>
+        <w:rPr>
+          <w:rFonts w:ascii="Times New Roman" w:eastAsia="Times New Roman" w:hAnsi="Times New Roman" w:cs="Times New Roman"/>
+          <w:color w:val="000000"/>
+          <w:sz w:val="26"/>
+          <w:szCs w:val="26"/>
+        </w:rPr>
+        <w:t xml:space="preserve"> </w:t>
+      </w:r>
+      <w:proofErr w:type="spellStart"/>
+      <w:r>
+        <w:rPr>
+          <w:rFonts w:ascii="Times New Roman" w:eastAsia="Times New Roman" w:hAnsi="Times New Roman" w:cs="Times New Roman"/>
+          <w:color w:val="000000"/>
+          <w:sz w:val="26"/>
+          <w:szCs w:val="26"/>
+        </w:rPr>
+        <w:t>điểm</w:t>
+      </w:r>
+      <w:proofErr w:type="spellEnd"/>
+      <w:r>
+        <w:rPr>
+          <w:rFonts w:ascii="Times New Roman" w:eastAsia="Times New Roman" w:hAnsi="Times New Roman" w:cs="Times New Roman"/>
+          <w:color w:val="000000"/>
+          <w:sz w:val="26"/>
+          <w:szCs w:val="26"/>
+        </w:rPr>
+        <w:t xml:space="preserve"> </w:t>
+      </w:r>
+      <w:proofErr w:type="spellStart"/>
+      <w:r>
+        <w:rPr>
+          <w:rFonts w:ascii="Times New Roman" w:eastAsia="Times New Roman" w:hAnsi="Times New Roman" w:cs="Times New Roman"/>
+          <w:color w:val="000000"/>
+          <w:sz w:val="26"/>
+          <w:szCs w:val="26"/>
+        </w:rPr>
+        <w:t>tổng</w:t>
+      </w:r>
+      <w:proofErr w:type="spellEnd"/>
+      <w:r>
+        <w:rPr>
+          <w:rFonts w:ascii="Times New Roman" w:eastAsia="Times New Roman" w:hAnsi="Times New Roman" w:cs="Times New Roman"/>
+          <w:color w:val="000000"/>
+          <w:sz w:val="26"/>
+          <w:szCs w:val="26"/>
+        </w:rPr>
+        <w:t xml:space="preserve"> </w:t>
+      </w:r>
+      <w:proofErr w:type="spellStart"/>
+      <w:r>
+        <w:rPr>
+          <w:rFonts w:ascii="Times New Roman" w:eastAsia="Times New Roman" w:hAnsi="Times New Roman" w:cs="Times New Roman"/>
+          <w:color w:val="000000"/>
+          <w:sz w:val="26"/>
+          <w:szCs w:val="26"/>
+        </w:rPr>
+        <w:t>hợp</w:t>
+      </w:r>
+      <w:proofErr w:type="spellEnd"/>
+      <w:r>
+        <w:rPr>
+          <w:rFonts w:ascii="Times New Roman" w:eastAsia="Times New Roman" w:hAnsi="Times New Roman" w:cs="Times New Roman"/>
+          <w:color w:val="000000"/>
+          <w:sz w:val="26"/>
+          <w:szCs w:val="26"/>
+        </w:rPr>
+        <w:t>: {</w:t>
+      </w:r>
+      <w:proofErr w:type="spellStart"/>
+      <w:r>
+        <w:rPr>
+          <w:rFonts w:ascii="Times New Roman" w:eastAsia="Times New Roman" w:hAnsi="Times New Roman" w:cs="Times New Roman"/>
+          <w:color w:val="000000"/>
+          <w:sz w:val="26"/>
+          <w:szCs w:val="26"/>
+        </w:rPr>
+        <w:t>hh</w:t>
+      </w:r>
+      <w:proofErr w:type="spellEnd"/>
+      <w:r>
+        <w:rPr>
+          <w:rFonts w:ascii="Times New Roman" w:eastAsia="Times New Roman" w:hAnsi="Times New Roman" w:cs="Times New Roman"/>
+          <w:color w:val="000000"/>
+          <w:sz w:val="26"/>
+          <w:szCs w:val="26"/>
+        </w:rPr>
+        <w:t>}</w:t>
+      </w:r>
+      <w:r>
+        <w:rPr>
+          <w:rFonts w:ascii="Times New Roman" w:eastAsia="Times New Roman" w:hAnsi="Times New Roman" w:cs="Times New Roman"/>
+          <w:color w:val="000000"/>
+          <w:sz w:val="26"/>
+          <w:szCs w:val="26"/>
+          <w:lang w:val="vi-VN"/>
+        </w:rPr>
+        <w:t xml:space="preserve"> </w:t>
+      </w:r>
+      <w:proofErr w:type="spellStart"/>
+      <w:r>
+        <w:rPr>
+          <w:rFonts w:ascii="Times New Roman" w:eastAsia="Times New Roman" w:hAnsi="Times New Roman" w:cs="Times New Roman"/>
+          <w:color w:val="000000"/>
+          <w:sz w:val="26"/>
+          <w:szCs w:val="26"/>
+        </w:rPr>
+        <w:t>ngày</w:t>
+      </w:r>
+      <w:proofErr w:type="spellEnd"/>
+      <w:r>
+        <w:rPr>
+          <w:rFonts w:ascii="Times New Roman" w:eastAsia="Times New Roman" w:hAnsi="Times New Roman" w:cs="Times New Roman"/>
+          <w:color w:val="000000"/>
+          <w:sz w:val="26"/>
+          <w:szCs w:val="26"/>
+        </w:rPr>
+        <w:t xml:space="preserve"> </w:t>
+      </w:r>
+      <w:r>
+        <w:rPr>
+          <w:rFonts w:ascii="Times New Roman" w:hAnsi="Times New Roman" w:cs="Times New Roman"/>
+          <w:sz w:val="26"/>
+          <w:szCs w:val="26"/>
+        </w:rPr>
+        <w:t>{dd}/{mm}/{</w:t>
+      </w:r>
+      <w:proofErr w:type="spellStart"/>
+      <w:r>
+        <w:rPr>
+          <w:rFonts w:ascii="Times New Roman" w:hAnsi="Times New Roman" w:cs="Times New Roman"/>
+          <w:sz w:val="26"/>
+          <w:szCs w:val="26"/>
+        </w:rPr>
+        <w:t>yyyy</w:t>
+      </w:r>
+      <w:proofErr w:type="spellEnd"/>
+      <w:r>
+        <w:rPr>
+          <w:rFonts w:ascii="Times New Roman" w:hAnsi="Times New Roman" w:cs="Times New Roman"/>
+          <w:sz w:val="26"/>
+          <w:szCs w:val="26"/>
+        </w:rPr>
+        <w:t>}</w:t>
+      </w:r>
+    </w:p>
+    <w:p>
+      <w:pPr>
+        <w:pBdr>
+          <w:top w:val="nil"/>
+          <w:left w:val="nil"/>
+          <w:bottom w:val="nil"/>
+          <w:right w:val="nil"/>
+          <w:between w:val="nil"/>
+        </w:pBdr>
+        <w:spacing w:before="60" w:after="60" w:line="320" w:lineRule="auto"/>
+        <w:ind w:left="360"/>
+        <w:jc w:val="center"/>
+        <w:rPr>
+          <w:rFonts w:ascii="Times New Roman" w:eastAsia="Times New Roman" w:hAnsi="Times New Roman" w:cs="Times New Roman"/>
+          <w:color w:val="000000"/>
+          <w:sz w:val="26"/>
+          <w:szCs w:val="26"/>
           <w:lang w:val="vi-VN"/>
         </w:rPr>
       </w:pPr>
@@ -8974,65 +9040,52 @@
     <w:p>
       <w:pPr>
         <w:pStyle w:val="ListParagraph"/>
+        <w:numPr>
+          <w:ilvl w:val="3"/>
+          <w:numId w:val="4"/>
+        </w:numPr>
+        <w:tabs>
+          <w:tab w:val="left" w:pos="810"/>
+        </w:tabs>
         <w:spacing w:before="60" w:after="60" w:line="320" w:lineRule="exact"/>
-        <w:ind w:left="360"/>
-        <w:jc w:val="both"/>
-        <w:rPr>
-          <w:rFonts w:ascii="Times New Roman" w:eastAsia="Times New Roman" w:hAnsi="Times New Roman" w:cs="Times New Roman"/>
+        <w:ind w:left="0" w:firstLine="540"/>
+        <w:rPr>
+          <w:rFonts w:ascii="Times New Roman" w:eastAsia="Times New Roman" w:hAnsi="Times New Roman" w:cs="Times New Roman"/>
+          <w:b/>
+          <w:bCs/>
           <w:sz w:val="26"/>
           <w:szCs w:val="26"/>
           <w:lang w:val="vi-VN"/>
         </w:rPr>
       </w:pPr>
-      <w:r>
-        <w:rPr>
-          <w:rFonts w:ascii="Times New Roman" w:eastAsia="Times New Roman" w:hAnsi="Times New Roman" w:cs="Times New Roman"/>
-          <w:sz w:val="26"/>
-          <w:szCs w:val="26"/>
-          <w:lang w:val="vi-VN"/>
-        </w:rPr>
-        <w:t xml:space="preserve"> </w:t>
-      </w:r>
-      <w:proofErr w:type="spellStart"/>
-      <w:r>
-        <w:rPr>
-          <w:rFonts w:ascii="Times New Roman" w:eastAsia="Times New Roman" w:hAnsi="Times New Roman" w:cs="Times New Roman"/>
-          <w:sz w:val="26"/>
-          <w:szCs w:val="26"/>
-        </w:rPr>
-        <w:t>Số</w:t>
-      </w:r>
-      <w:proofErr w:type="spellEnd"/>
-      <w:r>
-        <w:rPr>
-          <w:rFonts w:ascii="Times New Roman" w:eastAsia="Times New Roman" w:hAnsi="Times New Roman" w:cs="Times New Roman"/>
-          <w:sz w:val="26"/>
-          <w:szCs w:val="26"/>
-        </w:rPr>
-        <w:t xml:space="preserve"> </w:t>
-      </w:r>
-      <w:proofErr w:type="spellStart"/>
-      <w:r>
-        <w:rPr>
-          <w:rFonts w:ascii="Times New Roman" w:eastAsia="Times New Roman" w:hAnsi="Times New Roman" w:cs="Times New Roman"/>
-          <w:sz w:val="26"/>
-          <w:szCs w:val="26"/>
-        </w:rPr>
-        <w:t>liệu</w:t>
-      </w:r>
-      <w:proofErr w:type="spellEnd"/>
-      <w:r>
-        <w:rPr>
-          <w:rFonts w:ascii="Times New Roman" w:eastAsia="Times New Roman" w:hAnsi="Times New Roman" w:cs="Times New Roman"/>
-          <w:sz w:val="26"/>
-          <w:szCs w:val="26"/>
-        </w:rPr>
-        <w:t xml:space="preserve"> </w:t>
-      </w:r>
-      <w:proofErr w:type="spellStart"/>
-      <w:r>
-        <w:rPr>
-          <w:rFonts w:ascii="Times New Roman" w:eastAsia="Times New Roman" w:hAnsi="Times New Roman" w:cs="Times New Roman"/>
+      <w:proofErr w:type="spellStart"/>
+      <w:r>
+        <w:rPr>
+          <w:rFonts w:ascii="Times New Roman" w:eastAsia="Times New Roman" w:hAnsi="Times New Roman" w:cs="Times New Roman"/>
+          <w:b/>
+          <w:bCs/>
+          <w:sz w:val="26"/>
+          <w:szCs w:val="26"/>
+        </w:rPr>
+        <w:t>Lượng</w:t>
+      </w:r>
+      <w:proofErr w:type="spellEnd"/>
+      <w:r>
+        <w:rPr>
+          <w:rFonts w:ascii="Times New Roman" w:eastAsia="Times New Roman" w:hAnsi="Times New Roman" w:cs="Times New Roman"/>
+          <w:b/>
+          <w:bCs/>
+          <w:sz w:val="26"/>
+          <w:szCs w:val="26"/>
+        </w:rPr>
+        <w:t xml:space="preserve"> </w:t>
+      </w:r>
+      <w:proofErr w:type="spellStart"/>
+      <w:r>
+        <w:rPr>
+          <w:rFonts w:ascii="Times New Roman" w:eastAsia="Times New Roman" w:hAnsi="Times New Roman" w:cs="Times New Roman"/>
+          <w:b/>
+          <w:bCs/>
           <w:sz w:val="26"/>
           <w:szCs w:val="26"/>
         </w:rPr>
@@ -9042,15 +9095,63 @@
       <w:r>
         <w:rPr>
           <w:rFonts w:ascii="Times New Roman" w:eastAsia="Times New Roman" w:hAnsi="Times New Roman" w:cs="Times New Roman"/>
-          <w:sz w:val="26"/>
-          <w:szCs w:val="26"/>
-        </w:rPr>
-        <w:t xml:space="preserve"> </w:t>
-      </w:r>
-      <w:proofErr w:type="spellStart"/>
-      <w:r>
-        <w:rPr>
-          <w:rFonts w:ascii="Times New Roman" w:eastAsia="Times New Roman" w:hAnsi="Times New Roman" w:cs="Times New Roman"/>
+          <w:b/>
+          <w:bCs/>
+          <w:sz w:val="26"/>
+          <w:szCs w:val="26"/>
+        </w:rPr>
+        <w:t xml:space="preserve"> chi </w:t>
+      </w:r>
+      <w:proofErr w:type="spellStart"/>
+      <w:r>
+        <w:rPr>
+          <w:rFonts w:ascii="Times New Roman" w:eastAsia="Times New Roman" w:hAnsi="Times New Roman" w:cs="Times New Roman"/>
+          <w:b/>
+          <w:bCs/>
+          <w:sz w:val="26"/>
+          <w:szCs w:val="26"/>
+        </w:rPr>
+        <w:t>tiết</w:t>
+      </w:r>
+      <w:proofErr w:type="spellEnd"/>
+      <w:r>
+        <w:rPr>
+          <w:rFonts w:ascii="Times New Roman" w:eastAsia="Times New Roman" w:hAnsi="Times New Roman" w:cs="Times New Roman"/>
+          <w:b/>
+          <w:bCs/>
+          <w:sz w:val="26"/>
+          <w:szCs w:val="26"/>
+        </w:rPr>
+        <w:t xml:space="preserve"> </w:t>
+      </w:r>
+      <w:proofErr w:type="spellStart"/>
+      <w:r>
+        <w:rPr>
+          <w:rFonts w:ascii="Times New Roman" w:eastAsia="Times New Roman" w:hAnsi="Times New Roman" w:cs="Times New Roman"/>
+          <w:b/>
+          <w:bCs/>
+          <w:sz w:val="26"/>
+          <w:szCs w:val="26"/>
+        </w:rPr>
+        <w:t>tại</w:t>
+      </w:r>
+      <w:proofErr w:type="spellEnd"/>
+      <w:r>
+        <w:rPr>
+          <w:rFonts w:ascii="Times New Roman" w:eastAsia="Times New Roman" w:hAnsi="Times New Roman" w:cs="Times New Roman"/>
+          <w:b/>
+          <w:bCs/>
+          <w:sz w:val="26"/>
+          <w:szCs w:val="26"/>
+        </w:rPr>
+        <w:t xml:space="preserve"> </w:t>
+      </w:r>
+      <w:proofErr w:type="spellStart"/>
+      <w:r>
+        <w:rPr>
+          <w:rFonts w:ascii="Times New Roman" w:eastAsia="Times New Roman" w:hAnsi="Times New Roman" w:cs="Times New Roman"/>
+          <w:b/>
+          <w:bCs/>
           <w:sz w:val="26"/>
           <w:szCs w:val="26"/>
         </w:rPr>
@@ -9060,188 +9161,19 @@
       <w:r>
         <w:rPr>
           <w:rFonts w:ascii="Times New Roman" w:eastAsia="Times New Roman" w:hAnsi="Times New Roman" w:cs="Times New Roman"/>
-          <w:sz w:val="26"/>
-          <w:szCs w:val="26"/>
-        </w:rPr>
-        <w:t xml:space="preserve"> </w:t>
-      </w:r>
-      <w:proofErr w:type="spellStart"/>
-      <w:r>
-        <w:rPr>
-          <w:rFonts w:ascii="Times New Roman" w:eastAsia="Times New Roman" w:hAnsi="Times New Roman" w:cs="Times New Roman"/>
-          <w:sz w:val="26"/>
-          <w:szCs w:val="26"/>
-        </w:rPr>
-        <w:t>phường</w:t>
-      </w:r>
-      <w:proofErr w:type="spellEnd"/>
+          <w:b/>
+          <w:bCs/>
+          <w:sz w:val="26"/>
+          <w:szCs w:val="26"/>
+        </w:rPr>
+        <w:t xml:space="preserve"> Phường:</w:t>
+      </w:r>
     </w:p>
-    <w:tbl>
-      <w:tblPr>
-        <w:tblStyle w:val="TableGrid"/>
-        <w:tblW w:w="0" w:type="auto"/>
-        <w:tblInd w:w="360" w:type="dxa"/>
-        <w:tblBorders>
-          <w:top w:val="none" w:sz="0" w:space="0" w:color="auto"/>
-          <w:left w:val="none" w:sz="0" w:space="0" w:color="auto"/>
-          <w:bottom w:val="none" w:sz="0" w:space="0" w:color="auto"/>
-          <w:right w:val="none" w:sz="0" w:space="0" w:color="auto"/>
-          <w:insideH w:val="none" w:sz="0" w:space="0" w:color="auto"/>
-          <w:insideV w:val="none" w:sz="0" w:space="0" w:color="auto"/>
-        </w:tblBorders>
-        <w:tblLook w:val="04A0" w:firstRow="1" w:lastRow="0" w:firstColumn="1" w:lastColumn="0" w:noHBand="0" w:noVBand="1"/>
-      </w:tblPr>
-      <w:tblGrid>
-        <w:gridCol w:w="4315"/>
-        <w:gridCol w:w="270"/>
-        <w:gridCol w:w="4259"/>
-      </w:tblGrid>
-      <w:tr>
-        <w:tc>
-          <w:tcPr>
-            <w:tcW w:w="4315" w:type="dxa"/>
-          </w:tcPr>
-          <w:p>
-            <w:pPr>
-              <w:pStyle w:val="ListParagraph"/>
-              <w:spacing w:before="60" w:after="60" w:line="320" w:lineRule="exact"/>
-              <w:ind w:left="0"/>
-              <w:jc w:val="both"/>
-              <w:rPr>
-                <w:rFonts w:ascii="Times New Roman" w:eastAsia="Times New Roman" w:hAnsi="Times New Roman" w:cs="Times New Roman"/>
-                <w:color w:val="000000" w:themeColor="text1"/>
-                <w:sz w:val="26"/>
-                <w:szCs w:val="26"/>
-                <w:lang w:val="vi-VN"/>
-              </w:rPr>
-            </w:pPr>
-            <w:r>
-              <w:rPr>
-                <w:rFonts w:ascii="Times New Roman" w:eastAsia="Times New Roman" w:hAnsi="Times New Roman" w:cs="Times New Roman"/>
-                <w:color w:val="000000" w:themeColor="text1"/>
-                <w:sz w:val="26"/>
-                <w:szCs w:val="26"/>
-                <w:lang w:val="vi-VN"/>
-              </w:rPr>
-              <w:t>{</w:t>
-            </w:r>
-            <w:r>
-              <w:rPr>
-                <w:rFonts w:ascii="Times New Roman" w:eastAsia="Times New Roman" w:hAnsi="Times New Roman" w:cs="Times New Roman"/>
-                <w:color w:val="000000" w:themeColor="text1"/>
-                <w:sz w:val="26"/>
-                <w:szCs w:val="26"/>
-                <w:lang w:val="vi-VN"/>
-              </w:rPr>
-              <w:t>phu_luc_table1_mua_phuong</w:t>
-            </w:r>
-            <w:r>
-              <w:rPr>
-                <w:rFonts w:ascii="Times New Roman" w:eastAsia="Times New Roman" w:hAnsi="Times New Roman" w:cs="Times New Roman"/>
-                <w:color w:val="000000" w:themeColor="text1"/>
-                <w:sz w:val="26"/>
-                <w:szCs w:val="26"/>
-                <w:lang w:val="vi-VN"/>
-              </w:rPr>
-              <w:t>}</w:t>
-            </w:r>
-          </w:p>
-        </w:tc>
-        <w:tc>
-          <w:tcPr>
-            <w:tcW w:w="270" w:type="dxa"/>
-          </w:tcPr>
-          <w:p>
-            <w:pPr>
-              <w:pStyle w:val="ListParagraph"/>
-              <w:spacing w:before="60" w:after="60" w:line="320" w:lineRule="exact"/>
-              <w:ind w:left="0"/>
-              <w:jc w:val="both"/>
-              <w:rPr>
-                <w:rFonts w:ascii="Times New Roman" w:eastAsia="Times New Roman" w:hAnsi="Times New Roman" w:cs="Times New Roman"/>
-                <w:color w:val="000000" w:themeColor="text1"/>
-                <w:sz w:val="26"/>
-                <w:szCs w:val="26"/>
-                <w:lang w:val="vi-VN"/>
-              </w:rPr>
-            </w:pPr>
-          </w:p>
-        </w:tc>
-        <w:tc>
-          <w:tcPr>
-            <w:tcW w:w="4259" w:type="dxa"/>
-          </w:tcPr>
-          <w:p>
-            <w:pPr>
-              <w:pStyle w:val="ListParagraph"/>
-              <w:spacing w:before="60" w:after="60" w:line="320" w:lineRule="exact"/>
-              <w:ind w:left="0"/>
-              <w:jc w:val="both"/>
-              <w:rPr>
-                <w:rFonts w:ascii="Times New Roman" w:eastAsia="Times New Roman" w:hAnsi="Times New Roman" w:cs="Times New Roman"/>
-                <w:color w:val="000000" w:themeColor="text1"/>
-                <w:sz w:val="26"/>
-                <w:szCs w:val="26"/>
-                <w:lang w:val="vi-VN"/>
-              </w:rPr>
-            </w:pPr>
-            <w:r>
-              <w:rPr>
-                <w:rFonts w:ascii="Times New Roman" w:eastAsia="Times New Roman" w:hAnsi="Times New Roman" w:cs="Times New Roman"/>
-                <w:color w:val="000000" w:themeColor="text1"/>
-                <w:sz w:val="26"/>
-                <w:szCs w:val="26"/>
-                <w:lang w:val="vi-VN"/>
-              </w:rPr>
-              <w:t>{</w:t>
-            </w:r>
-            <w:r>
-              <w:rPr>
-                <w:rFonts w:ascii="Times New Roman" w:eastAsia="Times New Roman" w:hAnsi="Times New Roman" w:cs="Times New Roman"/>
-                <w:color w:val="000000" w:themeColor="text1"/>
-                <w:sz w:val="26"/>
-                <w:szCs w:val="26"/>
-                <w:lang w:val="vi-VN"/>
-              </w:rPr>
-              <w:t>phu_luc_table</w:t>
-            </w:r>
-            <w:r>
-              <w:rPr>
-                <w:rFonts w:ascii="Times New Roman" w:eastAsia="Times New Roman" w:hAnsi="Times New Roman" w:cs="Times New Roman"/>
-                <w:color w:val="000000" w:themeColor="text1"/>
-                <w:sz w:val="26"/>
-                <w:szCs w:val="26"/>
-                <w:lang w:val="vi-VN"/>
-              </w:rPr>
-              <w:t>2</w:t>
-            </w:r>
-            <w:r>
-              <w:rPr>
-                <w:rFonts w:ascii="Times New Roman" w:eastAsia="Times New Roman" w:hAnsi="Times New Roman" w:cs="Times New Roman"/>
-                <w:color w:val="000000" w:themeColor="text1"/>
-                <w:sz w:val="26"/>
-                <w:szCs w:val="26"/>
-                <w:lang w:val="vi-VN"/>
-              </w:rPr>
-              <w:t>_mua_phuong</w:t>
-            </w:r>
-            <w:r>
-              <w:rPr>
-                <w:rFonts w:ascii="Times New Roman" w:eastAsia="Times New Roman" w:hAnsi="Times New Roman" w:cs="Times New Roman"/>
-                <w:color w:val="000000" w:themeColor="text1"/>
-                <w:sz w:val="26"/>
-                <w:szCs w:val="26"/>
-                <w:lang w:val="vi-VN"/>
-              </w:rPr>
-              <w:t>}</w:t>
-            </w:r>
-          </w:p>
-        </w:tc>
-      </w:tr>
-    </w:tbl>
     <w:p>
       <w:pPr>
+        <w:pStyle w:val="ListParagraph"/>
         <w:spacing w:before="60" w:after="60" w:line="320" w:lineRule="exact"/>
+        <w:ind w:left="540" w:firstLine="180"/>
         <w:jc w:val="both"/>
         <w:rPr>
           <w:rFonts w:ascii="Times New Roman" w:eastAsia="Times New Roman" w:hAnsi="Times New Roman" w:cs="Times New Roman"/>
@@ -9259,7 +9191,7 @@
           <w:szCs w:val="26"/>
           <w:lang w:val="vi-VN"/>
         </w:rPr>
-        <w:t xml:space="preserve">     </w:t>
+        <w:br/>
       </w:r>
       <w:r>
         <w:rPr>
@@ -9269,374 +9201,221 @@
           <w:szCs w:val="26"/>
           <w:lang w:val="vi-VN"/>
         </w:rPr>
-        <w:t xml:space="preserve"> </w:t>
-      </w:r>
-      <w:proofErr w:type="spellStart"/>
-      <w:r>
-        <w:rPr>
-          <w:rFonts w:ascii="Times New Roman" w:eastAsia="Times New Roman" w:hAnsi="Times New Roman" w:cs="Times New Roman"/>
-          <w:color w:val="000000" w:themeColor="text1"/>
-          <w:sz w:val="26"/>
-          <w:szCs w:val="26"/>
-        </w:rPr>
-        <w:t>Số</w:t>
-      </w:r>
-      <w:proofErr w:type="spellEnd"/>
-      <w:r>
-        <w:rPr>
-          <w:rFonts w:ascii="Times New Roman" w:eastAsia="Times New Roman" w:hAnsi="Times New Roman" w:cs="Times New Roman"/>
-          <w:color w:val="000000" w:themeColor="text1"/>
-          <w:sz w:val="26"/>
-          <w:szCs w:val="26"/>
-        </w:rPr>
-        <w:t xml:space="preserve"> </w:t>
-      </w:r>
-      <w:proofErr w:type="spellStart"/>
-      <w:r>
-        <w:rPr>
-          <w:rFonts w:ascii="Times New Roman" w:eastAsia="Times New Roman" w:hAnsi="Times New Roman" w:cs="Times New Roman"/>
-          <w:color w:val="000000" w:themeColor="text1"/>
-          <w:sz w:val="26"/>
-          <w:szCs w:val="26"/>
-        </w:rPr>
-        <w:t>liệu</w:t>
-      </w:r>
-      <w:proofErr w:type="spellEnd"/>
-      <w:r>
-        <w:rPr>
-          <w:rFonts w:ascii="Times New Roman" w:eastAsia="Times New Roman" w:hAnsi="Times New Roman" w:cs="Times New Roman"/>
-          <w:color w:val="000000" w:themeColor="text1"/>
-          <w:sz w:val="26"/>
-          <w:szCs w:val="26"/>
-        </w:rPr>
-        <w:t xml:space="preserve"> </w:t>
-      </w:r>
-      <w:proofErr w:type="spellStart"/>
-      <w:r>
-        <w:rPr>
-          <w:rFonts w:ascii="Times New Roman" w:eastAsia="Times New Roman" w:hAnsi="Times New Roman" w:cs="Times New Roman"/>
-          <w:color w:val="000000" w:themeColor="text1"/>
-          <w:sz w:val="26"/>
-          <w:szCs w:val="26"/>
-        </w:rPr>
-        <w:t>mưa</w:t>
-      </w:r>
-      <w:proofErr w:type="spellEnd"/>
-      <w:r>
-        <w:rPr>
-          <w:rFonts w:ascii="Times New Roman" w:eastAsia="Times New Roman" w:hAnsi="Times New Roman" w:cs="Times New Roman"/>
-          <w:color w:val="000000" w:themeColor="text1"/>
-          <w:sz w:val="26"/>
-          <w:szCs w:val="26"/>
-        </w:rPr>
-        <w:t xml:space="preserve"> </w:t>
-      </w:r>
-      <w:proofErr w:type="spellStart"/>
-      <w:r>
-        <w:rPr>
-          <w:rFonts w:ascii="Times New Roman" w:eastAsia="Times New Roman" w:hAnsi="Times New Roman" w:cs="Times New Roman"/>
-          <w:color w:val="000000" w:themeColor="text1"/>
-          <w:sz w:val="26"/>
-          <w:szCs w:val="26"/>
-        </w:rPr>
-        <w:t>các</w:t>
-      </w:r>
-      <w:proofErr w:type="spellEnd"/>
-      <w:r>
-        <w:rPr>
-          <w:rFonts w:ascii="Times New Roman" w:eastAsia="Times New Roman" w:hAnsi="Times New Roman" w:cs="Times New Roman"/>
-          <w:color w:val="000000" w:themeColor="text1"/>
-          <w:sz w:val="26"/>
-          <w:szCs w:val="26"/>
-        </w:rPr>
-        <w:t xml:space="preserve"> </w:t>
-      </w:r>
-      <w:proofErr w:type="spellStart"/>
-      <w:r>
-        <w:rPr>
-          <w:rFonts w:ascii="Times New Roman" w:eastAsia="Times New Roman" w:hAnsi="Times New Roman" w:cs="Times New Roman"/>
-          <w:color w:val="000000" w:themeColor="text1"/>
-          <w:sz w:val="26"/>
-          <w:szCs w:val="26"/>
-        </w:rPr>
-        <w:t>xã</w:t>
-      </w:r>
-      <w:proofErr w:type="spellEnd"/>
+        <w:t>{</w:t>
+      </w:r>
+      <w:r>
+        <w:rPr>
+          <w:rFonts w:ascii="Times New Roman" w:eastAsia="Times New Roman" w:hAnsi="Times New Roman" w:cs="Times New Roman"/>
+          <w:color w:val="000000" w:themeColor="text1"/>
+          <w:sz w:val="26"/>
+          <w:szCs w:val="26"/>
+          <w:lang w:val="vi-VN"/>
+        </w:rPr>
+        <w:t>phu_luc_table_mua_phuong</w:t>
+      </w:r>
+      <w:r>
+        <w:rPr>
+          <w:rFonts w:ascii="Times New Roman" w:eastAsia="Times New Roman" w:hAnsi="Times New Roman" w:cs="Times New Roman"/>
+          <w:color w:val="000000" w:themeColor="text1"/>
+          <w:sz w:val="26"/>
+          <w:szCs w:val="26"/>
+          <w:lang w:val="vi-VN"/>
+        </w:rPr>
+        <w:t>}</w:t>
+      </w:r>
     </w:p>
-    <w:tbl>
-      <w:tblPr>
-        <w:tblStyle w:val="TableGrid"/>
-        <w:tblW w:w="0" w:type="auto"/>
-        <w:tblInd w:w="360" w:type="dxa"/>
-        <w:tblBorders>
-          <w:top w:val="none" w:sz="0" w:space="0" w:color="auto"/>
-          <w:left w:val="none" w:sz="0" w:space="0" w:color="auto"/>
-          <w:bottom w:val="none" w:sz="0" w:space="0" w:color="auto"/>
-          <w:right w:val="none" w:sz="0" w:space="0" w:color="auto"/>
-          <w:insideH w:val="none" w:sz="0" w:space="0" w:color="auto"/>
-          <w:insideV w:val="none" w:sz="0" w:space="0" w:color="auto"/>
-        </w:tblBorders>
-        <w:tblLook w:val="04A0" w:firstRow="1" w:lastRow="0" w:firstColumn="1" w:lastColumn="0" w:noHBand="0" w:noVBand="1"/>
-      </w:tblPr>
-      <w:tblGrid>
-        <w:gridCol w:w="4315"/>
-        <w:gridCol w:w="270"/>
-        <w:gridCol w:w="4259"/>
-      </w:tblGrid>
-      <w:tr>
-        <w:tc>
-          <w:tcPr>
-            <w:tcW w:w="4315" w:type="dxa"/>
-          </w:tcPr>
-          <w:p>
-            <w:pPr>
-              <w:pStyle w:val="ListParagraph"/>
-              <w:spacing w:before="60" w:after="60" w:line="320" w:lineRule="exact"/>
-              <w:ind w:left="0"/>
-              <w:jc w:val="both"/>
-              <w:rPr>
-                <w:rFonts w:ascii="Times New Roman" w:eastAsia="Times New Roman" w:hAnsi="Times New Roman" w:cs="Times New Roman"/>
-                <w:color w:val="000000" w:themeColor="text1"/>
-                <w:sz w:val="26"/>
-                <w:szCs w:val="26"/>
-                <w:lang w:val="vi-VN"/>
-              </w:rPr>
-            </w:pPr>
-            <w:r>
-              <w:rPr>
-                <w:rFonts w:ascii="Times New Roman" w:eastAsia="Times New Roman" w:hAnsi="Times New Roman" w:cs="Times New Roman"/>
-                <w:color w:val="000000" w:themeColor="text1"/>
-                <w:sz w:val="26"/>
-                <w:szCs w:val="26"/>
-                <w:lang w:val="vi-VN"/>
-              </w:rPr>
-              <w:t>{</w:t>
-            </w:r>
-            <w:r>
-              <w:rPr>
-                <w:rFonts w:ascii="Times New Roman" w:eastAsia="Times New Roman" w:hAnsi="Times New Roman" w:cs="Times New Roman"/>
-                <w:color w:val="000000" w:themeColor="text1"/>
-                <w:sz w:val="26"/>
-                <w:szCs w:val="26"/>
-                <w:lang w:val="vi-VN"/>
-              </w:rPr>
-              <w:t>phu_luc_table</w:t>
-            </w:r>
-            <w:r>
-              <w:rPr>
-                <w:rFonts w:ascii="Times New Roman" w:eastAsia="Times New Roman" w:hAnsi="Times New Roman" w:cs="Times New Roman"/>
-                <w:color w:val="000000" w:themeColor="text1"/>
-                <w:sz w:val="26"/>
-                <w:szCs w:val="26"/>
-                <w:lang w:val="vi-VN"/>
-              </w:rPr>
-              <w:t>1</w:t>
-            </w:r>
-            <w:r>
-              <w:rPr>
-                <w:rFonts w:ascii="Times New Roman" w:eastAsia="Times New Roman" w:hAnsi="Times New Roman" w:cs="Times New Roman"/>
-                <w:color w:val="000000" w:themeColor="text1"/>
-                <w:sz w:val="26"/>
-                <w:szCs w:val="26"/>
-                <w:lang w:val="vi-VN"/>
-              </w:rPr>
-              <w:t>_mua_</w:t>
-            </w:r>
-            <w:r>
-              <w:rPr>
-                <w:rFonts w:ascii="Times New Roman" w:eastAsia="Times New Roman" w:hAnsi="Times New Roman" w:cs="Times New Roman"/>
-                <w:color w:val="000000" w:themeColor="text1"/>
-                <w:sz w:val="26"/>
-                <w:szCs w:val="26"/>
-                <w:lang w:val="vi-VN"/>
-              </w:rPr>
-              <w:t>xa</w:t>
-            </w:r>
-            <w:r>
-              <w:rPr>
-                <w:rFonts w:ascii="Times New Roman" w:eastAsia="Times New Roman" w:hAnsi="Times New Roman" w:cs="Times New Roman"/>
-                <w:color w:val="000000" w:themeColor="text1"/>
-                <w:sz w:val="26"/>
-                <w:szCs w:val="26"/>
-                <w:lang w:val="vi-VN"/>
-              </w:rPr>
-              <w:t>}</w:t>
-            </w:r>
-          </w:p>
-        </w:tc>
-        <w:tc>
-          <w:tcPr>
-            <w:tcW w:w="270" w:type="dxa"/>
-          </w:tcPr>
-          <w:p>
-            <w:pPr>
-              <w:pStyle w:val="ListParagraph"/>
-              <w:spacing w:before="60" w:after="60" w:line="320" w:lineRule="exact"/>
-              <w:ind w:left="0"/>
-              <w:jc w:val="both"/>
-              <w:rPr>
-                <w:rFonts w:ascii="Times New Roman" w:eastAsia="Times New Roman" w:hAnsi="Times New Roman" w:cs="Times New Roman"/>
-                <w:color w:val="000000" w:themeColor="text1"/>
-                <w:sz w:val="26"/>
-                <w:szCs w:val="26"/>
-                <w:lang w:val="vi-VN"/>
-              </w:rPr>
-            </w:pPr>
-          </w:p>
-        </w:tc>
-        <w:tc>
-          <w:tcPr>
-            <w:tcW w:w="4259" w:type="dxa"/>
-          </w:tcPr>
-          <w:p>
-            <w:pPr>
-              <w:pStyle w:val="ListParagraph"/>
-              <w:spacing w:before="60" w:after="60" w:line="320" w:lineRule="exact"/>
-              <w:ind w:left="0"/>
-              <w:jc w:val="both"/>
-              <w:rPr>
-                <w:rFonts w:ascii="Times New Roman" w:eastAsia="Times New Roman" w:hAnsi="Times New Roman" w:cs="Times New Roman"/>
-                <w:color w:val="000000" w:themeColor="text1"/>
-                <w:sz w:val="26"/>
-                <w:szCs w:val="26"/>
-                <w:lang w:val="vi-VN"/>
-              </w:rPr>
-            </w:pPr>
-            <w:r>
-              <w:rPr>
-                <w:rFonts w:ascii="Times New Roman" w:eastAsia="Times New Roman" w:hAnsi="Times New Roman" w:cs="Times New Roman"/>
-                <w:color w:val="000000" w:themeColor="text1"/>
-                <w:sz w:val="26"/>
-                <w:szCs w:val="26"/>
-                <w:lang w:val="vi-VN"/>
-              </w:rPr>
-              <w:t>{</w:t>
-            </w:r>
-            <w:r>
-              <w:rPr>
-                <w:rFonts w:ascii="Times New Roman" w:eastAsia="Times New Roman" w:hAnsi="Times New Roman" w:cs="Times New Roman"/>
-                <w:color w:val="000000" w:themeColor="text1"/>
-                <w:sz w:val="26"/>
-                <w:szCs w:val="26"/>
-                <w:lang w:val="vi-VN"/>
-              </w:rPr>
-              <w:t>phu_luc_table</w:t>
-            </w:r>
-            <w:r>
-              <w:rPr>
-                <w:rFonts w:ascii="Times New Roman" w:eastAsia="Times New Roman" w:hAnsi="Times New Roman" w:cs="Times New Roman"/>
-                <w:color w:val="000000" w:themeColor="text1"/>
-                <w:sz w:val="26"/>
-                <w:szCs w:val="26"/>
-                <w:lang w:val="vi-VN"/>
-              </w:rPr>
-              <w:t>2</w:t>
-            </w:r>
-            <w:r>
-              <w:rPr>
-                <w:rFonts w:ascii="Times New Roman" w:eastAsia="Times New Roman" w:hAnsi="Times New Roman" w:cs="Times New Roman"/>
-                <w:color w:val="000000" w:themeColor="text1"/>
-                <w:sz w:val="26"/>
-                <w:szCs w:val="26"/>
-                <w:lang w:val="vi-VN"/>
-              </w:rPr>
-              <w:t>_mua_</w:t>
-            </w:r>
-            <w:r>
-              <w:rPr>
-                <w:rFonts w:ascii="Times New Roman" w:eastAsia="Times New Roman" w:hAnsi="Times New Roman" w:cs="Times New Roman"/>
-                <w:color w:val="000000" w:themeColor="text1"/>
-                <w:sz w:val="26"/>
-                <w:szCs w:val="26"/>
-                <w:lang w:val="vi-VN"/>
-              </w:rPr>
-              <w:t>xa</w:t>
-            </w:r>
-            <w:r>
-              <w:rPr>
-                <w:rFonts w:ascii="Times New Roman" w:eastAsia="Times New Roman" w:hAnsi="Times New Roman" w:cs="Times New Roman"/>
-                <w:color w:val="000000" w:themeColor="text1"/>
-                <w:sz w:val="26"/>
-                <w:szCs w:val="26"/>
-                <w:lang w:val="vi-VN"/>
-              </w:rPr>
-              <w:t>}</w:t>
-            </w:r>
-          </w:p>
-        </w:tc>
-      </w:tr>
-      <w:tr>
-        <w:tc>
-          <w:tcPr>
-            <w:tcW w:w="4315" w:type="dxa"/>
-          </w:tcPr>
-          <w:p>
-            <w:pPr>
-              <w:pStyle w:val="ListParagraph"/>
-              <w:spacing w:before="60" w:after="60" w:line="320" w:lineRule="exact"/>
-              <w:ind w:left="0"/>
-              <w:jc w:val="both"/>
-              <w:rPr>
-                <w:rFonts w:ascii="Times New Roman" w:eastAsia="Times New Roman" w:hAnsi="Times New Roman" w:cs="Times New Roman"/>
-                <w:color w:val="000000" w:themeColor="text1"/>
-                <w:sz w:val="26"/>
-                <w:szCs w:val="26"/>
-                <w:lang w:val="vi-VN"/>
-              </w:rPr>
-            </w:pPr>
-          </w:p>
-        </w:tc>
-        <w:tc>
-          <w:tcPr>
-            <w:tcW w:w="270" w:type="dxa"/>
-          </w:tcPr>
-          <w:p>
-            <w:pPr>
-              <w:pStyle w:val="ListParagraph"/>
-              <w:spacing w:before="60" w:after="60" w:line="320" w:lineRule="exact"/>
-              <w:ind w:left="0"/>
-              <w:jc w:val="both"/>
-              <w:rPr>
-                <w:rFonts w:ascii="Times New Roman" w:eastAsia="Times New Roman" w:hAnsi="Times New Roman" w:cs="Times New Roman"/>
-                <w:color w:val="000000" w:themeColor="text1"/>
-                <w:sz w:val="26"/>
-                <w:szCs w:val="26"/>
-                <w:lang w:val="vi-VN"/>
-              </w:rPr>
-            </w:pPr>
-          </w:p>
-        </w:tc>
-        <w:tc>
-          <w:tcPr>
-            <w:tcW w:w="4259" w:type="dxa"/>
-          </w:tcPr>
-          <w:p>
-            <w:pPr>
-              <w:pStyle w:val="ListParagraph"/>
-              <w:spacing w:before="60" w:after="60" w:line="320" w:lineRule="exact"/>
-              <w:ind w:left="0"/>
-              <w:jc w:val="both"/>
-              <w:rPr>
-                <w:rFonts w:ascii="Times New Roman" w:eastAsia="Times New Roman" w:hAnsi="Times New Roman" w:cs="Times New Roman"/>
-                <w:color w:val="000000" w:themeColor="text1"/>
-                <w:sz w:val="26"/>
-                <w:szCs w:val="26"/>
-                <w:lang w:val="vi-VN"/>
-              </w:rPr>
-            </w:pPr>
-          </w:p>
-        </w:tc>
-      </w:tr>
-    </w:tbl>
     <w:p>
       <w:pPr>
+        <w:pStyle w:val="ListParagraph"/>
         <w:spacing w:before="60" w:after="60" w:line="320" w:lineRule="exact"/>
+        <w:ind w:left="0"/>
         <w:jc w:val="both"/>
         <w:rPr>
           <w:rFonts w:ascii="Times New Roman" w:eastAsia="Times New Roman" w:hAnsi="Times New Roman" w:cs="Times New Roman"/>
           <w:color w:val="000000" w:themeColor="text1"/>
           <w:sz w:val="26"/>
           <w:szCs w:val="26"/>
+        </w:rPr>
+      </w:pPr>
+    </w:p>
+    <w:p>
+      <w:pPr>
+        <w:pStyle w:val="ListParagraph"/>
+        <w:numPr>
+          <w:ilvl w:val="3"/>
+          <w:numId w:val="4"/>
+        </w:numPr>
+        <w:tabs>
+          <w:tab w:val="left" w:pos="810"/>
+        </w:tabs>
+        <w:spacing w:before="60" w:after="60" w:line="320" w:lineRule="exact"/>
+        <w:ind w:left="0" w:firstLine="540"/>
+        <w:rPr>
+          <w:rFonts w:ascii="Times New Roman" w:eastAsia="Times New Roman" w:hAnsi="Times New Roman" w:cs="Times New Roman"/>
+          <w:b/>
+          <w:bCs/>
+          <w:sz w:val="26"/>
+          <w:szCs w:val="26"/>
+        </w:rPr>
+      </w:pPr>
+      <w:proofErr w:type="spellStart"/>
+      <w:r>
+        <w:rPr>
+          <w:rFonts w:ascii="Times New Roman" w:eastAsia="Times New Roman" w:hAnsi="Times New Roman" w:cs="Times New Roman"/>
+          <w:b/>
+          <w:bCs/>
+          <w:sz w:val="26"/>
+          <w:szCs w:val="26"/>
+        </w:rPr>
+        <w:t>Lượng</w:t>
+      </w:r>
+      <w:proofErr w:type="spellEnd"/>
+      <w:r>
+        <w:rPr>
+          <w:rFonts w:ascii="Times New Roman" w:eastAsia="Times New Roman" w:hAnsi="Times New Roman" w:cs="Times New Roman"/>
+          <w:b/>
+          <w:bCs/>
+          <w:sz w:val="26"/>
+          <w:szCs w:val="26"/>
+        </w:rPr>
+        <w:t xml:space="preserve"> </w:t>
+      </w:r>
+      <w:proofErr w:type="spellStart"/>
+      <w:r>
+        <w:rPr>
+          <w:rFonts w:ascii="Times New Roman" w:eastAsia="Times New Roman" w:hAnsi="Times New Roman" w:cs="Times New Roman"/>
+          <w:b/>
+          <w:bCs/>
+          <w:sz w:val="26"/>
+          <w:szCs w:val="26"/>
+        </w:rPr>
+        <w:t>mưa</w:t>
+      </w:r>
+      <w:proofErr w:type="spellEnd"/>
+      <w:r>
+        <w:rPr>
+          <w:rFonts w:ascii="Times New Roman" w:eastAsia="Times New Roman" w:hAnsi="Times New Roman" w:cs="Times New Roman"/>
+          <w:b/>
+          <w:bCs/>
+          <w:sz w:val="26"/>
+          <w:szCs w:val="26"/>
+        </w:rPr>
+        <w:t xml:space="preserve"> chi </w:t>
+      </w:r>
+      <w:proofErr w:type="spellStart"/>
+      <w:r>
+        <w:rPr>
+          <w:rFonts w:ascii="Times New Roman" w:eastAsia="Times New Roman" w:hAnsi="Times New Roman" w:cs="Times New Roman"/>
+          <w:b/>
+          <w:bCs/>
+          <w:sz w:val="26"/>
+          <w:szCs w:val="26"/>
+        </w:rPr>
+        <w:t>tiết</w:t>
+      </w:r>
+      <w:proofErr w:type="spellEnd"/>
+      <w:r>
+        <w:rPr>
+          <w:rFonts w:ascii="Times New Roman" w:eastAsia="Times New Roman" w:hAnsi="Times New Roman" w:cs="Times New Roman"/>
+          <w:b/>
+          <w:bCs/>
+          <w:sz w:val="26"/>
+          <w:szCs w:val="26"/>
+        </w:rPr>
+        <w:t xml:space="preserve"> </w:t>
+      </w:r>
+      <w:proofErr w:type="spellStart"/>
+      <w:r>
+        <w:rPr>
+          <w:rFonts w:ascii="Times New Roman" w:eastAsia="Times New Roman" w:hAnsi="Times New Roman" w:cs="Times New Roman"/>
+          <w:b/>
+          <w:bCs/>
+          <w:sz w:val="26"/>
+          <w:szCs w:val="26"/>
+        </w:rPr>
+        <w:t>tại</w:t>
+      </w:r>
+      <w:proofErr w:type="spellEnd"/>
+      <w:r>
+        <w:rPr>
+          <w:rFonts w:ascii="Times New Roman" w:eastAsia="Times New Roman" w:hAnsi="Times New Roman" w:cs="Times New Roman"/>
+          <w:b/>
+          <w:bCs/>
+          <w:sz w:val="26"/>
+          <w:szCs w:val="26"/>
+        </w:rPr>
+        <w:t xml:space="preserve"> </w:t>
+      </w:r>
+      <w:proofErr w:type="spellStart"/>
+      <w:r>
+        <w:rPr>
+          <w:rFonts w:ascii="Times New Roman" w:eastAsia="Times New Roman" w:hAnsi="Times New Roman" w:cs="Times New Roman"/>
+          <w:b/>
+          <w:bCs/>
+          <w:sz w:val="26"/>
+          <w:szCs w:val="26"/>
+        </w:rPr>
+        <w:t>các</w:t>
+      </w:r>
+      <w:proofErr w:type="spellEnd"/>
+      <w:r>
+        <w:rPr>
+          <w:rFonts w:ascii="Times New Roman" w:eastAsia="Times New Roman" w:hAnsi="Times New Roman" w:cs="Times New Roman"/>
+          <w:b/>
+          <w:bCs/>
+          <w:sz w:val="26"/>
+          <w:szCs w:val="26"/>
+        </w:rPr>
+        <w:t xml:space="preserve"> </w:t>
+      </w:r>
+      <w:proofErr w:type="spellStart"/>
+      <w:r>
+        <w:rPr>
+          <w:rFonts w:ascii="Times New Roman" w:eastAsia="Times New Roman" w:hAnsi="Times New Roman" w:cs="Times New Roman"/>
+          <w:b/>
+          <w:bCs/>
+          <w:sz w:val="26"/>
+          <w:szCs w:val="26"/>
+        </w:rPr>
+        <w:t>Xã</w:t>
+      </w:r>
+      <w:proofErr w:type="spellEnd"/>
+      <w:r>
+        <w:rPr>
+          <w:rFonts w:ascii="Times New Roman" w:eastAsia="Times New Roman" w:hAnsi="Times New Roman" w:cs="Times New Roman"/>
+          <w:b/>
+          <w:bCs/>
+          <w:sz w:val="26"/>
+          <w:szCs w:val="26"/>
+        </w:rPr>
+        <w:t>:</w:t>
+      </w:r>
+    </w:p>
+    <w:p>
+      <w:pPr>
+        <w:pStyle w:val="ListParagraph"/>
+        <w:tabs>
+          <w:tab w:val="left" w:pos="810"/>
+        </w:tabs>
+        <w:spacing w:before="60" w:after="60" w:line="320" w:lineRule="exact"/>
+        <w:ind w:left="540"/>
+        <w:rPr>
+          <w:rFonts w:ascii="Times New Roman" w:eastAsia="Times New Roman" w:hAnsi="Times New Roman" w:cs="Times New Roman"/>
+          <w:b/>
+          <w:bCs/>
+          <w:sz w:val="26"/>
+          <w:szCs w:val="26"/>
+        </w:rPr>
+      </w:pPr>
+    </w:p>
+    <w:p>
+      <w:pPr>
+        <w:ind w:left="540"/>
+        <w:rPr>
+          <w:rFonts w:ascii="Times New Roman" w:eastAsia="Times New Roman" w:hAnsi="Times New Roman" w:cs="Times New Roman"/>
+          <w:color w:val="000000" w:themeColor="text1"/>
+          <w:sz w:val="26"/>
+          <w:szCs w:val="26"/>
           <w:lang w:val="vi-VN"/>
         </w:rPr>
       </w:pPr>
@@ -9648,27 +9427,7 @@
           <w:szCs w:val="26"/>
           <w:lang w:val="vi-VN"/>
         </w:rPr>
-        <w:t xml:space="preserve">      </w:t>
-      </w:r>
-      <w:proofErr w:type="spellStart"/>
-      <w:r>
-        <w:rPr>
-          <w:rFonts w:ascii="Times New Roman" w:eastAsia="Times New Roman" w:hAnsi="Times New Roman" w:cs="Times New Roman"/>
-          <w:color w:val="000000" w:themeColor="text1"/>
-          <w:sz w:val="26"/>
-          <w:szCs w:val="26"/>
-        </w:rPr>
-        <w:t>Số</w:t>
-      </w:r>
-      <w:proofErr w:type="spellEnd"/>
-      <w:r>
-        <w:rPr>
-          <w:rFonts w:ascii="Times New Roman" w:eastAsia="Times New Roman" w:hAnsi="Times New Roman" w:cs="Times New Roman"/>
-          <w:color w:val="000000" w:themeColor="text1"/>
-          <w:sz w:val="26"/>
-          <w:szCs w:val="26"/>
-        </w:rPr>
-        <w:t xml:space="preserve"> liệu</w:t>
+        <w:t>{</w:t>
       </w:r>
       <w:r>
         <w:rPr>
@@ -9678,7 +9437,431 @@
           <w:szCs w:val="26"/>
           <w:lang w:val="vi-VN"/>
         </w:rPr>
-        <w:t xml:space="preserve"> sông</w:t>
+        <w:t>phu_luc_table_mua_</w:t>
+      </w:r>
+      <w:r>
+        <w:rPr>
+          <w:rFonts w:ascii="Times New Roman" w:eastAsia="Times New Roman" w:hAnsi="Times New Roman" w:cs="Times New Roman"/>
+          <w:color w:val="000000" w:themeColor="text1"/>
+          <w:sz w:val="26"/>
+          <w:szCs w:val="26"/>
+          <w:lang w:val="vi-VN"/>
+        </w:rPr>
+        <w:t>xa</w:t>
+      </w:r>
+      <w:r>
+        <w:rPr>
+          <w:rFonts w:ascii="Times New Roman" w:eastAsia="Times New Roman" w:hAnsi="Times New Roman" w:cs="Times New Roman"/>
+          <w:color w:val="000000" w:themeColor="text1"/>
+          <w:sz w:val="26"/>
+          <w:szCs w:val="26"/>
+          <w:lang w:val="vi-VN"/>
+        </w:rPr>
+        <w:t>}</w:t>
+      </w:r>
+    </w:p>
+    <w:p>
+      <w:pPr>
+        <w:rPr>
+          <w:rFonts w:ascii="Times New Roman" w:eastAsia="Times New Roman" w:hAnsi="Times New Roman" w:cs="Times New Roman"/>
+          <w:color w:val="000000" w:themeColor="text1"/>
+          <w:sz w:val="26"/>
+          <w:szCs w:val="26"/>
+          <w:lang w:val="vi-VN"/>
+        </w:rPr>
+      </w:pPr>
+      <w:r>
+        <w:rPr>
+          <w:rFonts w:ascii="Times New Roman" w:eastAsia="Times New Roman" w:hAnsi="Times New Roman" w:cs="Times New Roman"/>
+          <w:color w:val="000000" w:themeColor="text1"/>
+          <w:sz w:val="26"/>
+          <w:szCs w:val="26"/>
+          <w:lang w:val="vi-VN"/>
+        </w:rPr>
+        <w:br w:type="page"/>
+      </w:r>
+    </w:p>
+    <w:p>
+      <w:pPr>
+        <w:ind w:left="540"/>
+        <w:jc w:val="center"/>
+        <w:rPr>
+          <w:rFonts w:ascii="Times New Roman" w:eastAsia="Times New Roman" w:hAnsi="Times New Roman" w:cs="Times New Roman"/>
+          <w:color w:val="000000" w:themeColor="text1"/>
+          <w:sz w:val="26"/>
+          <w:szCs w:val="26"/>
+          <w:lang w:val="vi-VN"/>
+        </w:rPr>
+      </w:pPr>
+      <w:r>
+        <w:rPr>
+          <w:rFonts w:ascii="Times New Roman" w:hAnsi="Times New Roman" w:cs="Times New Roman"/>
+          <w:b/>
+          <w:bCs/>
+        </w:rPr>
+        <w:lastRenderedPageBreak/>
+        <w:t>PHỤ LỤC 0</w:t>
+      </w:r>
+      <w:r>
+        <w:rPr>
+          <w:rFonts w:ascii="Times New Roman" w:hAnsi="Times New Roman" w:cs="Times New Roman"/>
+          <w:b/>
+          <w:bCs/>
+        </w:rPr>
+        <w:t>2</w:t>
+      </w:r>
+      <w:r>
+        <w:rPr>
+          <w:rFonts w:ascii="Times New Roman" w:hAnsi="Times New Roman" w:cs="Times New Roman"/>
+          <w:b/>
+          <w:bCs/>
+        </w:rPr>
+        <w:t xml:space="preserve">: TỔNG HỢP </w:t>
+      </w:r>
+      <w:r>
+        <w:rPr>
+          <w:rFonts w:ascii="Times New Roman" w:hAnsi="Times New Roman" w:cs="Times New Roman"/>
+          <w:b/>
+          <w:bCs/>
+        </w:rPr>
+        <w:t>MỰC NƯỚC</w:t>
+      </w:r>
+      <w:r>
+        <w:rPr>
+          <w:rFonts w:ascii="Times New Roman" w:hAnsi="Times New Roman" w:cs="Times New Roman"/>
+          <w:b/>
+          <w:bCs/>
+        </w:rPr>
+        <w:t xml:space="preserve"> </w:t>
+      </w:r>
+      <w:r>
+        <w:rPr>
+          <w:rFonts w:ascii="Times New Roman" w:hAnsi="Times New Roman" w:cs="Times New Roman"/>
+          <w:b/>
+          <w:bCs/>
+        </w:rPr>
+        <w:t>CÁC SÔNG/HỒ</w:t>
+      </w:r>
+    </w:p>
+    <w:p>
+      <w:pPr>
+        <w:spacing w:after="120" w:line="240" w:lineRule="auto"/>
+        <w:contextualSpacing/>
+        <w:jc w:val="center"/>
+        <w:rPr>
+          <w:rFonts w:ascii="Times New Roman" w:hAnsi="Times New Roman" w:cs="Times New Roman"/>
+          <w:color w:val="000000" w:themeColor="text1"/>
+          <w:sz w:val="26"/>
+          <w:szCs w:val="26"/>
+          <w:lang w:val="vi-VN"/>
+        </w:rPr>
+      </w:pPr>
+      <w:proofErr w:type="spellStart"/>
+      <w:r>
+        <w:rPr>
+          <w:rFonts w:ascii="Times New Roman" w:eastAsia="Times New Roman" w:hAnsi="Times New Roman" w:cs="Times New Roman"/>
+          <w:color w:val="000000"/>
+          <w:sz w:val="26"/>
+          <w:szCs w:val="26"/>
+        </w:rPr>
+        <w:t>Thời</w:t>
+      </w:r>
+      <w:proofErr w:type="spellEnd"/>
+      <w:r>
+        <w:rPr>
+          <w:rFonts w:ascii="Times New Roman" w:eastAsia="Times New Roman" w:hAnsi="Times New Roman" w:cs="Times New Roman"/>
+          <w:color w:val="000000"/>
+          <w:sz w:val="26"/>
+          <w:szCs w:val="26"/>
+        </w:rPr>
+        <w:t xml:space="preserve"> </w:t>
+      </w:r>
+      <w:proofErr w:type="spellStart"/>
+      <w:r>
+        <w:rPr>
+          <w:rFonts w:ascii="Times New Roman" w:eastAsia="Times New Roman" w:hAnsi="Times New Roman" w:cs="Times New Roman"/>
+          <w:color w:val="000000"/>
+          <w:sz w:val="26"/>
+          <w:szCs w:val="26"/>
+        </w:rPr>
+        <w:t>điểm</w:t>
+      </w:r>
+      <w:proofErr w:type="spellEnd"/>
+      <w:r>
+        <w:rPr>
+          <w:rFonts w:ascii="Times New Roman" w:eastAsia="Times New Roman" w:hAnsi="Times New Roman" w:cs="Times New Roman"/>
+          <w:color w:val="000000"/>
+          <w:sz w:val="26"/>
+          <w:szCs w:val="26"/>
+        </w:rPr>
+        <w:t xml:space="preserve"> </w:t>
+      </w:r>
+      <w:proofErr w:type="spellStart"/>
+      <w:r>
+        <w:rPr>
+          <w:rFonts w:ascii="Times New Roman" w:eastAsia="Times New Roman" w:hAnsi="Times New Roman" w:cs="Times New Roman"/>
+          <w:color w:val="000000"/>
+          <w:sz w:val="26"/>
+          <w:szCs w:val="26"/>
+        </w:rPr>
+        <w:t>tổng</w:t>
+      </w:r>
+      <w:proofErr w:type="spellEnd"/>
+      <w:r>
+        <w:rPr>
+          <w:rFonts w:ascii="Times New Roman" w:eastAsia="Times New Roman" w:hAnsi="Times New Roman" w:cs="Times New Roman"/>
+          <w:color w:val="000000"/>
+          <w:sz w:val="26"/>
+          <w:szCs w:val="26"/>
+        </w:rPr>
+        <w:t xml:space="preserve"> </w:t>
+      </w:r>
+      <w:proofErr w:type="spellStart"/>
+      <w:r>
+        <w:rPr>
+          <w:rFonts w:ascii="Times New Roman" w:eastAsia="Times New Roman" w:hAnsi="Times New Roman" w:cs="Times New Roman"/>
+          <w:color w:val="000000"/>
+          <w:sz w:val="26"/>
+          <w:szCs w:val="26"/>
+        </w:rPr>
+        <w:t>hợp</w:t>
+      </w:r>
+      <w:proofErr w:type="spellEnd"/>
+      <w:r>
+        <w:rPr>
+          <w:rFonts w:ascii="Times New Roman" w:eastAsia="Times New Roman" w:hAnsi="Times New Roman" w:cs="Times New Roman"/>
+          <w:color w:val="000000"/>
+          <w:sz w:val="26"/>
+          <w:szCs w:val="26"/>
+        </w:rPr>
+        <w:t xml:space="preserve">: </w:t>
+      </w:r>
+      <w:r>
+        <w:rPr>
+          <w:rFonts w:ascii="Times New Roman" w:eastAsia="Times New Roman" w:hAnsi="Times New Roman" w:cs="Times New Roman"/>
+          <w:color w:val="000000"/>
+          <w:sz w:val="26"/>
+          <w:szCs w:val="26"/>
+        </w:rPr>
+        <w:t>{</w:t>
+      </w:r>
+      <w:proofErr w:type="spellStart"/>
+      <w:r>
+        <w:rPr>
+          <w:rFonts w:ascii="Times New Roman" w:eastAsia="Times New Roman" w:hAnsi="Times New Roman" w:cs="Times New Roman"/>
+          <w:color w:val="000000"/>
+          <w:sz w:val="26"/>
+          <w:szCs w:val="26"/>
+        </w:rPr>
+        <w:t>hh</w:t>
+      </w:r>
+      <w:proofErr w:type="spellEnd"/>
+      <w:r>
+        <w:rPr>
+          <w:rFonts w:ascii="Times New Roman" w:eastAsia="Times New Roman" w:hAnsi="Times New Roman" w:cs="Times New Roman"/>
+          <w:color w:val="000000"/>
+          <w:sz w:val="26"/>
+          <w:szCs w:val="26"/>
+        </w:rPr>
+        <w:t>}</w:t>
+      </w:r>
+      <w:r>
+        <w:rPr>
+          <w:rFonts w:ascii="Times New Roman" w:eastAsia="Times New Roman" w:hAnsi="Times New Roman" w:cs="Times New Roman"/>
+          <w:color w:val="000000"/>
+          <w:sz w:val="26"/>
+          <w:szCs w:val="26"/>
+          <w:lang w:val="vi-VN"/>
+        </w:rPr>
+        <w:t xml:space="preserve"> </w:t>
+      </w:r>
+      <w:proofErr w:type="spellStart"/>
+      <w:r>
+        <w:rPr>
+          <w:rFonts w:ascii="Times New Roman" w:eastAsia="Times New Roman" w:hAnsi="Times New Roman" w:cs="Times New Roman"/>
+          <w:color w:val="000000"/>
+          <w:sz w:val="26"/>
+          <w:szCs w:val="26"/>
+        </w:rPr>
+        <w:t>ngày</w:t>
+      </w:r>
+      <w:proofErr w:type="spellEnd"/>
+      <w:r>
+        <w:rPr>
+          <w:rFonts w:ascii="Times New Roman" w:eastAsia="Times New Roman" w:hAnsi="Times New Roman" w:cs="Times New Roman"/>
+          <w:color w:val="000000"/>
+          <w:sz w:val="26"/>
+          <w:szCs w:val="26"/>
+        </w:rPr>
+        <w:t xml:space="preserve"> </w:t>
+      </w:r>
+      <w:r>
+        <w:rPr>
+          <w:rFonts w:ascii="Times New Roman" w:hAnsi="Times New Roman" w:cs="Times New Roman"/>
+          <w:sz w:val="26"/>
+          <w:szCs w:val="26"/>
+        </w:rPr>
+        <w:t>{dd}/{mm}/{</w:t>
+      </w:r>
+      <w:proofErr w:type="spellStart"/>
+      <w:r>
+        <w:rPr>
+          <w:rFonts w:ascii="Times New Roman" w:hAnsi="Times New Roman" w:cs="Times New Roman"/>
+          <w:sz w:val="26"/>
+          <w:szCs w:val="26"/>
+        </w:rPr>
+        <w:t>yyyy</w:t>
+      </w:r>
+      <w:proofErr w:type="spellEnd"/>
+      <w:r>
+        <w:rPr>
+          <w:rFonts w:ascii="Times New Roman" w:hAnsi="Times New Roman" w:cs="Times New Roman"/>
+          <w:sz w:val="26"/>
+          <w:szCs w:val="26"/>
+        </w:rPr>
+        <w:t>}</w:t>
+      </w:r>
+    </w:p>
+    <w:p>
+      <w:pPr>
+        <w:pStyle w:val="ListParagraph"/>
+        <w:numPr>
+          <w:ilvl w:val="6"/>
+          <w:numId w:val="4"/>
+        </w:numPr>
+        <w:tabs>
+          <w:tab w:val="left" w:pos="720"/>
+        </w:tabs>
+        <w:spacing w:before="60" w:after="60" w:line="320" w:lineRule="exact"/>
+        <w:ind w:left="0" w:firstLine="450"/>
+        <w:rPr>
+          <w:rFonts w:ascii="Times New Roman" w:eastAsia="Times New Roman" w:hAnsi="Times New Roman" w:cs="Times New Roman"/>
+          <w:b/>
+          <w:bCs/>
+          <w:sz w:val="26"/>
+          <w:szCs w:val="26"/>
+          <w:lang w:val="vi-VN"/>
+        </w:rPr>
+      </w:pPr>
+      <w:proofErr w:type="spellStart"/>
+      <w:r>
+        <w:rPr>
+          <w:rFonts w:ascii="Times New Roman" w:eastAsia="Times New Roman" w:hAnsi="Times New Roman" w:cs="Times New Roman"/>
+          <w:b/>
+          <w:bCs/>
+          <w:sz w:val="26"/>
+          <w:szCs w:val="26"/>
+        </w:rPr>
+        <w:t>Mực</w:t>
+      </w:r>
+      <w:proofErr w:type="spellEnd"/>
+      <w:r>
+        <w:rPr>
+          <w:rFonts w:ascii="Times New Roman" w:eastAsia="Times New Roman" w:hAnsi="Times New Roman" w:cs="Times New Roman"/>
+          <w:b/>
+          <w:bCs/>
+          <w:sz w:val="26"/>
+          <w:szCs w:val="26"/>
+        </w:rPr>
+        <w:t xml:space="preserve"> </w:t>
+      </w:r>
+      <w:proofErr w:type="spellStart"/>
+      <w:r>
+        <w:rPr>
+          <w:rFonts w:ascii="Times New Roman" w:eastAsia="Times New Roman" w:hAnsi="Times New Roman" w:cs="Times New Roman"/>
+          <w:b/>
+          <w:bCs/>
+          <w:sz w:val="26"/>
+          <w:szCs w:val="26"/>
+        </w:rPr>
+        <w:t>nước</w:t>
+      </w:r>
+      <w:proofErr w:type="spellEnd"/>
+      <w:r>
+        <w:rPr>
+          <w:rFonts w:ascii="Times New Roman" w:eastAsia="Times New Roman" w:hAnsi="Times New Roman" w:cs="Times New Roman"/>
+          <w:b/>
+          <w:bCs/>
+          <w:sz w:val="26"/>
+          <w:szCs w:val="26"/>
+        </w:rPr>
+        <w:t xml:space="preserve"> </w:t>
+      </w:r>
+      <w:proofErr w:type="spellStart"/>
+      <w:r>
+        <w:rPr>
+          <w:rFonts w:ascii="Times New Roman" w:eastAsia="Times New Roman" w:hAnsi="Times New Roman" w:cs="Times New Roman"/>
+          <w:b/>
+          <w:bCs/>
+          <w:sz w:val="26"/>
+          <w:szCs w:val="26"/>
+        </w:rPr>
+        <w:t>đo</w:t>
+      </w:r>
+      <w:proofErr w:type="spellEnd"/>
+      <w:r>
+        <w:rPr>
+          <w:rFonts w:ascii="Times New Roman" w:eastAsia="Times New Roman" w:hAnsi="Times New Roman" w:cs="Times New Roman"/>
+          <w:b/>
+          <w:bCs/>
+          <w:sz w:val="26"/>
+          <w:szCs w:val="26"/>
+        </w:rPr>
+        <w:t xml:space="preserve"> </w:t>
+      </w:r>
+      <w:proofErr w:type="spellStart"/>
+      <w:r>
+        <w:rPr>
+          <w:rFonts w:ascii="Times New Roman" w:eastAsia="Times New Roman" w:hAnsi="Times New Roman" w:cs="Times New Roman"/>
+          <w:b/>
+          <w:bCs/>
+          <w:sz w:val="26"/>
+          <w:szCs w:val="26"/>
+        </w:rPr>
+        <w:t>tại</w:t>
+      </w:r>
+      <w:proofErr w:type="spellEnd"/>
+      <w:r>
+        <w:rPr>
+          <w:rFonts w:ascii="Times New Roman" w:eastAsia="Times New Roman" w:hAnsi="Times New Roman" w:cs="Times New Roman"/>
+          <w:b/>
+          <w:bCs/>
+          <w:sz w:val="26"/>
+          <w:szCs w:val="26"/>
+        </w:rPr>
+        <w:t xml:space="preserve"> </w:t>
+      </w:r>
+      <w:proofErr w:type="spellStart"/>
+      <w:r>
+        <w:rPr>
+          <w:rFonts w:ascii="Times New Roman" w:eastAsia="Times New Roman" w:hAnsi="Times New Roman" w:cs="Times New Roman"/>
+          <w:b/>
+          <w:bCs/>
+          <w:sz w:val="26"/>
+          <w:szCs w:val="26"/>
+        </w:rPr>
+        <w:t>các</w:t>
+      </w:r>
+      <w:proofErr w:type="spellEnd"/>
+      <w:r>
+        <w:rPr>
+          <w:rFonts w:ascii="Times New Roman" w:eastAsia="Times New Roman" w:hAnsi="Times New Roman" w:cs="Times New Roman"/>
+          <w:b/>
+          <w:bCs/>
+          <w:sz w:val="26"/>
+          <w:szCs w:val="26"/>
+        </w:rPr>
+        <w:t xml:space="preserve"> Sông</w:t>
+      </w:r>
+      <w:r>
+        <w:rPr>
+          <w:rFonts w:ascii="Times New Roman" w:eastAsia="Times New Roman" w:hAnsi="Times New Roman" w:cs="Times New Roman"/>
+          <w:b/>
+          <w:bCs/>
+          <w:sz w:val="26"/>
+          <w:szCs w:val="26"/>
+        </w:rPr>
+        <w:t>:</w:t>
       </w:r>
     </w:p>
     <w:p>
@@ -9690,7 +9873,6 @@
           <w:color w:val="000000" w:themeColor="text1"/>
           <w:sz w:val="26"/>
           <w:szCs w:val="26"/>
-          <w:lang w:val="vi-VN"/>
         </w:rPr>
       </w:pPr>
       <w:r>
@@ -9742,60 +9924,163 @@
           <w:color w:val="000000" w:themeColor="text1"/>
           <w:sz w:val="26"/>
           <w:szCs w:val="26"/>
+        </w:rPr>
+        <w:t xml:space="preserve">      </w:t>
+      </w:r>
+    </w:p>
+    <w:p>
+      <w:pPr>
+        <w:pStyle w:val="ListParagraph"/>
+        <w:numPr>
+          <w:ilvl w:val="6"/>
+          <w:numId w:val="4"/>
+        </w:numPr>
+        <w:tabs>
+          <w:tab w:val="left" w:pos="720"/>
+          <w:tab w:val="left" w:pos="810"/>
+        </w:tabs>
+        <w:spacing w:before="60" w:after="60" w:line="320" w:lineRule="exact"/>
+        <w:ind w:left="0" w:firstLine="450"/>
+        <w:rPr>
+          <w:rFonts w:ascii="Times New Roman" w:eastAsia="Times New Roman" w:hAnsi="Times New Roman" w:cs="Times New Roman"/>
+          <w:b/>
+          <w:bCs/>
+          <w:sz w:val="26"/>
+          <w:szCs w:val="26"/>
           <w:lang w:val="vi-VN"/>
         </w:rPr>
-        <w:t xml:space="preserve">      </w:t>
-      </w:r>
-      <w:proofErr w:type="spellStart"/>
-      <w:r>
-        <w:rPr>
-          <w:rFonts w:ascii="Times New Roman" w:eastAsia="Times New Roman" w:hAnsi="Times New Roman" w:cs="Times New Roman"/>
-          <w:color w:val="000000" w:themeColor="text1"/>
-          <w:sz w:val="26"/>
-          <w:szCs w:val="26"/>
-        </w:rPr>
-        <w:t>Số</w:t>
-      </w:r>
-      <w:proofErr w:type="spellEnd"/>
-      <w:r>
-        <w:rPr>
-          <w:rFonts w:ascii="Times New Roman" w:eastAsia="Times New Roman" w:hAnsi="Times New Roman" w:cs="Times New Roman"/>
-          <w:color w:val="000000" w:themeColor="text1"/>
-          <w:sz w:val="26"/>
-          <w:szCs w:val="26"/>
-        </w:rPr>
-        <w:t xml:space="preserve"> </w:t>
-      </w:r>
-      <w:proofErr w:type="spellStart"/>
-      <w:r>
-        <w:rPr>
-          <w:rFonts w:ascii="Times New Roman" w:eastAsia="Times New Roman" w:hAnsi="Times New Roman" w:cs="Times New Roman"/>
-          <w:color w:val="000000" w:themeColor="text1"/>
-          <w:sz w:val="26"/>
-          <w:szCs w:val="26"/>
-        </w:rPr>
-        <w:t>liệu</w:t>
-      </w:r>
-      <w:proofErr w:type="spellEnd"/>
-      <w:r>
-        <w:rPr>
-          <w:rFonts w:ascii="Times New Roman" w:eastAsia="Times New Roman" w:hAnsi="Times New Roman" w:cs="Times New Roman"/>
-          <w:color w:val="000000" w:themeColor="text1"/>
-          <w:sz w:val="26"/>
-          <w:szCs w:val="26"/>
-          <w:lang w:val="vi-VN"/>
-        </w:rPr>
-        <w:t xml:space="preserve"> </w:t>
-      </w:r>
-      <w:r>
-        <w:rPr>
-          <w:rFonts w:ascii="Times New Roman" w:eastAsia="Times New Roman" w:hAnsi="Times New Roman" w:cs="Times New Roman"/>
-          <w:color w:val="000000" w:themeColor="text1"/>
-          <w:sz w:val="26"/>
-          <w:szCs w:val="26"/>
-          <w:lang w:val="vi-VN"/>
-        </w:rPr>
-        <w:t>hồ</w:t>
+      </w:pPr>
+      <w:proofErr w:type="spellStart"/>
+      <w:r>
+        <w:rPr>
+          <w:rFonts w:ascii="Times New Roman" w:eastAsia="Times New Roman" w:hAnsi="Times New Roman" w:cs="Times New Roman"/>
+          <w:b/>
+          <w:bCs/>
+          <w:sz w:val="26"/>
+          <w:szCs w:val="26"/>
+        </w:rPr>
+        <w:t>Mực</w:t>
+      </w:r>
+      <w:proofErr w:type="spellEnd"/>
+      <w:r>
+        <w:rPr>
+          <w:rFonts w:ascii="Times New Roman" w:eastAsia="Times New Roman" w:hAnsi="Times New Roman" w:cs="Times New Roman"/>
+          <w:b/>
+          <w:bCs/>
+          <w:sz w:val="26"/>
+          <w:szCs w:val="26"/>
+        </w:rPr>
+        <w:t xml:space="preserve"> </w:t>
+      </w:r>
+      <w:proofErr w:type="spellStart"/>
+      <w:r>
+        <w:rPr>
+          <w:rFonts w:ascii="Times New Roman" w:eastAsia="Times New Roman" w:hAnsi="Times New Roman" w:cs="Times New Roman"/>
+          <w:b/>
+          <w:bCs/>
+          <w:sz w:val="26"/>
+          <w:szCs w:val="26"/>
+        </w:rPr>
+        <w:t>nước</w:t>
+      </w:r>
+      <w:proofErr w:type="spellEnd"/>
+      <w:r>
+        <w:rPr>
+          <w:rFonts w:ascii="Times New Roman" w:eastAsia="Times New Roman" w:hAnsi="Times New Roman" w:cs="Times New Roman"/>
+          <w:b/>
+          <w:bCs/>
+          <w:sz w:val="26"/>
+          <w:szCs w:val="26"/>
+        </w:rPr>
+        <w:t xml:space="preserve"> </w:t>
+      </w:r>
+      <w:proofErr w:type="spellStart"/>
+      <w:r>
+        <w:rPr>
+          <w:rFonts w:ascii="Times New Roman" w:eastAsia="Times New Roman" w:hAnsi="Times New Roman" w:cs="Times New Roman"/>
+          <w:b/>
+          <w:bCs/>
+          <w:sz w:val="26"/>
+          <w:szCs w:val="26"/>
+        </w:rPr>
+        <w:t>đo</w:t>
+      </w:r>
+      <w:proofErr w:type="spellEnd"/>
+      <w:r>
+        <w:rPr>
+          <w:rFonts w:ascii="Times New Roman" w:eastAsia="Times New Roman" w:hAnsi="Times New Roman" w:cs="Times New Roman"/>
+          <w:b/>
+          <w:bCs/>
+          <w:sz w:val="26"/>
+          <w:szCs w:val="26"/>
+        </w:rPr>
+        <w:t xml:space="preserve"> </w:t>
+      </w:r>
+      <w:proofErr w:type="spellStart"/>
+      <w:r>
+        <w:rPr>
+          <w:rFonts w:ascii="Times New Roman" w:eastAsia="Times New Roman" w:hAnsi="Times New Roman" w:cs="Times New Roman"/>
+          <w:b/>
+          <w:bCs/>
+          <w:sz w:val="26"/>
+          <w:szCs w:val="26"/>
+        </w:rPr>
+        <w:t>tại</w:t>
+      </w:r>
+      <w:proofErr w:type="spellEnd"/>
+      <w:r>
+        <w:rPr>
+          <w:rFonts w:ascii="Times New Roman" w:eastAsia="Times New Roman" w:hAnsi="Times New Roman" w:cs="Times New Roman"/>
+          <w:b/>
+          <w:bCs/>
+          <w:sz w:val="26"/>
+          <w:szCs w:val="26"/>
+        </w:rPr>
+        <w:t xml:space="preserve"> </w:t>
+      </w:r>
+      <w:proofErr w:type="spellStart"/>
+      <w:r>
+        <w:rPr>
+          <w:rFonts w:ascii="Times New Roman" w:eastAsia="Times New Roman" w:hAnsi="Times New Roman" w:cs="Times New Roman"/>
+          <w:b/>
+          <w:bCs/>
+          <w:sz w:val="26"/>
+          <w:szCs w:val="26"/>
+        </w:rPr>
+        <w:t>các</w:t>
+      </w:r>
+      <w:proofErr w:type="spellEnd"/>
+      <w:r>
+        <w:rPr>
+          <w:rFonts w:ascii="Times New Roman" w:eastAsia="Times New Roman" w:hAnsi="Times New Roman" w:cs="Times New Roman"/>
+          <w:b/>
+          <w:bCs/>
+          <w:sz w:val="26"/>
+          <w:szCs w:val="26"/>
+        </w:rPr>
+        <w:t xml:space="preserve"> </w:t>
+      </w:r>
+      <w:proofErr w:type="spellStart"/>
+      <w:r>
+        <w:rPr>
+          <w:rFonts w:ascii="Times New Roman" w:eastAsia="Times New Roman" w:hAnsi="Times New Roman" w:cs="Times New Roman"/>
+          <w:b/>
+          <w:bCs/>
+          <w:sz w:val="26"/>
+          <w:szCs w:val="26"/>
+        </w:rPr>
+        <w:t>Hồ</w:t>
+      </w:r>
+      <w:proofErr w:type="spellEnd"/>
+      <w:r>
+        <w:rPr>
+          <w:rFonts w:ascii="Times New Roman" w:eastAsia="Times New Roman" w:hAnsi="Times New Roman" w:cs="Times New Roman"/>
+          <w:b/>
+          <w:bCs/>
+          <w:sz w:val="26"/>
+          <w:szCs w:val="26"/>
+        </w:rPr>
+        <w:t>:</w:t>
       </w:r>
     </w:p>
     <w:p>
@@ -9851,14 +10136,6 @@
         <w:t>}</w:t>
       </w:r>
     </w:p>
-    <w:p>
-      <w:pPr>
-        <w:rPr>
-          <w:lang w:val="vi-VN"/>
-        </w:rPr>
-      </w:pPr>
-    </w:p>
-    <w:p/>
     <w:p/>
     <w:sectPr>
       <w:pgSz w:w="11907" w:h="16840"/>
@@ -9985,6 +10262,97 @@
     </w:lvl>
   </w:abstractNum>
   <w:abstractNum w:abstractNumId="1" w15:restartNumberingAfterBreak="0">
+    <w:nsid w:val="186F0F98"/>
+    <w:multiLevelType w:val="multilevel"/>
+    <w:tmpl w:val="FF7E0E34"/>
+    <w:lvl w:ilvl="0">
+      <w:start w:val="1"/>
+      <w:numFmt w:val="decimal"/>
+      <w:lvlText w:val="%1."/>
+      <w:lvlJc w:val="left"/>
+      <w:pPr>
+        <w:ind w:left="720" w:hanging="360"/>
+      </w:pPr>
+      <w:rPr>
+        <w:rFonts w:ascii="Times New Roman" w:eastAsiaTheme="minorHAnsi" w:hAnsi="Times New Roman" w:cs="Times New Roman"/>
+        <w:b/>
+        <w:bCs/>
+      </w:rPr>
+    </w:lvl>
+    <w:lvl w:ilvl="1">
+      <w:start w:val="1"/>
+      <w:numFmt w:val="lowerLetter"/>
+      <w:lvlText w:val="%2."/>
+      <w:lvlJc w:val="left"/>
+      <w:pPr>
+        <w:ind w:left="1440" w:hanging="360"/>
+      </w:pPr>
+    </w:lvl>
+    <w:lvl w:ilvl="2">
+      <w:start w:val="1"/>
+      <w:numFmt w:val="lowerRoman"/>
+      <w:lvlText w:val="%3."/>
+      <w:lvlJc w:val="right"/>
+      <w:pPr>
+        <w:ind w:left="2160" w:hanging="180"/>
+      </w:pPr>
+    </w:lvl>
+    <w:lvl w:ilvl="3">
+      <w:start w:val="1"/>
+      <w:numFmt w:val="decimal"/>
+      <w:lvlText w:val="%4."/>
+      <w:lvlJc w:val="left"/>
+      <w:pPr>
+        <w:ind w:left="2880" w:hanging="360"/>
+      </w:pPr>
+    </w:lvl>
+    <w:lvl w:ilvl="4">
+      <w:start w:val="1"/>
+      <w:numFmt w:val="lowerLetter"/>
+      <w:lvlText w:val="%5."/>
+      <w:lvlJc w:val="left"/>
+      <w:pPr>
+        <w:ind w:left="3600" w:hanging="360"/>
+      </w:pPr>
+    </w:lvl>
+    <w:lvl w:ilvl="5">
+      <w:start w:val="1"/>
+      <w:numFmt w:val="lowerRoman"/>
+      <w:lvlText w:val="%6."/>
+      <w:lvlJc w:val="right"/>
+      <w:pPr>
+        <w:ind w:left="4320" w:hanging="180"/>
+      </w:pPr>
+    </w:lvl>
+    <w:lvl w:ilvl="6">
+      <w:start w:val="1"/>
+      <w:numFmt w:val="decimal"/>
+      <w:lvlText w:val="%7."/>
+      <w:lvlJc w:val="left"/>
+      <w:pPr>
+        <w:ind w:left="5040" w:hanging="360"/>
+      </w:pPr>
+    </w:lvl>
+    <w:lvl w:ilvl="7">
+      <w:start w:val="1"/>
+      <w:numFmt w:val="lowerLetter"/>
+      <w:lvlText w:val="%8."/>
+      <w:lvlJc w:val="left"/>
+      <w:pPr>
+        <w:ind w:left="5760" w:hanging="360"/>
+      </w:pPr>
+    </w:lvl>
+    <w:lvl w:ilvl="8">
+      <w:start w:val="1"/>
+      <w:numFmt w:val="lowerRoman"/>
+      <w:lvlText w:val="%9."/>
+      <w:lvlJc w:val="right"/>
+      <w:pPr>
+        <w:ind w:left="6480" w:hanging="180"/>
+      </w:pPr>
+    </w:lvl>
+  </w:abstractNum>
+  <w:abstractNum w:abstractNumId="2" w15:restartNumberingAfterBreak="0">
     <w:nsid w:val="3A7B438E"/>
     <w:multiLevelType w:val="hybridMultilevel"/>
     <w:tmpl w:val="80968C76"/>
@@ -10074,7 +10442,7 @@
       </w:pPr>
     </w:lvl>
   </w:abstractNum>
-  <w:abstractNum w:abstractNumId="2" w15:restartNumberingAfterBreak="0">
+  <w:abstractNum w:abstractNumId="3" w15:restartNumberingAfterBreak="0">
     <w:nsid w:val="45482E16"/>
     <w:multiLevelType w:val="hybridMultilevel"/>
     <w:tmpl w:val="049C280E"/>
@@ -10190,9 +10558,12 @@
     <w:abstractNumId w:val="0"/>
   </w:num>
   <w:num w:numId="2" w16cid:durableId="1991325012">
+    <w:abstractNumId w:val="3"/>
+  </w:num>
+  <w:num w:numId="3" w16cid:durableId="1878396814">
     <w:abstractNumId w:val="2"/>
   </w:num>
-  <w:num w:numId="3" w16cid:durableId="1878396814">
+  <w:num w:numId="4" w16cid:durableId="892888417">
     <w:abstractNumId w:val="1"/>
   </w:num>
 </w:numbering>

</xml_diff>

<commit_message>
[ioc] them tai lieu
</commit_message>
<xml_diff>
--- a/ai_tnhn/ai-api-tnhn/doc/Bao cao mua ngay {dd}-{mm}-{yyyy} thoi diem {hh}.docx
+++ b/ai_tnhn/ai-api-tnhn/doc/Bao cao mua ngay {dd}-{mm}-{yyyy} thoi diem {hh}.docx
@@ -1864,6 +1864,7 @@
           <w:rFonts w:ascii="Times New Roman" w:hAnsi="Times New Roman" w:cs="Times New Roman"/>
           <w:color w:val="000000" w:themeColor="text1"/>
           <w:sz w:val="26"/>
+          <w:lang w:val="vi-VN"/>
         </w:rPr>
       </w:pPr>
       <w:r>
@@ -2376,18 +2377,6 @@
         <w:t>theo.</w:t>
       </w:r>
       <w:proofErr w:type="spellEnd"/>
-    </w:p>
-    <w:p>
-      <w:pPr>
-        <w:pStyle w:val="ListParagraph"/>
-        <w:spacing w:before="60" w:after="60" w:line="240" w:lineRule="auto"/>
-        <w:jc w:val="both"/>
-        <w:rPr>
-          <w:rFonts w:ascii="Times New Roman" w:hAnsi="Times New Roman" w:cs="Times New Roman"/>
-          <w:color w:val="000000" w:themeColor="text1"/>
-          <w:sz w:val="26"/>
-        </w:rPr>
-      </w:pPr>
     </w:p>
     <w:p>
       <w:pPr>
@@ -3011,19 +3000,6 @@
         <w:t>theo.</w:t>
       </w:r>
       <w:proofErr w:type="spellEnd"/>
-    </w:p>
-    <w:p>
-      <w:pPr>
-        <w:spacing w:before="20" w:after="20" w:line="320" w:lineRule="exact"/>
-        <w:ind w:firstLine="284"/>
-        <w:jc w:val="both"/>
-        <w:rPr>
-          <w:rFonts w:ascii="Times New Roman" w:hAnsi="Times New Roman"/>
-          <w:sz w:val="26"/>
-          <w:szCs w:val="26"/>
-          <w:lang w:val="vi-VN"/>
-        </w:rPr>
-      </w:pPr>
     </w:p>
     <w:p>
       <w:pPr>
@@ -4653,22 +4629,6 @@
     </w:p>
     <w:p>
       <w:pPr>
-        <w:spacing w:before="60" w:after="60" w:line="240" w:lineRule="auto"/>
-        <w:ind w:firstLine="284"/>
-        <w:jc w:val="both"/>
-        <w:rPr>
-          <w:rFonts w:ascii="Times New Roman" w:hAnsi="Times New Roman" w:cs="Times New Roman"/>
-          <w:color w:val="EE0000"/>
-          <w:spacing w:val="3"/>
-          <w:sz w:val="26"/>
-          <w:szCs w:val="26"/>
-          <w:shd w:val="clear" w:color="auto" w:fill="FFFFFF"/>
-          <w:lang w:val="vi-VN"/>
-        </w:rPr>
-      </w:pPr>
-    </w:p>
-    <w:p>
-      <w:pPr>
         <w:pStyle w:val="ListParagraph"/>
         <w:numPr>
           <w:ilvl w:val="0"/>
@@ -6097,6 +6057,7 @@
           <w:color w:val="000000" w:themeColor="text1"/>
           <w:sz w:val="26"/>
           <w:szCs w:val="26"/>
+          <w:lang w:val="vi-VN"/>
         </w:rPr>
       </w:pPr>
       <w:r>
@@ -7070,70 +7031,21 @@
         <w:jc w:val="both"/>
         <w:rPr>
           <w:rFonts w:ascii="Times New Roman" w:hAnsi="Times New Roman" w:cs="Times New Roman"/>
-          <w:color w:val="000000" w:themeColor="text1"/>
-          <w:spacing w:val="3"/>
-          <w:sz w:val="26"/>
-          <w:szCs w:val="26"/>
-          <w:shd w:val="clear" w:color="auto" w:fill="FFFFFF"/>
-          <w:lang w:val="vi-VN"/>
+          <w:i/>
+          <w:color w:val="000000" w:themeColor="text1"/>
+          <w:sz w:val="26"/>
+          <w:szCs w:val="26"/>
         </w:rPr>
       </w:pPr>
-    </w:p>
-    <w:p>
-      <w:pPr>
-        <w:spacing w:before="144" w:after="144" w:line="240" w:lineRule="auto"/>
-        <w:ind w:firstLine="426"/>
-        <w:jc w:val="both"/>
-        <w:rPr>
-          <w:rFonts w:ascii="Times New Roman" w:hAnsi="Times New Roman" w:cs="Times New Roman"/>
-          <w:color w:val="000000" w:themeColor="text1"/>
-          <w:spacing w:val="3"/>
-          <w:sz w:val="26"/>
-          <w:szCs w:val="26"/>
-          <w:shd w:val="clear" w:color="auto" w:fill="FFFFFF"/>
-          <w:lang w:val="vi-VN"/>
-        </w:rPr>
-      </w:pPr>
-    </w:p>
-    <w:p>
-      <w:pPr>
-        <w:spacing w:before="144" w:after="144" w:line="240" w:lineRule="auto"/>
-        <w:ind w:firstLine="426"/>
-        <w:jc w:val="both"/>
-        <w:rPr>
-          <w:rFonts w:ascii="Times New Roman" w:hAnsi="Times New Roman" w:cs="Times New Roman"/>
-          <w:color w:val="000000" w:themeColor="text1"/>
-          <w:spacing w:val="3"/>
-          <w:sz w:val="26"/>
-          <w:szCs w:val="26"/>
-          <w:shd w:val="clear" w:color="auto" w:fill="FFFFFF"/>
-          <w:lang w:val="vi-VN"/>
-        </w:rPr>
-      </w:pPr>
-    </w:p>
-    <w:p>
-      <w:pPr>
-        <w:spacing w:before="144" w:after="144" w:line="240" w:lineRule="auto"/>
-        <w:ind w:firstLine="426"/>
-        <w:jc w:val="both"/>
-        <w:rPr>
-          <w:rFonts w:ascii="Times New Roman" w:hAnsi="Times New Roman" w:cs="Times New Roman"/>
-          <w:i/>
-          <w:color w:val="000000" w:themeColor="text1"/>
-          <w:sz w:val="26"/>
-          <w:szCs w:val="26"/>
-        </w:rPr>
-      </w:pPr>
-      <w:r>
-        <w:rPr>
-          <w:rFonts w:ascii="Times New Roman" w:hAnsi="Times New Roman" w:cs="Times New Roman"/>
-          <w:color w:val="000000" w:themeColor="text1"/>
-          <w:spacing w:val="3"/>
-          <w:sz w:val="26"/>
-          <w:szCs w:val="26"/>
-          <w:shd w:val="clear" w:color="auto" w:fill="FFFFFF"/>
-        </w:rPr>
-        <w:lastRenderedPageBreak/>
+      <w:r>
+        <w:rPr>
+          <w:rFonts w:ascii="Times New Roman" w:hAnsi="Times New Roman" w:cs="Times New Roman"/>
+          <w:color w:val="000000" w:themeColor="text1"/>
+          <w:spacing w:val="3"/>
+          <w:sz w:val="26"/>
+          <w:szCs w:val="26"/>
+          <w:shd w:val="clear" w:color="auto" w:fill="FFFFFF"/>
+        </w:rPr>
         <w:t xml:space="preserve">Công ty </w:t>
       </w:r>
       <w:proofErr w:type="spellStart"/>
@@ -8019,6 +7931,7 @@
                 <w:rFonts w:ascii="Times New Roman" w:hAnsi="Times New Roman" w:cs="Times New Roman"/>
                 <w:noProof/>
               </w:rPr>
+              <w:lastRenderedPageBreak/>
               <mc:AlternateContent>
                 <mc:Choice Requires="wps">
                   <w:drawing>
@@ -8782,42 +8695,30 @@
     </w:tbl>
     <w:p>
       <w:pPr>
-        <w:rPr>
-          <w:lang w:val="vi-VN"/>
+        <w:jc w:val="center"/>
+        <w:rPr>
+          <w:rFonts w:ascii="Times New Roman" w:hAnsi="Times New Roman" w:cs="Times New Roman"/>
+          <w:b/>
+          <w:bCs/>
         </w:rPr>
       </w:pPr>
     </w:p>
-    <w:p/>
-    <w:p/>
-    <w:p/>
-    <w:p/>
-    <w:p/>
-    <w:p/>
-    <w:p/>
-    <w:p/>
-    <w:p/>
-    <w:p/>
-    <w:p/>
-    <w:p/>
-    <w:p/>
-    <w:p/>
-    <w:p/>
-    <w:p/>
-    <w:p/>
-    <w:p/>
-    <w:p/>
-    <w:p/>
-    <w:p/>
-    <w:p/>
     <w:p>
       <w:pPr>
         <w:rPr>
           <w:rFonts w:ascii="Times New Roman" w:hAnsi="Times New Roman" w:cs="Times New Roman"/>
           <w:b/>
           <w:bCs/>
-          <w:lang w:val="vi-VN"/>
         </w:rPr>
       </w:pPr>
+      <w:r>
+        <w:rPr>
+          <w:rFonts w:ascii="Times New Roman" w:hAnsi="Times New Roman" w:cs="Times New Roman"/>
+          <w:b/>
+          <w:bCs/>
+        </w:rPr>
+        <w:br w:type="page"/>
+      </w:r>
     </w:p>
     <w:p>
       <w:pPr>
@@ -10058,20 +9959,8 @@
           <w:sz w:val="26"/>
           <w:szCs w:val="26"/>
         </w:rPr>
-        <w:t xml:space="preserve"> </w:t>
-      </w:r>
-      <w:proofErr w:type="spellStart"/>
-      <w:r>
-        <w:rPr>
-          <w:rFonts w:ascii="Times New Roman" w:eastAsia="Times New Roman" w:hAnsi="Times New Roman" w:cs="Times New Roman"/>
-          <w:b/>
-          <w:bCs/>
-          <w:sz w:val="26"/>
-          <w:szCs w:val="26"/>
-        </w:rPr>
-        <w:t>Hồ</w:t>
-      </w:r>
-      <w:proofErr w:type="spellEnd"/>
+        <w:t xml:space="preserve"> Hồ</w:t>
+      </w:r>
       <w:r>
         <w:rPr>
           <w:rFonts w:ascii="Times New Roman" w:eastAsia="Times New Roman" w:hAnsi="Times New Roman" w:cs="Times New Roman"/>

</xml_diff>